<commit_message>
Se incluye proceso foto
</commit_message>
<xml_diff>
--- a/Epsilon/wwwroot/documentos/RoadMap.docx
+++ b/Epsilon/wwwroot/documentos/RoadMap.docx
@@ -27,8 +27,81 @@
       <w:r>
         <w:t>- Falta método de llamada para traer datos</w:t>
       </w:r>
+    </w:p>
+    <w:p/>
+    <w:p>
       <w:bookmarkStart w:id="0" w:name="_GoBack"/>
       <w:bookmarkEnd w:id="0"/>
+    </w:p>
+    <w:p/>
+    <w:p>
+      <w:pPr>
+        <w:rPr>
+          <w:b/>
+        </w:rPr>
+      </w:pPr>
+      <w:r>
+        <w:rPr>
+          <w:b/>
+        </w:rPr>
+        <w:t>MODIFICAR USUARIO</w:t>
+      </w:r>
+    </w:p>
+    <w:p>
+      <w:pPr>
+        <w:pStyle w:val="Prrafodelista"/>
+        <w:numPr>
+          <w:ilvl w:val="0"/>
+          <w:numId w:val="1"/>
+        </w:numPr>
+      </w:pPr>
+      <w:r>
+        <w:t>Al modificar la fecha</w:t>
+      </w:r>
+      <w:r>
+        <w:t xml:space="preserve"> alta</w:t>
+      </w:r>
+      <w:r>
+        <w:t xml:space="preserve"> revienta el proceso</w:t>
+      </w:r>
+    </w:p>
+    <w:p>
+      <w:pPr>
+        <w:pStyle w:val="Prrafodelista"/>
+        <w:numPr>
+          <w:ilvl w:val="0"/>
+          <w:numId w:val="1"/>
+        </w:numPr>
+      </w:pPr>
+      <w:r>
+        <w:t>Al modificar el</w:t>
+      </w:r>
+      <w:r>
+        <w:t xml:space="preserve"> usuario no sale mensaje bonito, </w:t>
+      </w:r>
+      <w:r>
+        <w:t xml:space="preserve">sale </w:t>
+      </w:r>
+      <w:proofErr w:type="spellStart"/>
+      <w:r>
+        <w:t>alert</w:t>
+      </w:r>
+      <w:proofErr w:type="spellEnd"/>
+      <w:r>
+        <w:t xml:space="preserve"> asqueroso</w:t>
+      </w:r>
+    </w:p>
+    <w:p>
+      <w:pPr>
+        <w:pStyle w:val="Prrafodelista"/>
+        <w:numPr>
+          <w:ilvl w:val="0"/>
+          <w:numId w:val="1"/>
+        </w:numPr>
+      </w:pPr>
+      <w:r>
+        <w:t>Al modificar la foto no se refresca en la tabla hay que recargar la pagina</w:t>
+      </w:r>
     </w:p>
     <w:p/>
     <w:sectPr>
@@ -39,6 +112,127 @@
     </w:sectPr>
   </w:body>
 </w:document>
+</file>
+
+<file path=word/numbering.xml><?xml version="1.0" encoding="utf-8"?>
+<w:numbering xmlns:wpc="http://schemas.microsoft.com/office/word/2010/wordprocessingCanvas" xmlns:cx="http://schemas.microsoft.com/office/drawing/2014/chartex" xmlns:cx1="http://schemas.microsoft.com/office/drawing/2015/9/8/chartex" xmlns:mc="http://schemas.openxmlformats.org/markup-compatibility/2006" xmlns:o="urn:schemas-microsoft-com:office:office" xmlns:r="http://schemas.openxmlformats.org/officeDocument/2006/relationships" xmlns:m="http://schemas.openxmlformats.org/officeDocument/2006/math" xmlns:v="urn:schemas-microsoft-com:vml" xmlns:wp14="http://schemas.microsoft.com/office/word/2010/wordprocessingDrawing" xmlns:wp="http://schemas.openxmlformats.org/drawingml/2006/wordprocessingDrawing" xmlns:w10="urn:schemas-microsoft-com:office:word" xmlns:w="http://schemas.openxmlformats.org/wordprocessingml/2006/main" xmlns:w14="http://schemas.microsoft.com/office/word/2010/wordml" xmlns:w15="http://schemas.microsoft.com/office/word/2012/wordml" xmlns:w16se="http://schemas.microsoft.com/office/word/2015/wordml/symex" xmlns:wpg="http://schemas.microsoft.com/office/word/2010/wordprocessingGroup" xmlns:wpi="http://schemas.microsoft.com/office/word/2010/wordprocessingInk" xmlns:wne="http://schemas.microsoft.com/office/word/2006/wordml" xmlns:wps="http://schemas.microsoft.com/office/word/2010/wordprocessingShape" mc:Ignorable="w14 w15 w16se wp14">
+  <w:abstractNum w:abstractNumId="0" w15:restartNumberingAfterBreak="0">
+    <w:nsid w:val="13F24EAB"/>
+    <w:multiLevelType w:val="hybridMultilevel"/>
+    <w:tmpl w:val="82A207D4"/>
+    <w:lvl w:ilvl="0" w:tplc="0C0A0001">
+      <w:start w:val="1"/>
+      <w:numFmt w:val="bullet"/>
+      <w:lvlText w:val=""/>
+      <w:lvlJc w:val="left"/>
+      <w:pPr>
+        <w:ind w:left="720" w:hanging="360"/>
+      </w:pPr>
+      <w:rPr>
+        <w:rFonts w:ascii="Symbol" w:hAnsi="Symbol" w:hint="default"/>
+      </w:rPr>
+    </w:lvl>
+    <w:lvl w:ilvl="1" w:tplc="0C0A0003" w:tentative="1">
+      <w:start w:val="1"/>
+      <w:numFmt w:val="bullet"/>
+      <w:lvlText w:val="o"/>
+      <w:lvlJc w:val="left"/>
+      <w:pPr>
+        <w:ind w:left="1440" w:hanging="360"/>
+      </w:pPr>
+      <w:rPr>
+        <w:rFonts w:ascii="Courier New" w:hAnsi="Courier New" w:cs="Courier New" w:hint="default"/>
+      </w:rPr>
+    </w:lvl>
+    <w:lvl w:ilvl="2" w:tplc="0C0A0005" w:tentative="1">
+      <w:start w:val="1"/>
+      <w:numFmt w:val="bullet"/>
+      <w:lvlText w:val=""/>
+      <w:lvlJc w:val="left"/>
+      <w:pPr>
+        <w:ind w:left="2160" w:hanging="360"/>
+      </w:pPr>
+      <w:rPr>
+        <w:rFonts w:ascii="Wingdings" w:hAnsi="Wingdings" w:hint="default"/>
+      </w:rPr>
+    </w:lvl>
+    <w:lvl w:ilvl="3" w:tplc="0C0A0001" w:tentative="1">
+      <w:start w:val="1"/>
+      <w:numFmt w:val="bullet"/>
+      <w:lvlText w:val=""/>
+      <w:lvlJc w:val="left"/>
+      <w:pPr>
+        <w:ind w:left="2880" w:hanging="360"/>
+      </w:pPr>
+      <w:rPr>
+        <w:rFonts w:ascii="Symbol" w:hAnsi="Symbol" w:hint="default"/>
+      </w:rPr>
+    </w:lvl>
+    <w:lvl w:ilvl="4" w:tplc="0C0A0003" w:tentative="1">
+      <w:start w:val="1"/>
+      <w:numFmt w:val="bullet"/>
+      <w:lvlText w:val="o"/>
+      <w:lvlJc w:val="left"/>
+      <w:pPr>
+        <w:ind w:left="3600" w:hanging="360"/>
+      </w:pPr>
+      <w:rPr>
+        <w:rFonts w:ascii="Courier New" w:hAnsi="Courier New" w:cs="Courier New" w:hint="default"/>
+      </w:rPr>
+    </w:lvl>
+    <w:lvl w:ilvl="5" w:tplc="0C0A0005" w:tentative="1">
+      <w:start w:val="1"/>
+      <w:numFmt w:val="bullet"/>
+      <w:lvlText w:val=""/>
+      <w:lvlJc w:val="left"/>
+      <w:pPr>
+        <w:ind w:left="4320" w:hanging="360"/>
+      </w:pPr>
+      <w:rPr>
+        <w:rFonts w:ascii="Wingdings" w:hAnsi="Wingdings" w:hint="default"/>
+      </w:rPr>
+    </w:lvl>
+    <w:lvl w:ilvl="6" w:tplc="0C0A0001" w:tentative="1">
+      <w:start w:val="1"/>
+      <w:numFmt w:val="bullet"/>
+      <w:lvlText w:val=""/>
+      <w:lvlJc w:val="left"/>
+      <w:pPr>
+        <w:ind w:left="5040" w:hanging="360"/>
+      </w:pPr>
+      <w:rPr>
+        <w:rFonts w:ascii="Symbol" w:hAnsi="Symbol" w:hint="default"/>
+      </w:rPr>
+    </w:lvl>
+    <w:lvl w:ilvl="7" w:tplc="0C0A0003" w:tentative="1">
+      <w:start w:val="1"/>
+      <w:numFmt w:val="bullet"/>
+      <w:lvlText w:val="o"/>
+      <w:lvlJc w:val="left"/>
+      <w:pPr>
+        <w:ind w:left="5760" w:hanging="360"/>
+      </w:pPr>
+      <w:rPr>
+        <w:rFonts w:ascii="Courier New" w:hAnsi="Courier New" w:cs="Courier New" w:hint="default"/>
+      </w:rPr>
+    </w:lvl>
+    <w:lvl w:ilvl="8" w:tplc="0C0A0005" w:tentative="1">
+      <w:start w:val="1"/>
+      <w:numFmt w:val="bullet"/>
+      <w:lvlText w:val=""/>
+      <w:lvlJc w:val="left"/>
+      <w:pPr>
+        <w:ind w:left="6480" w:hanging="360"/>
+      </w:pPr>
+      <w:rPr>
+        <w:rFonts w:ascii="Wingdings" w:hAnsi="Wingdings" w:hint="default"/>
+      </w:rPr>
+    </w:lvl>
+  </w:abstractNum>
+  <w:num w:numId="1">
+    <w:abstractNumId w:val="0"/>
+  </w:num>
+</w:numbering>
 </file>
 
 <file path=word/styles.xml><?xml version="1.0" encoding="utf-8"?>
@@ -462,6 +656,17 @@
     <w:semiHidden/>
     <w:unhideWhenUsed/>
   </w:style>
+  <w:style w:type="paragraph" w:styleId="Prrafodelista">
+    <w:name w:val="List Paragraph"/>
+    <w:basedOn w:val="Normal"/>
+    <w:uiPriority w:val="34"/>
+    <w:qFormat/>
+    <w:rsid w:val="00886DE3"/>
+    <w:pPr>
+      <w:ind w:left="720"/>
+      <w:contextualSpacing/>
+    </w:pPr>
+  </w:style>
 </w:styles>
 </file>
 

</xml_diff>

<commit_message>
Se incluyen test unitarios y procedimientos almacenados
</commit_message>
<xml_diff>
--- a/Epsilon/wwwroot/documentos/RoadMap.docx
+++ b/Epsilon/wwwroot/documentos/RoadMap.docx
@@ -29,10 +29,7 @@
       </w:r>
     </w:p>
     <w:p/>
-    <w:p>
-      <w:bookmarkStart w:id="0" w:name="_GoBack"/>
-      <w:bookmarkEnd w:id="0"/>
-    </w:p>
+    <w:p/>
     <w:p/>
     <w:p>
       <w:pPr>
@@ -103,7 +100,748 @@
         <w:t>Al modificar la foto no se refresca en la tabla hay que recargar la pagina</w:t>
       </w:r>
     </w:p>
-    <w:p/>
+    <w:p>
+      <w:pPr>
+        <w:numPr>
+          <w:ilvl w:val="0"/>
+          <w:numId w:val="2"/>
+        </w:numPr>
+        <w:spacing w:before="100" w:beforeAutospacing="1" w:after="100" w:afterAutospacing="1" w:line="240" w:lineRule="auto"/>
+        <w:rPr>
+          <w:rFonts w:ascii="Times New Roman" w:eastAsia="Times New Roman" w:hAnsi="Times New Roman" w:cs="Times New Roman"/>
+          <w:sz w:val="24"/>
+          <w:szCs w:val="24"/>
+          <w:lang w:eastAsia="es-ES"/>
+        </w:rPr>
+      </w:pPr>
+      <w:r>
+        <w:rPr>
+          <w:rFonts w:ascii="Times New Roman" w:eastAsia="Times New Roman" w:hAnsi="Times New Roman" w:cs="Times New Roman"/>
+          <w:b/>
+          <w:bCs/>
+          <w:sz w:val="24"/>
+          <w:szCs w:val="24"/>
+          <w:lang w:eastAsia="es-ES"/>
+        </w:rPr>
+        <w:t>Tabla Agenda</w:t>
+      </w:r>
+      <w:r>
+        <w:rPr>
+          <w:rFonts w:ascii="Times New Roman" w:eastAsia="Times New Roman" w:hAnsi="Times New Roman" w:cs="Times New Roman"/>
+          <w:sz w:val="24"/>
+          <w:szCs w:val="24"/>
+          <w:lang w:eastAsia="es-ES"/>
+        </w:rPr>
+        <w:t xml:space="preserve"> </w:t>
+      </w:r>
+    </w:p>
+    <w:p>
+      <w:pPr>
+        <w:numPr>
+          <w:ilvl w:val="1"/>
+          <w:numId w:val="2"/>
+        </w:numPr>
+        <w:spacing w:before="100" w:beforeAutospacing="1" w:after="100" w:afterAutospacing="1" w:line="240" w:lineRule="auto"/>
+        <w:rPr>
+          <w:rFonts w:ascii="Times New Roman" w:eastAsia="Times New Roman" w:hAnsi="Times New Roman" w:cs="Times New Roman"/>
+          <w:sz w:val="24"/>
+          <w:szCs w:val="24"/>
+          <w:lang w:eastAsia="es-ES"/>
+        </w:rPr>
+      </w:pPr>
+      <w:proofErr w:type="spellStart"/>
+      <w:r>
+        <w:rPr>
+          <w:rFonts w:ascii="Courier New" w:eastAsia="Times New Roman" w:hAnsi="Courier New" w:cs="Courier New"/>
+          <w:sz w:val="20"/>
+          <w:szCs w:val="20"/>
+          <w:lang w:eastAsia="es-ES"/>
+        </w:rPr>
+        <w:t>IdAgenda</w:t>
+      </w:r>
+      <w:proofErr w:type="spellEnd"/>
+      <w:r>
+        <w:rPr>
+          <w:rFonts w:ascii="Times New Roman" w:eastAsia="Times New Roman" w:hAnsi="Times New Roman" w:cs="Times New Roman"/>
+          <w:sz w:val="24"/>
+          <w:szCs w:val="24"/>
+          <w:lang w:eastAsia="es-ES"/>
+        </w:rPr>
+        <w:t xml:space="preserve"> (PK) </w:t>
+      </w:r>
+    </w:p>
+    <w:p>
+      <w:pPr>
+        <w:numPr>
+          <w:ilvl w:val="1"/>
+          <w:numId w:val="2"/>
+        </w:numPr>
+        <w:spacing w:before="100" w:beforeAutospacing="1" w:after="100" w:afterAutospacing="1" w:line="240" w:lineRule="auto"/>
+        <w:rPr>
+          <w:rFonts w:ascii="Times New Roman" w:eastAsia="Times New Roman" w:hAnsi="Times New Roman" w:cs="Times New Roman"/>
+          <w:sz w:val="24"/>
+          <w:szCs w:val="24"/>
+          <w:lang w:eastAsia="es-ES"/>
+        </w:rPr>
+      </w:pPr>
+      <w:proofErr w:type="spellStart"/>
+      <w:r>
+        <w:rPr>
+          <w:rFonts w:ascii="Courier New" w:eastAsia="Times New Roman" w:hAnsi="Courier New" w:cs="Courier New"/>
+          <w:sz w:val="20"/>
+          <w:szCs w:val="20"/>
+          <w:lang w:eastAsia="es-ES"/>
+        </w:rPr>
+        <w:t>IdMedico</w:t>
+      </w:r>
+      <w:proofErr w:type="spellEnd"/>
+      <w:r>
+        <w:rPr>
+          <w:rFonts w:ascii="Times New Roman" w:eastAsia="Times New Roman" w:hAnsi="Times New Roman" w:cs="Times New Roman"/>
+          <w:sz w:val="24"/>
+          <w:szCs w:val="24"/>
+          <w:lang w:eastAsia="es-ES"/>
+        </w:rPr>
+        <w:t xml:space="preserve"> (FK) </w:t>
+      </w:r>
+    </w:p>
+    <w:p>
+      <w:pPr>
+        <w:numPr>
+          <w:ilvl w:val="1"/>
+          <w:numId w:val="2"/>
+        </w:numPr>
+        <w:spacing w:before="100" w:beforeAutospacing="1" w:after="100" w:afterAutospacing="1" w:line="240" w:lineRule="auto"/>
+        <w:rPr>
+          <w:rFonts w:ascii="Times New Roman" w:eastAsia="Times New Roman" w:hAnsi="Times New Roman" w:cs="Times New Roman"/>
+          <w:sz w:val="24"/>
+          <w:szCs w:val="24"/>
+          <w:lang w:eastAsia="es-ES"/>
+        </w:rPr>
+      </w:pPr>
+      <w:proofErr w:type="spellStart"/>
+      <w:r>
+        <w:rPr>
+          <w:rFonts w:ascii="Courier New" w:eastAsia="Times New Roman" w:hAnsi="Courier New" w:cs="Courier New"/>
+          <w:sz w:val="20"/>
+          <w:szCs w:val="20"/>
+          <w:lang w:eastAsia="es-ES"/>
+        </w:rPr>
+        <w:t>FechaHoraInicio</w:t>
+      </w:r>
+      <w:proofErr w:type="spellEnd"/>
+      <w:r>
+        <w:rPr>
+          <w:rFonts w:ascii="Times New Roman" w:eastAsia="Times New Roman" w:hAnsi="Times New Roman" w:cs="Times New Roman"/>
+          <w:sz w:val="24"/>
+          <w:szCs w:val="24"/>
+          <w:lang w:eastAsia="es-ES"/>
+        </w:rPr>
+        <w:t xml:space="preserve"> </w:t>
+      </w:r>
+    </w:p>
+    <w:p>
+      <w:pPr>
+        <w:numPr>
+          <w:ilvl w:val="1"/>
+          <w:numId w:val="2"/>
+        </w:numPr>
+        <w:spacing w:before="100" w:beforeAutospacing="1" w:after="100" w:afterAutospacing="1" w:line="240" w:lineRule="auto"/>
+        <w:rPr>
+          <w:rFonts w:ascii="Times New Roman" w:eastAsia="Times New Roman" w:hAnsi="Times New Roman" w:cs="Times New Roman"/>
+          <w:sz w:val="24"/>
+          <w:szCs w:val="24"/>
+          <w:lang w:eastAsia="es-ES"/>
+        </w:rPr>
+      </w:pPr>
+      <w:proofErr w:type="spellStart"/>
+      <w:r>
+        <w:rPr>
+          <w:rFonts w:ascii="Courier New" w:eastAsia="Times New Roman" w:hAnsi="Courier New" w:cs="Courier New"/>
+          <w:sz w:val="20"/>
+          <w:szCs w:val="20"/>
+          <w:lang w:eastAsia="es-ES"/>
+        </w:rPr>
+        <w:t>FechaHoraFin</w:t>
+      </w:r>
+      <w:proofErr w:type="spellEnd"/>
+      <w:r>
+        <w:rPr>
+          <w:rFonts w:ascii="Times New Roman" w:eastAsia="Times New Roman" w:hAnsi="Times New Roman" w:cs="Times New Roman"/>
+          <w:sz w:val="24"/>
+          <w:szCs w:val="24"/>
+          <w:lang w:eastAsia="es-ES"/>
+        </w:rPr>
+        <w:t xml:space="preserve"> </w:t>
+      </w:r>
+    </w:p>
+    <w:p>
+      <w:pPr>
+        <w:numPr>
+          <w:ilvl w:val="1"/>
+          <w:numId w:val="2"/>
+        </w:numPr>
+        <w:spacing w:before="100" w:beforeAutospacing="1" w:after="100" w:afterAutospacing="1" w:line="240" w:lineRule="auto"/>
+        <w:rPr>
+          <w:rFonts w:ascii="Times New Roman" w:eastAsia="Times New Roman" w:hAnsi="Times New Roman" w:cs="Times New Roman"/>
+          <w:sz w:val="24"/>
+          <w:szCs w:val="24"/>
+          <w:lang w:eastAsia="es-ES"/>
+        </w:rPr>
+      </w:pPr>
+      <w:r>
+        <w:rPr>
+          <w:rFonts w:ascii="Courier New" w:eastAsia="Times New Roman" w:hAnsi="Courier New" w:cs="Courier New"/>
+          <w:sz w:val="20"/>
+          <w:szCs w:val="20"/>
+          <w:lang w:eastAsia="es-ES"/>
+        </w:rPr>
+        <w:t>Disponible</w:t>
+      </w:r>
+      <w:r>
+        <w:rPr>
+          <w:rFonts w:ascii="Times New Roman" w:eastAsia="Times New Roman" w:hAnsi="Times New Roman" w:cs="Times New Roman"/>
+          <w:sz w:val="24"/>
+          <w:szCs w:val="24"/>
+          <w:lang w:eastAsia="es-ES"/>
+        </w:rPr>
+        <w:t xml:space="preserve"> (</w:t>
+      </w:r>
+      <w:proofErr w:type="spellStart"/>
+      <w:r>
+        <w:rPr>
+          <w:rFonts w:ascii="Times New Roman" w:eastAsia="Times New Roman" w:hAnsi="Times New Roman" w:cs="Times New Roman"/>
+          <w:sz w:val="24"/>
+          <w:szCs w:val="24"/>
+          <w:lang w:eastAsia="es-ES"/>
+        </w:rPr>
+        <w:t>boolean</w:t>
+      </w:r>
+      <w:proofErr w:type="spellEnd"/>
+      <w:r>
+        <w:rPr>
+          <w:rFonts w:ascii="Times New Roman" w:eastAsia="Times New Roman" w:hAnsi="Times New Roman" w:cs="Times New Roman"/>
+          <w:sz w:val="24"/>
+          <w:szCs w:val="24"/>
+          <w:lang w:eastAsia="es-ES"/>
+        </w:rPr>
+        <w:t xml:space="preserve">) → si el bloque está libre o reservado </w:t>
+      </w:r>
+    </w:p>
+    <w:p>
+      <w:pPr>
+        <w:numPr>
+          <w:ilvl w:val="1"/>
+          <w:numId w:val="2"/>
+        </w:numPr>
+        <w:spacing w:before="100" w:beforeAutospacing="1" w:after="100" w:afterAutospacing="1" w:line="240" w:lineRule="auto"/>
+        <w:rPr>
+          <w:rFonts w:ascii="Times New Roman" w:eastAsia="Times New Roman" w:hAnsi="Times New Roman" w:cs="Times New Roman"/>
+          <w:sz w:val="24"/>
+          <w:szCs w:val="24"/>
+          <w:lang w:eastAsia="es-ES"/>
+        </w:rPr>
+      </w:pPr>
+      <w:proofErr w:type="spellStart"/>
+      <w:r>
+        <w:rPr>
+          <w:rFonts w:ascii="Courier New" w:eastAsia="Times New Roman" w:hAnsi="Courier New" w:cs="Courier New"/>
+          <w:sz w:val="20"/>
+          <w:szCs w:val="20"/>
+          <w:lang w:eastAsia="es-ES"/>
+        </w:rPr>
+        <w:t>IdCita</w:t>
+      </w:r>
+      <w:proofErr w:type="spellEnd"/>
+      <w:r>
+        <w:rPr>
+          <w:rFonts w:ascii="Times New Roman" w:eastAsia="Times New Roman" w:hAnsi="Times New Roman" w:cs="Times New Roman"/>
+          <w:sz w:val="24"/>
+          <w:szCs w:val="24"/>
+          <w:lang w:eastAsia="es-ES"/>
+        </w:rPr>
+        <w:t xml:space="preserve"> (FK </w:t>
+      </w:r>
+      <w:proofErr w:type="spellStart"/>
+      <w:r>
+        <w:rPr>
+          <w:rFonts w:ascii="Times New Roman" w:eastAsia="Times New Roman" w:hAnsi="Times New Roman" w:cs="Times New Roman"/>
+          <w:sz w:val="24"/>
+          <w:szCs w:val="24"/>
+          <w:lang w:eastAsia="es-ES"/>
+        </w:rPr>
+        <w:t>nullable</w:t>
+      </w:r>
+      <w:proofErr w:type="spellEnd"/>
+      <w:r>
+        <w:rPr>
+          <w:rFonts w:ascii="Times New Roman" w:eastAsia="Times New Roman" w:hAnsi="Times New Roman" w:cs="Times New Roman"/>
+          <w:sz w:val="24"/>
+          <w:szCs w:val="24"/>
+          <w:lang w:eastAsia="es-ES"/>
+        </w:rPr>
+        <w:t xml:space="preserve">) → si ya hay una cita asignada </w:t>
+      </w:r>
+    </w:p>
+    <w:p>
+      <w:pPr>
+        <w:numPr>
+          <w:ilvl w:val="0"/>
+          <w:numId w:val="2"/>
+        </w:numPr>
+        <w:spacing w:before="100" w:beforeAutospacing="1" w:after="100" w:afterAutospacing="1" w:line="240" w:lineRule="auto"/>
+        <w:rPr>
+          <w:rFonts w:ascii="Times New Roman" w:eastAsia="Times New Roman" w:hAnsi="Times New Roman" w:cs="Times New Roman"/>
+          <w:sz w:val="24"/>
+          <w:szCs w:val="24"/>
+          <w:lang w:eastAsia="es-ES"/>
+        </w:rPr>
+      </w:pPr>
+      <w:r>
+        <w:rPr>
+          <w:rFonts w:ascii="Times New Roman" w:eastAsia="Times New Roman" w:hAnsi="Times New Roman" w:cs="Times New Roman"/>
+          <w:b/>
+          <w:bCs/>
+          <w:sz w:val="24"/>
+          <w:szCs w:val="24"/>
+          <w:lang w:eastAsia="es-ES"/>
+        </w:rPr>
+        <w:t>Tabla Citas</w:t>
+      </w:r>
+      <w:r>
+        <w:rPr>
+          <w:rFonts w:ascii="Times New Roman" w:eastAsia="Times New Roman" w:hAnsi="Times New Roman" w:cs="Times New Roman"/>
+          <w:sz w:val="24"/>
+          <w:szCs w:val="24"/>
+          <w:lang w:eastAsia="es-ES"/>
+        </w:rPr>
+        <w:t xml:space="preserve"> </w:t>
+      </w:r>
+    </w:p>
+    <w:p>
+      <w:pPr>
+        <w:numPr>
+          <w:ilvl w:val="1"/>
+          <w:numId w:val="2"/>
+        </w:numPr>
+        <w:spacing w:before="100" w:beforeAutospacing="1" w:after="100" w:afterAutospacing="1" w:line="240" w:lineRule="auto"/>
+        <w:rPr>
+          <w:rFonts w:ascii="Times New Roman" w:eastAsia="Times New Roman" w:hAnsi="Times New Roman" w:cs="Times New Roman"/>
+          <w:sz w:val="24"/>
+          <w:szCs w:val="24"/>
+          <w:lang w:eastAsia="es-ES"/>
+        </w:rPr>
+      </w:pPr>
+      <w:proofErr w:type="spellStart"/>
+      <w:r>
+        <w:rPr>
+          <w:rFonts w:ascii="Courier New" w:eastAsia="Times New Roman" w:hAnsi="Courier New" w:cs="Courier New"/>
+          <w:sz w:val="20"/>
+          <w:szCs w:val="20"/>
+          <w:lang w:eastAsia="es-ES"/>
+        </w:rPr>
+        <w:t>IdCita</w:t>
+      </w:r>
+      <w:proofErr w:type="spellEnd"/>
+      <w:r>
+        <w:rPr>
+          <w:rFonts w:ascii="Times New Roman" w:eastAsia="Times New Roman" w:hAnsi="Times New Roman" w:cs="Times New Roman"/>
+          <w:sz w:val="24"/>
+          <w:szCs w:val="24"/>
+          <w:lang w:eastAsia="es-ES"/>
+        </w:rPr>
+        <w:t xml:space="preserve"> (PK) </w:t>
+      </w:r>
+    </w:p>
+    <w:p>
+      <w:pPr>
+        <w:numPr>
+          <w:ilvl w:val="1"/>
+          <w:numId w:val="2"/>
+        </w:numPr>
+        <w:spacing w:before="100" w:beforeAutospacing="1" w:after="100" w:afterAutospacing="1" w:line="240" w:lineRule="auto"/>
+        <w:rPr>
+          <w:rFonts w:ascii="Times New Roman" w:eastAsia="Times New Roman" w:hAnsi="Times New Roman" w:cs="Times New Roman"/>
+          <w:sz w:val="24"/>
+          <w:szCs w:val="24"/>
+          <w:lang w:eastAsia="es-ES"/>
+        </w:rPr>
+      </w:pPr>
+      <w:proofErr w:type="spellStart"/>
+      <w:r>
+        <w:rPr>
+          <w:rFonts w:ascii="Courier New" w:eastAsia="Times New Roman" w:hAnsi="Courier New" w:cs="Courier New"/>
+          <w:sz w:val="20"/>
+          <w:szCs w:val="20"/>
+          <w:lang w:eastAsia="es-ES"/>
+        </w:rPr>
+        <w:t>IdPaciente</w:t>
+      </w:r>
+      <w:proofErr w:type="spellEnd"/>
+      <w:r>
+        <w:rPr>
+          <w:rFonts w:ascii="Times New Roman" w:eastAsia="Times New Roman" w:hAnsi="Times New Roman" w:cs="Times New Roman"/>
+          <w:sz w:val="24"/>
+          <w:szCs w:val="24"/>
+          <w:lang w:eastAsia="es-ES"/>
+        </w:rPr>
+        <w:t xml:space="preserve"> (FK) </w:t>
+      </w:r>
+    </w:p>
+    <w:p>
+      <w:pPr>
+        <w:numPr>
+          <w:ilvl w:val="1"/>
+          <w:numId w:val="2"/>
+        </w:numPr>
+        <w:spacing w:before="100" w:beforeAutospacing="1" w:after="100" w:afterAutospacing="1" w:line="240" w:lineRule="auto"/>
+        <w:rPr>
+          <w:rFonts w:ascii="Times New Roman" w:eastAsia="Times New Roman" w:hAnsi="Times New Roman" w:cs="Times New Roman"/>
+          <w:sz w:val="24"/>
+          <w:szCs w:val="24"/>
+          <w:lang w:eastAsia="es-ES"/>
+        </w:rPr>
+      </w:pPr>
+      <w:proofErr w:type="spellStart"/>
+      <w:r>
+        <w:rPr>
+          <w:rFonts w:ascii="Courier New" w:eastAsia="Times New Roman" w:hAnsi="Courier New" w:cs="Courier New"/>
+          <w:sz w:val="20"/>
+          <w:szCs w:val="20"/>
+          <w:lang w:eastAsia="es-ES"/>
+        </w:rPr>
+        <w:t>IdMedico</w:t>
+      </w:r>
+      <w:proofErr w:type="spellEnd"/>
+      <w:r>
+        <w:rPr>
+          <w:rFonts w:ascii="Times New Roman" w:eastAsia="Times New Roman" w:hAnsi="Times New Roman" w:cs="Times New Roman"/>
+          <w:sz w:val="24"/>
+          <w:szCs w:val="24"/>
+          <w:lang w:eastAsia="es-ES"/>
+        </w:rPr>
+        <w:t xml:space="preserve"> (FK, opcional si ya está en Agenda) </w:t>
+      </w:r>
+    </w:p>
+    <w:p>
+      <w:pPr>
+        <w:numPr>
+          <w:ilvl w:val="1"/>
+          <w:numId w:val="2"/>
+        </w:numPr>
+        <w:spacing w:before="100" w:beforeAutospacing="1" w:after="100" w:afterAutospacing="1" w:line="240" w:lineRule="auto"/>
+        <w:rPr>
+          <w:rFonts w:ascii="Times New Roman" w:eastAsia="Times New Roman" w:hAnsi="Times New Roman" w:cs="Times New Roman"/>
+          <w:sz w:val="24"/>
+          <w:szCs w:val="24"/>
+          <w:lang w:eastAsia="es-ES"/>
+        </w:rPr>
+      </w:pPr>
+      <w:proofErr w:type="spellStart"/>
+      <w:r>
+        <w:rPr>
+          <w:rFonts w:ascii="Courier New" w:eastAsia="Times New Roman" w:hAnsi="Courier New" w:cs="Courier New"/>
+          <w:sz w:val="20"/>
+          <w:szCs w:val="20"/>
+          <w:lang w:eastAsia="es-ES"/>
+        </w:rPr>
+        <w:t>IdTratamiento</w:t>
+      </w:r>
+      <w:proofErr w:type="spellEnd"/>
+      <w:r>
+        <w:rPr>
+          <w:rFonts w:ascii="Times New Roman" w:eastAsia="Times New Roman" w:hAnsi="Times New Roman" w:cs="Times New Roman"/>
+          <w:sz w:val="24"/>
+          <w:szCs w:val="24"/>
+          <w:lang w:eastAsia="es-ES"/>
+        </w:rPr>
+        <w:t xml:space="preserve"> (FK, más adelante) </w:t>
+      </w:r>
+    </w:p>
+    <w:p>
+      <w:pPr>
+        <w:numPr>
+          <w:ilvl w:val="1"/>
+          <w:numId w:val="2"/>
+        </w:numPr>
+        <w:spacing w:before="100" w:beforeAutospacing="1" w:after="100" w:afterAutospacing="1" w:line="240" w:lineRule="auto"/>
+        <w:rPr>
+          <w:rFonts w:ascii="Times New Roman" w:eastAsia="Times New Roman" w:hAnsi="Times New Roman" w:cs="Times New Roman"/>
+          <w:sz w:val="24"/>
+          <w:szCs w:val="24"/>
+          <w:lang w:eastAsia="es-ES"/>
+        </w:rPr>
+      </w:pPr>
+      <w:proofErr w:type="spellStart"/>
+      <w:r>
+        <w:rPr>
+          <w:rFonts w:ascii="Courier New" w:eastAsia="Times New Roman" w:hAnsi="Courier New" w:cs="Courier New"/>
+          <w:sz w:val="20"/>
+          <w:szCs w:val="20"/>
+          <w:lang w:eastAsia="es-ES"/>
+        </w:rPr>
+        <w:t>FechaHora</w:t>
+      </w:r>
+      <w:proofErr w:type="spellEnd"/>
+      <w:r>
+        <w:rPr>
+          <w:rFonts w:ascii="Times New Roman" w:eastAsia="Times New Roman" w:hAnsi="Times New Roman" w:cs="Times New Roman"/>
+          <w:sz w:val="24"/>
+          <w:szCs w:val="24"/>
+          <w:lang w:eastAsia="es-ES"/>
+        </w:rPr>
+        <w:t xml:space="preserve"> (opcional, se puede tomar de Agenda) </w:t>
+      </w:r>
+    </w:p>
+    <w:p>
+      <w:pPr>
+        <w:numPr>
+          <w:ilvl w:val="1"/>
+          <w:numId w:val="2"/>
+        </w:numPr>
+        <w:spacing w:before="100" w:beforeAutospacing="1" w:after="100" w:afterAutospacing="1" w:line="240" w:lineRule="auto"/>
+        <w:rPr>
+          <w:rFonts w:ascii="Times New Roman" w:eastAsia="Times New Roman" w:hAnsi="Times New Roman" w:cs="Times New Roman"/>
+          <w:sz w:val="24"/>
+          <w:szCs w:val="24"/>
+          <w:lang w:eastAsia="es-ES"/>
+        </w:rPr>
+      </w:pPr>
+      <w:r>
+        <w:rPr>
+          <w:rFonts w:ascii="Courier New" w:eastAsia="Times New Roman" w:hAnsi="Courier New" w:cs="Courier New"/>
+          <w:sz w:val="20"/>
+          <w:szCs w:val="20"/>
+          <w:lang w:eastAsia="es-ES"/>
+        </w:rPr>
+        <w:t>Observaciones</w:t>
+      </w:r>
+      <w:r>
+        <w:rPr>
+          <w:rFonts w:ascii="Times New Roman" w:eastAsia="Times New Roman" w:hAnsi="Times New Roman" w:cs="Times New Roman"/>
+          <w:sz w:val="24"/>
+          <w:szCs w:val="24"/>
+          <w:lang w:eastAsia="es-ES"/>
+        </w:rPr>
+        <w:t xml:space="preserve"> </w:t>
+      </w:r>
+    </w:p>
+    <w:p>
+      <w:pPr>
+        <w:spacing w:before="100" w:beforeAutospacing="1" w:after="100" w:afterAutospacing="1" w:line="240" w:lineRule="auto"/>
+        <w:rPr>
+          <w:rFonts w:ascii="Times New Roman" w:eastAsia="Times New Roman" w:hAnsi="Times New Roman" w:cs="Times New Roman"/>
+          <w:sz w:val="24"/>
+          <w:szCs w:val="24"/>
+          <w:lang w:eastAsia="es-ES"/>
+        </w:rPr>
+      </w:pPr>
+      <w:r>
+        <w:rPr>
+          <w:rFonts w:ascii="Times New Roman" w:eastAsia="Times New Roman" w:hAnsi="Times New Roman" w:cs="Times New Roman"/>
+          <w:b/>
+          <w:bCs/>
+          <w:sz w:val="24"/>
+          <w:szCs w:val="24"/>
+          <w:lang w:eastAsia="es-ES"/>
+        </w:rPr>
+        <w:t>Cómo funciona:</w:t>
+      </w:r>
+    </w:p>
+    <w:p>
+      <w:pPr>
+        <w:numPr>
+          <w:ilvl w:val="0"/>
+          <w:numId w:val="3"/>
+        </w:numPr>
+        <w:spacing w:before="100" w:beforeAutospacing="1" w:after="100" w:afterAutospacing="1" w:line="240" w:lineRule="auto"/>
+        <w:rPr>
+          <w:rFonts w:ascii="Times New Roman" w:eastAsia="Times New Roman" w:hAnsi="Times New Roman" w:cs="Times New Roman"/>
+          <w:sz w:val="24"/>
+          <w:szCs w:val="24"/>
+          <w:lang w:eastAsia="es-ES"/>
+        </w:rPr>
+      </w:pPr>
+      <w:r>
+        <w:rPr>
+          <w:rFonts w:ascii="Times New Roman" w:eastAsia="Times New Roman" w:hAnsi="Times New Roman" w:cs="Times New Roman"/>
+          <w:sz w:val="24"/>
+          <w:szCs w:val="24"/>
+          <w:lang w:eastAsia="es-ES"/>
+        </w:rPr>
+        <w:t xml:space="preserve">Creas bloques en la agenda según la disponibilidad del médico. </w:t>
+      </w:r>
+    </w:p>
+    <w:p>
+      <w:pPr>
+        <w:numPr>
+          <w:ilvl w:val="0"/>
+          <w:numId w:val="3"/>
+        </w:numPr>
+        <w:spacing w:before="100" w:beforeAutospacing="1" w:after="100" w:afterAutospacing="1" w:line="240" w:lineRule="auto"/>
+        <w:rPr>
+          <w:rFonts w:ascii="Times New Roman" w:eastAsia="Times New Roman" w:hAnsi="Times New Roman" w:cs="Times New Roman"/>
+          <w:sz w:val="24"/>
+          <w:szCs w:val="24"/>
+          <w:lang w:eastAsia="es-ES"/>
+        </w:rPr>
+      </w:pPr>
+      <w:r>
+        <w:rPr>
+          <w:rFonts w:ascii="Times New Roman" w:eastAsia="Times New Roman" w:hAnsi="Times New Roman" w:cs="Times New Roman"/>
+          <w:sz w:val="24"/>
+          <w:szCs w:val="24"/>
+          <w:lang w:eastAsia="es-ES"/>
+        </w:rPr>
+        <w:t xml:space="preserve">Cuando asignas un paciente a un bloque, se crea la cita y se vincula </w:t>
+      </w:r>
+      <w:proofErr w:type="spellStart"/>
+      <w:r>
+        <w:rPr>
+          <w:rFonts w:ascii="Courier New" w:eastAsia="Times New Roman" w:hAnsi="Courier New" w:cs="Courier New"/>
+          <w:sz w:val="20"/>
+          <w:szCs w:val="20"/>
+          <w:lang w:eastAsia="es-ES"/>
+        </w:rPr>
+        <w:t>IdCita</w:t>
+      </w:r>
+      <w:proofErr w:type="spellEnd"/>
+      <w:r>
+        <w:rPr>
+          <w:rFonts w:ascii="Times New Roman" w:eastAsia="Times New Roman" w:hAnsi="Times New Roman" w:cs="Times New Roman"/>
+          <w:sz w:val="24"/>
+          <w:szCs w:val="24"/>
+          <w:lang w:eastAsia="es-ES"/>
+        </w:rPr>
+        <w:t xml:space="preserve"> en la agenda. </w:t>
+      </w:r>
+    </w:p>
+    <w:p>
+      <w:pPr>
+        <w:numPr>
+          <w:ilvl w:val="0"/>
+          <w:numId w:val="3"/>
+        </w:numPr>
+        <w:spacing w:before="100" w:beforeAutospacing="1" w:after="100" w:afterAutospacing="1" w:line="240" w:lineRule="auto"/>
+        <w:rPr>
+          <w:rFonts w:ascii="Times New Roman" w:eastAsia="Times New Roman" w:hAnsi="Times New Roman" w:cs="Times New Roman"/>
+          <w:sz w:val="24"/>
+          <w:szCs w:val="24"/>
+          <w:lang w:eastAsia="es-ES"/>
+        </w:rPr>
+      </w:pPr>
+      <w:r>
+        <w:rPr>
+          <w:rFonts w:ascii="Times New Roman" w:eastAsia="Times New Roman" w:hAnsi="Times New Roman" w:cs="Times New Roman"/>
+          <w:sz w:val="24"/>
+          <w:szCs w:val="24"/>
+          <w:lang w:eastAsia="es-ES"/>
+        </w:rPr>
+        <w:t xml:space="preserve">Si se cancela, </w:t>
+      </w:r>
+      <w:r>
+        <w:rPr>
+          <w:rFonts w:ascii="Courier New" w:eastAsia="Times New Roman" w:hAnsi="Courier New" w:cs="Courier New"/>
+          <w:sz w:val="20"/>
+          <w:szCs w:val="20"/>
+          <w:lang w:eastAsia="es-ES"/>
+        </w:rPr>
+        <w:t>Disponible = true</w:t>
+      </w:r>
+      <w:r>
+        <w:rPr>
+          <w:rFonts w:ascii="Times New Roman" w:eastAsia="Times New Roman" w:hAnsi="Times New Roman" w:cs="Times New Roman"/>
+          <w:sz w:val="24"/>
+          <w:szCs w:val="24"/>
+          <w:lang w:eastAsia="es-ES"/>
+        </w:rPr>
+        <w:t xml:space="preserve"> y </w:t>
+      </w:r>
+      <w:proofErr w:type="spellStart"/>
+      <w:r>
+        <w:rPr>
+          <w:rFonts w:ascii="Courier New" w:eastAsia="Times New Roman" w:hAnsi="Courier New" w:cs="Courier New"/>
+          <w:sz w:val="20"/>
+          <w:szCs w:val="20"/>
+          <w:lang w:eastAsia="es-ES"/>
+        </w:rPr>
+        <w:t>IdCita</w:t>
+      </w:r>
+      <w:proofErr w:type="spellEnd"/>
+      <w:r>
+        <w:rPr>
+          <w:rFonts w:ascii="Courier New" w:eastAsia="Times New Roman" w:hAnsi="Courier New" w:cs="Courier New"/>
+          <w:sz w:val="20"/>
+          <w:szCs w:val="20"/>
+          <w:lang w:eastAsia="es-ES"/>
+        </w:rPr>
+        <w:t xml:space="preserve"> = </w:t>
+      </w:r>
+      <w:proofErr w:type="spellStart"/>
+      <w:r>
+        <w:rPr>
+          <w:rFonts w:ascii="Courier New" w:eastAsia="Times New Roman" w:hAnsi="Courier New" w:cs="Courier New"/>
+          <w:sz w:val="20"/>
+          <w:szCs w:val="20"/>
+          <w:lang w:eastAsia="es-ES"/>
+        </w:rPr>
+        <w:t>null</w:t>
+      </w:r>
+      <w:proofErr w:type="spellEnd"/>
+      <w:r>
+        <w:rPr>
+          <w:rFonts w:ascii="Times New Roman" w:eastAsia="Times New Roman" w:hAnsi="Times New Roman" w:cs="Times New Roman"/>
+          <w:sz w:val="24"/>
+          <w:szCs w:val="24"/>
+          <w:lang w:eastAsia="es-ES"/>
+        </w:rPr>
+        <w:t xml:space="preserve">. </w:t>
+      </w:r>
+    </w:p>
+    <w:p>
+      <w:pPr>
+        <w:spacing w:before="100" w:beforeAutospacing="1" w:after="100" w:afterAutospacing="1" w:line="240" w:lineRule="auto"/>
+        <w:rPr>
+          <w:rFonts w:ascii="Times New Roman" w:eastAsia="Times New Roman" w:hAnsi="Times New Roman" w:cs="Times New Roman"/>
+          <w:sz w:val="24"/>
+          <w:szCs w:val="24"/>
+          <w:lang w:eastAsia="es-ES"/>
+        </w:rPr>
+      </w:pPr>
+      <w:r>
+        <w:rPr>
+          <w:rFonts w:ascii="Times New Roman" w:eastAsia="Times New Roman" w:hAnsi="Times New Roman" w:cs="Times New Roman"/>
+          <w:sz w:val="24"/>
+          <w:szCs w:val="24"/>
+          <w:lang w:eastAsia="es-ES"/>
+        </w:rPr>
+        <w:t xml:space="preserve">Esto mantiene </w:t>
+      </w:r>
+      <w:r>
+        <w:rPr>
+          <w:rFonts w:ascii="Times New Roman" w:eastAsia="Times New Roman" w:hAnsi="Times New Roman" w:cs="Times New Roman"/>
+          <w:b/>
+          <w:bCs/>
+          <w:sz w:val="24"/>
+          <w:szCs w:val="24"/>
+          <w:lang w:eastAsia="es-ES"/>
+        </w:rPr>
+        <w:t>un solo origen de verdad para el horario</w:t>
+      </w:r>
+      <w:r>
+        <w:rPr>
+          <w:rFonts w:ascii="Times New Roman" w:eastAsia="Times New Roman" w:hAnsi="Times New Roman" w:cs="Times New Roman"/>
+          <w:sz w:val="24"/>
+          <w:szCs w:val="24"/>
+          <w:lang w:eastAsia="es-ES"/>
+        </w:rPr>
+        <w:t>, y las citas ya “profundizan” lo que ocurre en ese bloque.</w:t>
+      </w:r>
+    </w:p>
+    <w:p>
+      <w:bookmarkStart w:id="0" w:name="_GoBack"/>
+      <w:bookmarkEnd w:id="0"/>
+    </w:p>
     <w:sectPr>
       <w:pgSz w:w="11906" w:h="16838"/>
       <w:pgMar w:top="1417" w:right="1701" w:bottom="1417" w:left="1701" w:header="708" w:footer="708" w:gutter="0"/>
@@ -229,8 +967,280 @@
       </w:rPr>
     </w:lvl>
   </w:abstractNum>
+  <w:abstractNum w:abstractNumId="1" w15:restartNumberingAfterBreak="0">
+    <w:nsid w:val="3B4F0340"/>
+    <w:multiLevelType w:val="multilevel"/>
+    <w:tmpl w:val="A322BF02"/>
+    <w:lvl w:ilvl="0">
+      <w:start w:val="1"/>
+      <w:numFmt w:val="bullet"/>
+      <w:lvlText w:val=""/>
+      <w:lvlJc w:val="left"/>
+      <w:pPr>
+        <w:tabs>
+          <w:tab w:val="num" w:pos="720"/>
+        </w:tabs>
+        <w:ind w:left="720" w:hanging="360"/>
+      </w:pPr>
+      <w:rPr>
+        <w:rFonts w:ascii="Symbol" w:hAnsi="Symbol" w:hint="default"/>
+        <w:sz w:val="20"/>
+      </w:rPr>
+    </w:lvl>
+    <w:lvl w:ilvl="1" w:tentative="1">
+      <w:start w:val="1"/>
+      <w:numFmt w:val="bullet"/>
+      <w:lvlText w:val="o"/>
+      <w:lvlJc w:val="left"/>
+      <w:pPr>
+        <w:tabs>
+          <w:tab w:val="num" w:pos="1440"/>
+        </w:tabs>
+        <w:ind w:left="1440" w:hanging="360"/>
+      </w:pPr>
+      <w:rPr>
+        <w:rFonts w:ascii="Courier New" w:hAnsi="Courier New" w:hint="default"/>
+        <w:sz w:val="20"/>
+      </w:rPr>
+    </w:lvl>
+    <w:lvl w:ilvl="2" w:tentative="1">
+      <w:start w:val="1"/>
+      <w:numFmt w:val="bullet"/>
+      <w:lvlText w:val=""/>
+      <w:lvlJc w:val="left"/>
+      <w:pPr>
+        <w:tabs>
+          <w:tab w:val="num" w:pos="2160"/>
+        </w:tabs>
+        <w:ind w:left="2160" w:hanging="360"/>
+      </w:pPr>
+      <w:rPr>
+        <w:rFonts w:ascii="Wingdings" w:hAnsi="Wingdings" w:hint="default"/>
+        <w:sz w:val="20"/>
+      </w:rPr>
+    </w:lvl>
+    <w:lvl w:ilvl="3" w:tentative="1">
+      <w:start w:val="1"/>
+      <w:numFmt w:val="bullet"/>
+      <w:lvlText w:val=""/>
+      <w:lvlJc w:val="left"/>
+      <w:pPr>
+        <w:tabs>
+          <w:tab w:val="num" w:pos="2880"/>
+        </w:tabs>
+        <w:ind w:left="2880" w:hanging="360"/>
+      </w:pPr>
+      <w:rPr>
+        <w:rFonts w:ascii="Wingdings" w:hAnsi="Wingdings" w:hint="default"/>
+        <w:sz w:val="20"/>
+      </w:rPr>
+    </w:lvl>
+    <w:lvl w:ilvl="4" w:tentative="1">
+      <w:start w:val="1"/>
+      <w:numFmt w:val="bullet"/>
+      <w:lvlText w:val=""/>
+      <w:lvlJc w:val="left"/>
+      <w:pPr>
+        <w:tabs>
+          <w:tab w:val="num" w:pos="3600"/>
+        </w:tabs>
+        <w:ind w:left="3600" w:hanging="360"/>
+      </w:pPr>
+      <w:rPr>
+        <w:rFonts w:ascii="Wingdings" w:hAnsi="Wingdings" w:hint="default"/>
+        <w:sz w:val="20"/>
+      </w:rPr>
+    </w:lvl>
+    <w:lvl w:ilvl="5" w:tentative="1">
+      <w:start w:val="1"/>
+      <w:numFmt w:val="bullet"/>
+      <w:lvlText w:val=""/>
+      <w:lvlJc w:val="left"/>
+      <w:pPr>
+        <w:tabs>
+          <w:tab w:val="num" w:pos="4320"/>
+        </w:tabs>
+        <w:ind w:left="4320" w:hanging="360"/>
+      </w:pPr>
+      <w:rPr>
+        <w:rFonts w:ascii="Wingdings" w:hAnsi="Wingdings" w:hint="default"/>
+        <w:sz w:val="20"/>
+      </w:rPr>
+    </w:lvl>
+    <w:lvl w:ilvl="6" w:tentative="1">
+      <w:start w:val="1"/>
+      <w:numFmt w:val="bullet"/>
+      <w:lvlText w:val=""/>
+      <w:lvlJc w:val="left"/>
+      <w:pPr>
+        <w:tabs>
+          <w:tab w:val="num" w:pos="5040"/>
+        </w:tabs>
+        <w:ind w:left="5040" w:hanging="360"/>
+      </w:pPr>
+      <w:rPr>
+        <w:rFonts w:ascii="Wingdings" w:hAnsi="Wingdings" w:hint="default"/>
+        <w:sz w:val="20"/>
+      </w:rPr>
+    </w:lvl>
+    <w:lvl w:ilvl="7" w:tentative="1">
+      <w:start w:val="1"/>
+      <w:numFmt w:val="bullet"/>
+      <w:lvlText w:val=""/>
+      <w:lvlJc w:val="left"/>
+      <w:pPr>
+        <w:tabs>
+          <w:tab w:val="num" w:pos="5760"/>
+        </w:tabs>
+        <w:ind w:left="5760" w:hanging="360"/>
+      </w:pPr>
+      <w:rPr>
+        <w:rFonts w:ascii="Wingdings" w:hAnsi="Wingdings" w:hint="default"/>
+        <w:sz w:val="20"/>
+      </w:rPr>
+    </w:lvl>
+    <w:lvl w:ilvl="8" w:tentative="1">
+      <w:start w:val="1"/>
+      <w:numFmt w:val="bullet"/>
+      <w:lvlText w:val=""/>
+      <w:lvlJc w:val="left"/>
+      <w:pPr>
+        <w:tabs>
+          <w:tab w:val="num" w:pos="6480"/>
+        </w:tabs>
+        <w:ind w:left="6480" w:hanging="360"/>
+      </w:pPr>
+      <w:rPr>
+        <w:rFonts w:ascii="Wingdings" w:hAnsi="Wingdings" w:hint="default"/>
+        <w:sz w:val="20"/>
+      </w:rPr>
+    </w:lvl>
+  </w:abstractNum>
+  <w:abstractNum w:abstractNumId="2" w15:restartNumberingAfterBreak="0">
+    <w:nsid w:val="44F371AA"/>
+    <w:multiLevelType w:val="multilevel"/>
+    <w:tmpl w:val="8ED4DD2C"/>
+    <w:lvl w:ilvl="0">
+      <w:start w:val="1"/>
+      <w:numFmt w:val="decimal"/>
+      <w:lvlText w:val="%1."/>
+      <w:lvlJc w:val="left"/>
+      <w:pPr>
+        <w:tabs>
+          <w:tab w:val="num" w:pos="720"/>
+        </w:tabs>
+        <w:ind w:left="720" w:hanging="360"/>
+      </w:pPr>
+    </w:lvl>
+    <w:lvl w:ilvl="1">
+      <w:start w:val="1"/>
+      <w:numFmt w:val="bullet"/>
+      <w:lvlText w:val="o"/>
+      <w:lvlJc w:val="left"/>
+      <w:pPr>
+        <w:tabs>
+          <w:tab w:val="num" w:pos="1440"/>
+        </w:tabs>
+        <w:ind w:left="1440" w:hanging="360"/>
+      </w:pPr>
+      <w:rPr>
+        <w:rFonts w:ascii="Courier New" w:hAnsi="Courier New" w:hint="default"/>
+        <w:sz w:val="20"/>
+      </w:rPr>
+    </w:lvl>
+    <w:lvl w:ilvl="2" w:tentative="1">
+      <w:start w:val="1"/>
+      <w:numFmt w:val="decimal"/>
+      <w:lvlText w:val="%3."/>
+      <w:lvlJc w:val="left"/>
+      <w:pPr>
+        <w:tabs>
+          <w:tab w:val="num" w:pos="2160"/>
+        </w:tabs>
+        <w:ind w:left="2160" w:hanging="360"/>
+      </w:pPr>
+    </w:lvl>
+    <w:lvl w:ilvl="3" w:tentative="1">
+      <w:start w:val="1"/>
+      <w:numFmt w:val="decimal"/>
+      <w:lvlText w:val="%4."/>
+      <w:lvlJc w:val="left"/>
+      <w:pPr>
+        <w:tabs>
+          <w:tab w:val="num" w:pos="2880"/>
+        </w:tabs>
+        <w:ind w:left="2880" w:hanging="360"/>
+      </w:pPr>
+    </w:lvl>
+    <w:lvl w:ilvl="4" w:tentative="1">
+      <w:start w:val="1"/>
+      <w:numFmt w:val="decimal"/>
+      <w:lvlText w:val="%5."/>
+      <w:lvlJc w:val="left"/>
+      <w:pPr>
+        <w:tabs>
+          <w:tab w:val="num" w:pos="3600"/>
+        </w:tabs>
+        <w:ind w:left="3600" w:hanging="360"/>
+      </w:pPr>
+    </w:lvl>
+    <w:lvl w:ilvl="5" w:tentative="1">
+      <w:start w:val="1"/>
+      <w:numFmt w:val="decimal"/>
+      <w:lvlText w:val="%6."/>
+      <w:lvlJc w:val="left"/>
+      <w:pPr>
+        <w:tabs>
+          <w:tab w:val="num" w:pos="4320"/>
+        </w:tabs>
+        <w:ind w:left="4320" w:hanging="360"/>
+      </w:pPr>
+    </w:lvl>
+    <w:lvl w:ilvl="6" w:tentative="1">
+      <w:start w:val="1"/>
+      <w:numFmt w:val="decimal"/>
+      <w:lvlText w:val="%7."/>
+      <w:lvlJc w:val="left"/>
+      <w:pPr>
+        <w:tabs>
+          <w:tab w:val="num" w:pos="5040"/>
+        </w:tabs>
+        <w:ind w:left="5040" w:hanging="360"/>
+      </w:pPr>
+    </w:lvl>
+    <w:lvl w:ilvl="7" w:tentative="1">
+      <w:start w:val="1"/>
+      <w:numFmt w:val="decimal"/>
+      <w:lvlText w:val="%8."/>
+      <w:lvlJc w:val="left"/>
+      <w:pPr>
+        <w:tabs>
+          <w:tab w:val="num" w:pos="5760"/>
+        </w:tabs>
+        <w:ind w:left="5760" w:hanging="360"/>
+      </w:pPr>
+    </w:lvl>
+    <w:lvl w:ilvl="8" w:tentative="1">
+      <w:start w:val="1"/>
+      <w:numFmt w:val="decimal"/>
+      <w:lvlText w:val="%9."/>
+      <w:lvlJc w:val="left"/>
+      <w:pPr>
+        <w:tabs>
+          <w:tab w:val="num" w:pos="6480"/>
+        </w:tabs>
+        <w:ind w:left="6480" w:hanging="360"/>
+      </w:pPr>
+    </w:lvl>
+  </w:abstractNum>
   <w:num w:numId="1">
     <w:abstractNumId w:val="0"/>
+  </w:num>
+  <w:num w:numId="2">
+    <w:abstractNumId w:val="2"/>
+  </w:num>
+  <w:num w:numId="3">
+    <w:abstractNumId w:val="1"/>
   </w:num>
 </w:numbering>
 </file>
@@ -667,6 +1677,47 @@
       <w:contextualSpacing/>
     </w:pPr>
   </w:style>
+  <w:style w:type="character" w:styleId="Textoennegrita">
+    <w:name w:val="Strong"/>
+    <w:basedOn w:val="Fuentedeprrafopredeter"/>
+    <w:uiPriority w:val="22"/>
+    <w:qFormat/>
+    <w:rsid w:val="008C0CF5"/>
+    <w:rPr>
+      <w:b/>
+      <w:bCs/>
+    </w:rPr>
+  </w:style>
+  <w:style w:type="character" w:styleId="CdigoHTML">
+    <w:name w:val="HTML Code"/>
+    <w:basedOn w:val="Fuentedeprrafopredeter"/>
+    <w:uiPriority w:val="99"/>
+    <w:semiHidden/>
+    <w:unhideWhenUsed/>
+    <w:rsid w:val="008C0CF5"/>
+    <w:rPr>
+      <w:rFonts w:ascii="Courier New" w:eastAsia="Times New Roman" w:hAnsi="Courier New" w:cs="Courier New"/>
+      <w:sz w:val="20"/>
+      <w:szCs w:val="20"/>
+    </w:rPr>
+  </w:style>
+  <w:style w:type="paragraph" w:styleId="NormalWeb">
+    <w:name w:val="Normal (Web)"/>
+    <w:basedOn w:val="Normal"/>
+    <w:uiPriority w:val="99"/>
+    <w:semiHidden/>
+    <w:unhideWhenUsed/>
+    <w:rsid w:val="008C0CF5"/>
+    <w:pPr>
+      <w:spacing w:before="100" w:beforeAutospacing="1" w:after="100" w:afterAutospacing="1" w:line="240" w:lineRule="auto"/>
+    </w:pPr>
+    <w:rPr>
+      <w:rFonts w:ascii="Times New Roman" w:eastAsia="Times New Roman" w:hAnsi="Times New Roman" w:cs="Times New Roman"/>
+      <w:sz w:val="24"/>
+      <w:szCs w:val="24"/>
+      <w:lang w:eastAsia="es-ES"/>
+    </w:rPr>
+  </w:style>
 </w:styles>
 </file>
 

</xml_diff>

<commit_message>
Se introducen: Modal lateral, particulas, fullCalendar, charts
</commit_message>
<xml_diff>
--- a/Epsilon/wwwroot/documentos/RoadMap.docx
+++ b/Epsilon/wwwroot/documentos/RoadMap.docx
@@ -3,8 +3,169 @@
 <w:document xmlns:wpc="http://schemas.microsoft.com/office/word/2010/wordprocessingCanvas" xmlns:cx="http://schemas.microsoft.com/office/drawing/2014/chartex" xmlns:cx1="http://schemas.microsoft.com/office/drawing/2015/9/8/chartex" xmlns:mc="http://schemas.openxmlformats.org/markup-compatibility/2006" xmlns:o="urn:schemas-microsoft-com:office:office" xmlns:r="http://schemas.openxmlformats.org/officeDocument/2006/relationships" xmlns:m="http://schemas.openxmlformats.org/officeDocument/2006/math" xmlns:v="urn:schemas-microsoft-com:vml" xmlns:wp14="http://schemas.microsoft.com/office/word/2010/wordprocessingDrawing" xmlns:wp="http://schemas.openxmlformats.org/drawingml/2006/wordprocessingDrawing" xmlns:w10="urn:schemas-microsoft-com:office:word" xmlns:w="http://schemas.openxmlformats.org/wordprocessingml/2006/main" xmlns:w14="http://schemas.microsoft.com/office/word/2010/wordml" xmlns:w15="http://schemas.microsoft.com/office/word/2012/wordml" xmlns:w16se="http://schemas.microsoft.com/office/word/2015/wordml/symex" xmlns:wpg="http://schemas.microsoft.com/office/word/2010/wordprocessingGroup" xmlns:wpi="http://schemas.microsoft.com/office/word/2010/wordprocessingInk" xmlns:wne="http://schemas.microsoft.com/office/word/2006/wordml" xmlns:wps="http://schemas.microsoft.com/office/word/2010/wordprocessingShape" mc:Ignorable="w14 w15 w16se wp14">
   <w:body>
     <w:p>
-      <w:r>
-        <w:t xml:space="preserve">-Arreglado el problema del </w:t>
+      <w:pPr>
+        <w:pStyle w:val="Ttulo1"/>
+        <w:jc w:val="center"/>
+      </w:pPr>
+      <w:r>
+        <w:t>EPSILON</w:t>
+      </w:r>
+    </w:p>
+    <w:p>
+      <w:pPr>
+        <w:pStyle w:val="Ttulo2"/>
+      </w:pPr>
+      <w:r>
+        <w:t>_</w:t>
+      </w:r>
+      <w:proofErr w:type="spellStart"/>
+      <w:r>
+        <w:t>Layout</w:t>
+      </w:r>
+      <w:proofErr w:type="spellEnd"/>
+    </w:p>
+    <w:p>
+      <w:pPr>
+        <w:pStyle w:val="Prrafodelista"/>
+        <w:numPr>
+          <w:ilvl w:val="0"/>
+          <w:numId w:val="10"/>
+        </w:numPr>
+      </w:pPr>
+      <w:r>
+        <w:t>Se ha de terminar de maquetar el modal y sacar algún dato o implementar algo interesante.</w:t>
+      </w:r>
+    </w:p>
+    <w:p>
+      <w:pPr>
+        <w:pStyle w:val="Ttulo2"/>
+      </w:pPr>
+      <w:proofErr w:type="spellStart"/>
+      <w:r>
+        <w:t>Login</w:t>
+      </w:r>
+      <w:proofErr w:type="spellEnd"/>
+    </w:p>
+    <w:p>
+      <w:pPr>
+        <w:pStyle w:val="Prrafodelista"/>
+        <w:numPr>
+          <w:ilvl w:val="0"/>
+          <w:numId w:val="4"/>
+        </w:numPr>
+      </w:pPr>
+      <w:r>
+        <w:t xml:space="preserve">Se ha incluido la librería </w:t>
+      </w:r>
+      <w:proofErr w:type="spellStart"/>
+      <w:r>
+        <w:t>particleground</w:t>
+      </w:r>
+      <w:proofErr w:type="spellEnd"/>
+      <w:r>
+        <w:t xml:space="preserve"> y demo.</w:t>
+      </w:r>
+      <w:r>
+        <w:t>j</w:t>
+      </w:r>
+      <w:r>
+        <w:t>s para las partículas</w:t>
+      </w:r>
+    </w:p>
+    <w:p>
+      <w:pPr>
+        <w:pStyle w:val="Prrafodelista"/>
+        <w:numPr>
+          <w:ilvl w:val="0"/>
+          <w:numId w:val="4"/>
+        </w:numPr>
+      </w:pPr>
+      <w:r>
+        <w:t>Falta la autenticación de Google</w:t>
+      </w:r>
+    </w:p>
+    <w:p>
+      <w:pPr>
+        <w:pStyle w:val="Prrafodelista"/>
+        <w:numPr>
+          <w:ilvl w:val="0"/>
+          <w:numId w:val="4"/>
+        </w:numPr>
+      </w:pPr>
+      <w:r>
+        <w:t>Falta revisar esa redirección rara que hace a veces a /</w:t>
+      </w:r>
+      <w:proofErr w:type="spellStart"/>
+      <w:r>
+        <w:t>LoginUser</w:t>
+      </w:r>
+      <w:proofErr w:type="spellEnd"/>
+    </w:p>
+    <w:p>
+      <w:pPr>
+        <w:pStyle w:val="Prrafodelista"/>
+        <w:numPr>
+          <w:ilvl w:val="0"/>
+          <w:numId w:val="4"/>
+        </w:numPr>
+      </w:pPr>
+      <w:r>
+        <w:t xml:space="preserve"> Se ha introducido una sesión que guarda el usuario que se </w:t>
+      </w:r>
+      <w:proofErr w:type="spellStart"/>
+      <w:r>
+        <w:t>loguea</w:t>
+      </w:r>
+      <w:proofErr w:type="spellEnd"/>
+    </w:p>
+    <w:p>
+      <w:pPr>
+        <w:pStyle w:val="Prrafodelista"/>
+      </w:pPr>
+    </w:p>
+    <w:p>
+      <w:pPr>
+        <w:pStyle w:val="Ttulo2"/>
+      </w:pPr>
+      <w:r>
+        <w:t>Home</w:t>
+      </w:r>
+    </w:p>
+    <w:p>
+      <w:pPr>
+        <w:pStyle w:val="Prrafodelista"/>
+        <w:numPr>
+          <w:ilvl w:val="0"/>
+          <w:numId w:val="6"/>
+        </w:numPr>
+      </w:pPr>
+      <w:r>
+        <w:t xml:space="preserve">Creo que el ensanchamiento del recuadro amarillo genera </w:t>
+      </w:r>
+      <w:proofErr w:type="spellStart"/>
+      <w:r>
+        <w:t>scroll</w:t>
+      </w:r>
+      <w:proofErr w:type="spellEnd"/>
+    </w:p>
+    <w:p>
+      <w:pPr>
+        <w:pStyle w:val="Ttulo2"/>
+      </w:pPr>
+      <w:r>
+        <w:t>Usuarios</w:t>
+      </w:r>
+    </w:p>
+    <w:p>
+      <w:pPr>
+        <w:pStyle w:val="Prrafodelista"/>
+        <w:numPr>
+          <w:ilvl w:val="0"/>
+          <w:numId w:val="5"/>
+        </w:numPr>
+      </w:pPr>
+      <w:r>
+        <w:t xml:space="preserve">Arreglado el problema del </w:t>
       </w:r>
       <w:proofErr w:type="spellStart"/>
       <w:r>
@@ -24,24 +185,33 @@
       </w:r>
     </w:p>
     <w:p>
-      <w:r>
-        <w:t>- Falta método de llamada para traer datos</w:t>
-      </w:r>
-    </w:p>
-    <w:p/>
-    <w:p/>
-    <w:p/>
-    <w:p>
-      <w:pPr>
-        <w:rPr>
-          <w:b/>
-        </w:rPr>
-      </w:pPr>
-      <w:r>
-        <w:rPr>
-          <w:b/>
-        </w:rPr>
-        <w:t>MODIFICAR USUARIO</w:t>
+      <w:pPr>
+        <w:pStyle w:val="Prrafodelista"/>
+        <w:numPr>
+          <w:ilvl w:val="0"/>
+          <w:numId w:val="5"/>
+        </w:numPr>
+      </w:pPr>
+      <w:r>
+        <w:t>Introducida foto perfil en tabla</w:t>
+      </w:r>
+    </w:p>
+    <w:p>
+      <w:pPr>
+        <w:pStyle w:val="Prrafodelista"/>
+        <w:numPr>
+          <w:ilvl w:val="0"/>
+          <w:numId w:val="5"/>
+        </w:numPr>
+      </w:pPr>
+      <w:r>
+        <w:t>Falta filtrado</w:t>
+      </w:r>
+    </w:p>
+    <w:p/>
+    <w:p>
+      <w:r>
+        <w:t>Modificar usuario</w:t>
       </w:r>
     </w:p>
     <w:p>
@@ -100,6 +270,603 @@
         <w:t>Al modificar la foto no se refresca en la tabla hay que recargar la pagina</w:t>
       </w:r>
     </w:p>
+    <w:p>
+      <w:proofErr w:type="spellStart"/>
+      <w:r>
+        <w:t>Eliminacion</w:t>
+      </w:r>
+      <w:proofErr w:type="spellEnd"/>
+      <w:r>
+        <w:t xml:space="preserve"> aun falla</w:t>
+      </w:r>
+    </w:p>
+    <w:p>
+      <w:r>
+        <w:t xml:space="preserve">Se puede implementar el </w:t>
+      </w:r>
+      <w:proofErr w:type="spellStart"/>
+      <w:r>
+        <w:t>envio</w:t>
+      </w:r>
+      <w:proofErr w:type="spellEnd"/>
+      <w:r>
+        <w:t xml:space="preserve"> de correo aquí.</w:t>
+      </w:r>
+    </w:p>
+    <w:p>
+      <w:pPr>
+        <w:pStyle w:val="Ttulo2"/>
+      </w:pPr>
+      <w:r>
+        <w:t>Pacientes</w:t>
+      </w:r>
+    </w:p>
+    <w:p>
+      <w:pPr>
+        <w:pStyle w:val="Prrafodelista"/>
+        <w:numPr>
+          <w:ilvl w:val="0"/>
+          <w:numId w:val="7"/>
+        </w:numPr>
+      </w:pPr>
+      <w:proofErr w:type="spellStart"/>
+      <w:r>
+        <w:t>Pa</w:t>
+      </w:r>
+      <w:r>
+        <w:t>gina</w:t>
+      </w:r>
+      <w:proofErr w:type="spellEnd"/>
+      <w:r>
+        <w:t xml:space="preserve"> en desarrollo</w:t>
+      </w:r>
+    </w:p>
+    <w:p/>
+    <w:p>
+      <w:pPr>
+        <w:pStyle w:val="Ttulo2"/>
+      </w:pPr>
+      <w:r>
+        <w:t>Citas</w:t>
+      </w:r>
+    </w:p>
+    <w:p>
+      <w:pPr>
+        <w:pStyle w:val="Prrafodelista"/>
+        <w:numPr>
+          <w:ilvl w:val="0"/>
+          <w:numId w:val="7"/>
+        </w:numPr>
+      </w:pPr>
+      <w:r>
+        <w:t>Posiblemente prescindible y reemplazable por comunicaciones</w:t>
+      </w:r>
+    </w:p>
+    <w:p>
+      <w:pPr>
+        <w:pStyle w:val="Ttulo2"/>
+      </w:pPr>
+      <w:r>
+        <w:t>Informes</w:t>
+      </w:r>
+    </w:p>
+    <w:p>
+      <w:pPr>
+        <w:pStyle w:val="Prrafodelista"/>
+        <w:numPr>
+          <w:ilvl w:val="0"/>
+          <w:numId w:val="7"/>
+        </w:numPr>
+      </w:pPr>
+      <w:proofErr w:type="spellStart"/>
+      <w:r>
+        <w:t>Implementacion</w:t>
+      </w:r>
+      <w:proofErr w:type="spellEnd"/>
+      <w:r>
+        <w:t xml:space="preserve"> de servicio</w:t>
+      </w:r>
+      <w:r>
+        <w:t xml:space="preserve"> Informes</w:t>
+      </w:r>
+    </w:p>
+    <w:p>
+      <w:pPr>
+        <w:pStyle w:val="Prrafodelista"/>
+        <w:numPr>
+          <w:ilvl w:val="0"/>
+          <w:numId w:val="7"/>
+        </w:numPr>
+      </w:pPr>
+      <w:proofErr w:type="spellStart"/>
+      <w:r>
+        <w:t>Configuracion</w:t>
+      </w:r>
+      <w:proofErr w:type="spellEnd"/>
+      <w:r>
+        <w:t xml:space="preserve"> de mi instalación</w:t>
+      </w:r>
+    </w:p>
+    <w:p>
+      <w:pPr>
+        <w:pStyle w:val="Prrafodelista"/>
+      </w:pPr>
+    </w:p>
+    <w:p>
+      <w:pPr>
+        <w:pStyle w:val="Ttulo2"/>
+      </w:pPr>
+      <w:proofErr w:type="spellStart"/>
+      <w:r>
+        <w:lastRenderedPageBreak/>
+        <w:t>Medicos</w:t>
+      </w:r>
+      <w:proofErr w:type="spellEnd"/>
+    </w:p>
+    <w:p>
+      <w:pPr>
+        <w:pStyle w:val="Prrafodelista"/>
+        <w:numPr>
+          <w:ilvl w:val="0"/>
+          <w:numId w:val="8"/>
+        </w:numPr>
+      </w:pPr>
+      <w:r>
+        <w:t>Pruebas, nada…</w:t>
+      </w:r>
+    </w:p>
+    <w:p>
+      <w:pPr>
+        <w:pStyle w:val="Prrafodelista"/>
+      </w:pPr>
+    </w:p>
+    <w:p>
+      <w:pPr>
+        <w:pStyle w:val="Prrafodelista"/>
+      </w:pPr>
+    </w:p>
+    <w:p>
+      <w:pPr>
+        <w:pStyle w:val="Ttulo2"/>
+      </w:pPr>
+      <w:r>
+        <w:t>Agenda</w:t>
+      </w:r>
+    </w:p>
+    <w:p>
+      <w:pPr>
+        <w:pStyle w:val="Prrafodelista"/>
+        <w:numPr>
+          <w:ilvl w:val="0"/>
+          <w:numId w:val="8"/>
+        </w:numPr>
+      </w:pPr>
+      <w:r>
+        <w:t xml:space="preserve">Se incluye </w:t>
+      </w:r>
+      <w:proofErr w:type="spellStart"/>
+      <w:r>
+        <w:t>fullCalendar</w:t>
+      </w:r>
+      <w:proofErr w:type="spellEnd"/>
+      <w:r>
+        <w:t xml:space="preserve"> en </w:t>
+      </w:r>
+      <w:proofErr w:type="spellStart"/>
+      <w:r>
+        <w:t>js</w:t>
+      </w:r>
+      <w:proofErr w:type="spellEnd"/>
+      <w:r>
+        <w:t>/calendar</w:t>
+      </w:r>
+      <w:proofErr w:type="gramStart"/>
+      <w:r>
+        <w:t>/  …</w:t>
+      </w:r>
+      <w:proofErr w:type="gramEnd"/>
+      <w:r>
+        <w:t>con los paquetes:</w:t>
+      </w:r>
+    </w:p>
+    <w:p>
+      <w:pPr>
+        <w:pStyle w:val="Prrafodelista"/>
+        <w:numPr>
+          <w:ilvl w:val="1"/>
+          <w:numId w:val="8"/>
+        </w:numPr>
+      </w:pPr>
+      <w:proofErr w:type="spellStart"/>
+      <w:r>
+        <w:t>core</w:t>
+      </w:r>
+      <w:proofErr w:type="spellEnd"/>
+    </w:p>
+    <w:p>
+      <w:pPr>
+        <w:pStyle w:val="Prrafodelista"/>
+        <w:numPr>
+          <w:ilvl w:val="1"/>
+          <w:numId w:val="8"/>
+        </w:numPr>
+      </w:pPr>
+      <w:proofErr w:type="spellStart"/>
+      <w:r>
+        <w:t>daygrid</w:t>
+      </w:r>
+      <w:proofErr w:type="spellEnd"/>
+    </w:p>
+    <w:p>
+      <w:pPr>
+        <w:pStyle w:val="Prrafodelista"/>
+        <w:numPr>
+          <w:ilvl w:val="1"/>
+          <w:numId w:val="8"/>
+        </w:numPr>
+      </w:pPr>
+      <w:proofErr w:type="spellStart"/>
+      <w:r>
+        <w:t>interaction</w:t>
+      </w:r>
+      <w:proofErr w:type="spellEnd"/>
+    </w:p>
+    <w:p>
+      <w:pPr>
+        <w:pStyle w:val="Prrafodelista"/>
+        <w:numPr>
+          <w:ilvl w:val="1"/>
+          <w:numId w:val="8"/>
+        </w:numPr>
+      </w:pPr>
+      <w:proofErr w:type="spellStart"/>
+      <w:r>
+        <w:t>locale</w:t>
+      </w:r>
+      <w:proofErr w:type="spellEnd"/>
+    </w:p>
+    <w:p>
+      <w:pPr>
+        <w:pStyle w:val="Prrafodelista"/>
+        <w:numPr>
+          <w:ilvl w:val="1"/>
+          <w:numId w:val="8"/>
+        </w:numPr>
+      </w:pPr>
+      <w:proofErr w:type="spellStart"/>
+      <w:r>
+        <w:t>multimonth</w:t>
+      </w:r>
+      <w:proofErr w:type="spellEnd"/>
+    </w:p>
+    <w:p>
+      <w:pPr>
+        <w:pStyle w:val="Prrafodelista"/>
+        <w:numPr>
+          <w:ilvl w:val="1"/>
+          <w:numId w:val="8"/>
+        </w:numPr>
+      </w:pPr>
+      <w:proofErr w:type="spellStart"/>
+      <w:r>
+        <w:t>timegrid</w:t>
+      </w:r>
+      <w:proofErr w:type="spellEnd"/>
+    </w:p>
+    <w:p>
+      <w:r>
+        <w:t xml:space="preserve">A la espera de análisis del componente. </w:t>
+      </w:r>
+    </w:p>
+    <w:p>
+      <w:r>
+        <w:t xml:space="preserve">Se </w:t>
+      </w:r>
+      <w:proofErr w:type="spellStart"/>
+      <w:r>
+        <w:t>esta</w:t>
+      </w:r>
+      <w:proofErr w:type="spellEnd"/>
+      <w:r>
+        <w:t xml:space="preserve"> pensando </w:t>
+      </w:r>
+      <w:proofErr w:type="spellStart"/>
+      <w:r>
+        <w:t>emplantear</w:t>
+      </w:r>
+      <w:proofErr w:type="spellEnd"/>
+      <w:r>
+        <w:t xml:space="preserve"> un mecanismo de diferenciación entre modificación y eliminación.</w:t>
+      </w:r>
+    </w:p>
+    <w:p>
+      <w:r>
+        <w:t xml:space="preserve">Al crear una cita lo lógico </w:t>
+      </w:r>
+      <w:proofErr w:type="spellStart"/>
+      <w:r>
+        <w:t>seri</w:t>
+      </w:r>
+      <w:r>
+        <w:t>a</w:t>
+      </w:r>
+      <w:proofErr w:type="spellEnd"/>
+      <w:r>
+        <w:t xml:space="preserve"> traer:</w:t>
+      </w:r>
+    </w:p>
+    <w:p>
+      <w:pPr>
+        <w:pStyle w:val="Prrafodelista"/>
+        <w:numPr>
+          <w:ilvl w:val="0"/>
+          <w:numId w:val="8"/>
+        </w:numPr>
+      </w:pPr>
+      <w:r>
+        <w:t>Pacientes</w:t>
+      </w:r>
+    </w:p>
+    <w:p>
+      <w:pPr>
+        <w:pStyle w:val="Prrafodelista"/>
+        <w:numPr>
+          <w:ilvl w:val="0"/>
+          <w:numId w:val="8"/>
+        </w:numPr>
+      </w:pPr>
+      <w:proofErr w:type="spellStart"/>
+      <w:r>
+        <w:t>Medicos</w:t>
+      </w:r>
+      <w:proofErr w:type="spellEnd"/>
+    </w:p>
+    <w:p>
+      <w:pPr>
+        <w:pStyle w:val="Prrafodelista"/>
+        <w:numPr>
+          <w:ilvl w:val="0"/>
+          <w:numId w:val="8"/>
+        </w:numPr>
+      </w:pPr>
+      <w:r>
+        <w:t>Tratamiento</w:t>
+      </w:r>
+    </w:p>
+    <w:p>
+      <w:pPr>
+        <w:pStyle w:val="Prrafodelista"/>
+        <w:numPr>
+          <w:ilvl w:val="0"/>
+          <w:numId w:val="8"/>
+        </w:numPr>
+      </w:pPr>
+      <w:r>
+        <w:t>Y un cuadro de fecha y hora</w:t>
+      </w:r>
+    </w:p>
+    <w:p>
+      <w:r>
+        <w:t>Y esto supongo que guardarlo en la tabla citas.</w:t>
+      </w:r>
+    </w:p>
+    <w:p>
+      <w:pPr>
+        <w:pStyle w:val="Ttulo2"/>
+      </w:pPr>
+      <w:proofErr w:type="spellStart"/>
+      <w:r>
+        <w:t>Radiologia</w:t>
+      </w:r>
+      <w:proofErr w:type="spellEnd"/>
+    </w:p>
+    <w:p>
+      <w:pPr>
+        <w:pStyle w:val="Prrafodelista"/>
+        <w:numPr>
+          <w:ilvl w:val="0"/>
+          <w:numId w:val="9"/>
+        </w:numPr>
+      </w:pPr>
+      <w:r>
+        <w:t xml:space="preserve">Se </w:t>
+      </w:r>
+      <w:proofErr w:type="gramStart"/>
+      <w:r>
+        <w:t>implementara</w:t>
+      </w:r>
+      <w:proofErr w:type="gramEnd"/>
+      <w:r>
+        <w:t xml:space="preserve"> </w:t>
+      </w:r>
+      <w:proofErr w:type="spellStart"/>
+      <w:r>
+        <w:t>modelviewer</w:t>
+      </w:r>
+      <w:proofErr w:type="spellEnd"/>
+    </w:p>
+    <w:p>
+      <w:pPr>
+        <w:pStyle w:val="Ttulo2"/>
+      </w:pPr>
+      <w:r>
+        <w:t>Tratamientos</w:t>
+      </w:r>
+    </w:p>
+    <w:p>
+      <w:pPr>
+        <w:pStyle w:val="Prrafodelista"/>
+        <w:numPr>
+          <w:ilvl w:val="0"/>
+          <w:numId w:val="9"/>
+        </w:numPr>
+      </w:pPr>
+      <w:r>
+        <w:t xml:space="preserve">Aquí de momento solo hay </w:t>
+      </w:r>
+      <w:proofErr w:type="spellStart"/>
+      <w:r>
+        <w:t>tabs</w:t>
+      </w:r>
+      <w:proofErr w:type="spellEnd"/>
+    </w:p>
+    <w:p/>
+    <w:p>
+      <w:pPr>
+        <w:pStyle w:val="Ttulo2"/>
+      </w:pPr>
+      <w:r>
+        <w:t>Permisos</w:t>
+      </w:r>
+    </w:p>
+    <w:p>
+      <w:pPr>
+        <w:pStyle w:val="Prrafodelista"/>
+        <w:numPr>
+          <w:ilvl w:val="0"/>
+          <w:numId w:val="9"/>
+        </w:numPr>
+      </w:pPr>
+      <w:r>
+        <w:t>…</w:t>
+      </w:r>
+    </w:p>
+    <w:p/>
+    <w:p/>
+    <w:p/>
+    <w:p/>
+    <w:p/>
+    <w:p>
+      <w:r>
+        <w:t xml:space="preserve">OTROS: </w:t>
+      </w:r>
+    </w:p>
+    <w:p>
+      <w:pPr>
+        <w:pStyle w:val="Prrafodelista"/>
+        <w:numPr>
+          <w:ilvl w:val="0"/>
+          <w:numId w:val="9"/>
+        </w:numPr>
+      </w:pPr>
+      <w:proofErr w:type="spellStart"/>
+      <w:r>
+        <w:lastRenderedPageBreak/>
+        <w:t>Signal</w:t>
+      </w:r>
+      <w:proofErr w:type="spellEnd"/>
+      <w:r>
+        <w:t xml:space="preserve"> R</w:t>
+      </w:r>
+    </w:p>
+    <w:p>
+      <w:pPr>
+        <w:pStyle w:val="Prrafodelista"/>
+        <w:numPr>
+          <w:ilvl w:val="0"/>
+          <w:numId w:val="9"/>
+        </w:numPr>
+      </w:pPr>
+      <w:r>
+        <w:t xml:space="preserve">Arco iris </w:t>
+      </w:r>
+      <w:proofErr w:type="spellStart"/>
+      <w:r>
+        <w:t>css</w:t>
+      </w:r>
+      <w:proofErr w:type="spellEnd"/>
+    </w:p>
+    <w:p>
+      <w:pPr>
+        <w:pStyle w:val="Prrafodelista"/>
+        <w:numPr>
+          <w:ilvl w:val="0"/>
+          <w:numId w:val="9"/>
+        </w:numPr>
+      </w:pPr>
+      <w:proofErr w:type="spellStart"/>
+      <w:r>
+        <w:t>Typewriting</w:t>
+      </w:r>
+      <w:proofErr w:type="spellEnd"/>
+    </w:p>
+    <w:p>
+      <w:pPr>
+        <w:pStyle w:val="Prrafodelista"/>
+        <w:numPr>
+          <w:ilvl w:val="0"/>
+          <w:numId w:val="9"/>
+        </w:numPr>
+      </w:pPr>
+      <w:proofErr w:type="spellStart"/>
+      <w:r>
+        <w:t>Identity</w:t>
+      </w:r>
+      <w:proofErr w:type="spellEnd"/>
+    </w:p>
+    <w:p>
+      <w:pPr>
+        <w:pStyle w:val="Prrafodelista"/>
+        <w:numPr>
+          <w:ilvl w:val="0"/>
+          <w:numId w:val="9"/>
+        </w:numPr>
+      </w:pPr>
+      <w:r>
+        <w:t>Juegos</w:t>
+      </w:r>
+    </w:p>
+    <w:p>
+      <w:pPr>
+        <w:pStyle w:val="Prrafodelista"/>
+        <w:numPr>
+          <w:ilvl w:val="0"/>
+          <w:numId w:val="9"/>
+        </w:numPr>
+      </w:pPr>
+      <w:bookmarkStart w:id="0" w:name="_GoBack"/>
+      <w:bookmarkEnd w:id="0"/>
+    </w:p>
+    <w:p/>
+    <w:p/>
+    <w:p/>
+    <w:p/>
+    <w:p/>
+    <w:p/>
+    <w:p/>
+    <w:p/>
+    <w:p/>
+    <w:p/>
+    <w:p/>
+    <w:p/>
+    <w:p/>
+    <w:p/>
+    <w:p/>
+    <w:p/>
+    <w:p/>
+    <w:p/>
+    <w:p/>
+    <w:p/>
+    <w:p/>
+    <w:p/>
+    <w:p/>
+    <w:p/>
+    <w:p/>
+    <w:p/>
+    <w:p/>
+    <w:p/>
+    <w:p/>
+    <w:p/>
+    <w:p/>
+    <w:p/>
+    <w:p/>
+    <w:p/>
+    <w:p/>
+    <w:p/>
+    <w:p/>
+    <w:p/>
+    <w:p/>
+    <w:p/>
     <w:p>
       <w:pPr>
         <w:numPr>
@@ -693,6 +1460,7 @@
           <w:szCs w:val="24"/>
           <w:lang w:eastAsia="es-ES"/>
         </w:rPr>
+        <w:lastRenderedPageBreak/>
         <w:t xml:space="preserve">Cuando asignas un paciente a un bloque, se crea la cita y se vincula </w:t>
       </w:r>
       <w:proofErr w:type="spellStart"/>
@@ -926,17 +1694,15 @@
     <w:p/>
     <w:p>
       <w:r>
-        <w:lastRenderedPageBreak/>
-        <w:t>Se</w:t>
-      </w:r>
-      <w:bookmarkStart w:id="0" w:name="_GoBack"/>
-      <w:bookmarkEnd w:id="0"/>
-      <w:r>
-        <w:t xml:space="preserve"> define este modelo de datos</w:t>
-      </w:r>
-    </w:p>
-    <w:p>
-      <w:r>
+        <w:t>Se define este modelo de datos</w:t>
+      </w:r>
+    </w:p>
+    <w:p>
+      <w:r>
+        <w:rPr>
+          <w:noProof/>
+          <w:lang w:eastAsia="es-ES"/>
+        </w:rPr>
         <w:drawing>
           <wp:inline distT="0" distB="0" distL="0" distR="0" wp14:anchorId="60F81472" wp14:editId="246E6991">
             <wp:extent cx="6198294" cy="3811980"/>
@@ -953,7 +1719,7 @@
                     <pic:cNvPicPr/>
                   </pic:nvPicPr>
                   <pic:blipFill>
-                    <a:blip r:embed="rId5"/>
+                    <a:blip r:embed="rId6"/>
                     <a:stretch>
                       <a:fillRect/>
                     </a:stretch>
@@ -987,6 +1753,119 @@
 <file path=word/numbering.xml><?xml version="1.0" encoding="utf-8"?>
 <w:numbering xmlns:wpc="http://schemas.microsoft.com/office/word/2010/wordprocessingCanvas" xmlns:cx="http://schemas.microsoft.com/office/drawing/2014/chartex" xmlns:cx1="http://schemas.microsoft.com/office/drawing/2015/9/8/chartex" xmlns:mc="http://schemas.openxmlformats.org/markup-compatibility/2006" xmlns:o="urn:schemas-microsoft-com:office:office" xmlns:r="http://schemas.openxmlformats.org/officeDocument/2006/relationships" xmlns:m="http://schemas.openxmlformats.org/officeDocument/2006/math" xmlns:v="urn:schemas-microsoft-com:vml" xmlns:wp14="http://schemas.microsoft.com/office/word/2010/wordprocessingDrawing" xmlns:wp="http://schemas.openxmlformats.org/drawingml/2006/wordprocessingDrawing" xmlns:w10="urn:schemas-microsoft-com:office:word" xmlns:w="http://schemas.openxmlformats.org/wordprocessingml/2006/main" xmlns:w14="http://schemas.microsoft.com/office/word/2010/wordml" xmlns:w15="http://schemas.microsoft.com/office/word/2012/wordml" xmlns:w16se="http://schemas.microsoft.com/office/word/2015/wordml/symex" xmlns:wpg="http://schemas.microsoft.com/office/word/2010/wordprocessingGroup" xmlns:wpi="http://schemas.microsoft.com/office/word/2010/wordprocessingInk" xmlns:wne="http://schemas.microsoft.com/office/word/2006/wordml" xmlns:wps="http://schemas.microsoft.com/office/word/2010/wordprocessingShape" mc:Ignorable="w14 w15 w16se wp14">
   <w:abstractNum w:abstractNumId="0" w15:restartNumberingAfterBreak="0">
+    <w:nsid w:val="0AA80486"/>
+    <w:multiLevelType w:val="hybridMultilevel"/>
+    <w:tmpl w:val="8B3AAF22"/>
+    <w:lvl w:ilvl="0" w:tplc="0C0A0001">
+      <w:start w:val="1"/>
+      <w:numFmt w:val="bullet"/>
+      <w:lvlText w:val=""/>
+      <w:lvlJc w:val="left"/>
+      <w:pPr>
+        <w:ind w:left="720" w:hanging="360"/>
+      </w:pPr>
+      <w:rPr>
+        <w:rFonts w:ascii="Symbol" w:hAnsi="Symbol" w:hint="default"/>
+      </w:rPr>
+    </w:lvl>
+    <w:lvl w:ilvl="1" w:tplc="0C0A0003" w:tentative="1">
+      <w:start w:val="1"/>
+      <w:numFmt w:val="bullet"/>
+      <w:lvlText w:val="o"/>
+      <w:lvlJc w:val="left"/>
+      <w:pPr>
+        <w:ind w:left="1440" w:hanging="360"/>
+      </w:pPr>
+      <w:rPr>
+        <w:rFonts w:ascii="Courier New" w:hAnsi="Courier New" w:cs="Courier New" w:hint="default"/>
+      </w:rPr>
+    </w:lvl>
+    <w:lvl w:ilvl="2" w:tplc="0C0A0005" w:tentative="1">
+      <w:start w:val="1"/>
+      <w:numFmt w:val="bullet"/>
+      <w:lvlText w:val=""/>
+      <w:lvlJc w:val="left"/>
+      <w:pPr>
+        <w:ind w:left="2160" w:hanging="360"/>
+      </w:pPr>
+      <w:rPr>
+        <w:rFonts w:ascii="Wingdings" w:hAnsi="Wingdings" w:hint="default"/>
+      </w:rPr>
+    </w:lvl>
+    <w:lvl w:ilvl="3" w:tplc="0C0A0001" w:tentative="1">
+      <w:start w:val="1"/>
+      <w:numFmt w:val="bullet"/>
+      <w:lvlText w:val=""/>
+      <w:lvlJc w:val="left"/>
+      <w:pPr>
+        <w:ind w:left="2880" w:hanging="360"/>
+      </w:pPr>
+      <w:rPr>
+        <w:rFonts w:ascii="Symbol" w:hAnsi="Symbol" w:hint="default"/>
+      </w:rPr>
+    </w:lvl>
+    <w:lvl w:ilvl="4" w:tplc="0C0A0003" w:tentative="1">
+      <w:start w:val="1"/>
+      <w:numFmt w:val="bullet"/>
+      <w:lvlText w:val="o"/>
+      <w:lvlJc w:val="left"/>
+      <w:pPr>
+        <w:ind w:left="3600" w:hanging="360"/>
+      </w:pPr>
+      <w:rPr>
+        <w:rFonts w:ascii="Courier New" w:hAnsi="Courier New" w:cs="Courier New" w:hint="default"/>
+      </w:rPr>
+    </w:lvl>
+    <w:lvl w:ilvl="5" w:tplc="0C0A0005" w:tentative="1">
+      <w:start w:val="1"/>
+      <w:numFmt w:val="bullet"/>
+      <w:lvlText w:val=""/>
+      <w:lvlJc w:val="left"/>
+      <w:pPr>
+        <w:ind w:left="4320" w:hanging="360"/>
+      </w:pPr>
+      <w:rPr>
+        <w:rFonts w:ascii="Wingdings" w:hAnsi="Wingdings" w:hint="default"/>
+      </w:rPr>
+    </w:lvl>
+    <w:lvl w:ilvl="6" w:tplc="0C0A0001" w:tentative="1">
+      <w:start w:val="1"/>
+      <w:numFmt w:val="bullet"/>
+      <w:lvlText w:val=""/>
+      <w:lvlJc w:val="left"/>
+      <w:pPr>
+        <w:ind w:left="5040" w:hanging="360"/>
+      </w:pPr>
+      <w:rPr>
+        <w:rFonts w:ascii="Symbol" w:hAnsi="Symbol" w:hint="default"/>
+      </w:rPr>
+    </w:lvl>
+    <w:lvl w:ilvl="7" w:tplc="0C0A0003" w:tentative="1">
+      <w:start w:val="1"/>
+      <w:numFmt w:val="bullet"/>
+      <w:lvlText w:val="o"/>
+      <w:lvlJc w:val="left"/>
+      <w:pPr>
+        <w:ind w:left="5760" w:hanging="360"/>
+      </w:pPr>
+      <w:rPr>
+        <w:rFonts w:ascii="Courier New" w:hAnsi="Courier New" w:cs="Courier New" w:hint="default"/>
+      </w:rPr>
+    </w:lvl>
+    <w:lvl w:ilvl="8" w:tplc="0C0A0005" w:tentative="1">
+      <w:start w:val="1"/>
+      <w:numFmt w:val="bullet"/>
+      <w:lvlText w:val=""/>
+      <w:lvlJc w:val="left"/>
+      <w:pPr>
+        <w:ind w:left="6480" w:hanging="360"/>
+      </w:pPr>
+      <w:rPr>
+        <w:rFonts w:ascii="Wingdings" w:hAnsi="Wingdings" w:hint="default"/>
+      </w:rPr>
+    </w:lvl>
+  </w:abstractNum>
+  <w:abstractNum w:abstractNumId="1" w15:restartNumberingAfterBreak="0">
     <w:nsid w:val="13F24EAB"/>
     <w:multiLevelType w:val="hybridMultilevel"/>
     <w:tmpl w:val="82A207D4"/>
@@ -1099,7 +1978,233 @@
       </w:rPr>
     </w:lvl>
   </w:abstractNum>
-  <w:abstractNum w:abstractNumId="1" w15:restartNumberingAfterBreak="0">
+  <w:abstractNum w:abstractNumId="2" w15:restartNumberingAfterBreak="0">
+    <w:nsid w:val="1CF81014"/>
+    <w:multiLevelType w:val="hybridMultilevel"/>
+    <w:tmpl w:val="1A36F0DE"/>
+    <w:lvl w:ilvl="0" w:tplc="0C0A0001">
+      <w:start w:val="1"/>
+      <w:numFmt w:val="bullet"/>
+      <w:lvlText w:val=""/>
+      <w:lvlJc w:val="left"/>
+      <w:pPr>
+        <w:ind w:left="720" w:hanging="360"/>
+      </w:pPr>
+      <w:rPr>
+        <w:rFonts w:ascii="Symbol" w:hAnsi="Symbol" w:hint="default"/>
+      </w:rPr>
+    </w:lvl>
+    <w:lvl w:ilvl="1" w:tplc="0C0A0003" w:tentative="1">
+      <w:start w:val="1"/>
+      <w:numFmt w:val="bullet"/>
+      <w:lvlText w:val="o"/>
+      <w:lvlJc w:val="left"/>
+      <w:pPr>
+        <w:ind w:left="1440" w:hanging="360"/>
+      </w:pPr>
+      <w:rPr>
+        <w:rFonts w:ascii="Courier New" w:hAnsi="Courier New" w:cs="Courier New" w:hint="default"/>
+      </w:rPr>
+    </w:lvl>
+    <w:lvl w:ilvl="2" w:tplc="0C0A0005" w:tentative="1">
+      <w:start w:val="1"/>
+      <w:numFmt w:val="bullet"/>
+      <w:lvlText w:val=""/>
+      <w:lvlJc w:val="left"/>
+      <w:pPr>
+        <w:ind w:left="2160" w:hanging="360"/>
+      </w:pPr>
+      <w:rPr>
+        <w:rFonts w:ascii="Wingdings" w:hAnsi="Wingdings" w:hint="default"/>
+      </w:rPr>
+    </w:lvl>
+    <w:lvl w:ilvl="3" w:tplc="0C0A0001" w:tentative="1">
+      <w:start w:val="1"/>
+      <w:numFmt w:val="bullet"/>
+      <w:lvlText w:val=""/>
+      <w:lvlJc w:val="left"/>
+      <w:pPr>
+        <w:ind w:left="2880" w:hanging="360"/>
+      </w:pPr>
+      <w:rPr>
+        <w:rFonts w:ascii="Symbol" w:hAnsi="Symbol" w:hint="default"/>
+      </w:rPr>
+    </w:lvl>
+    <w:lvl w:ilvl="4" w:tplc="0C0A0003" w:tentative="1">
+      <w:start w:val="1"/>
+      <w:numFmt w:val="bullet"/>
+      <w:lvlText w:val="o"/>
+      <w:lvlJc w:val="left"/>
+      <w:pPr>
+        <w:ind w:left="3600" w:hanging="360"/>
+      </w:pPr>
+      <w:rPr>
+        <w:rFonts w:ascii="Courier New" w:hAnsi="Courier New" w:cs="Courier New" w:hint="default"/>
+      </w:rPr>
+    </w:lvl>
+    <w:lvl w:ilvl="5" w:tplc="0C0A0005" w:tentative="1">
+      <w:start w:val="1"/>
+      <w:numFmt w:val="bullet"/>
+      <w:lvlText w:val=""/>
+      <w:lvlJc w:val="left"/>
+      <w:pPr>
+        <w:ind w:left="4320" w:hanging="360"/>
+      </w:pPr>
+      <w:rPr>
+        <w:rFonts w:ascii="Wingdings" w:hAnsi="Wingdings" w:hint="default"/>
+      </w:rPr>
+    </w:lvl>
+    <w:lvl w:ilvl="6" w:tplc="0C0A0001" w:tentative="1">
+      <w:start w:val="1"/>
+      <w:numFmt w:val="bullet"/>
+      <w:lvlText w:val=""/>
+      <w:lvlJc w:val="left"/>
+      <w:pPr>
+        <w:ind w:left="5040" w:hanging="360"/>
+      </w:pPr>
+      <w:rPr>
+        <w:rFonts w:ascii="Symbol" w:hAnsi="Symbol" w:hint="default"/>
+      </w:rPr>
+    </w:lvl>
+    <w:lvl w:ilvl="7" w:tplc="0C0A0003" w:tentative="1">
+      <w:start w:val="1"/>
+      <w:numFmt w:val="bullet"/>
+      <w:lvlText w:val="o"/>
+      <w:lvlJc w:val="left"/>
+      <w:pPr>
+        <w:ind w:left="5760" w:hanging="360"/>
+      </w:pPr>
+      <w:rPr>
+        <w:rFonts w:ascii="Courier New" w:hAnsi="Courier New" w:cs="Courier New" w:hint="default"/>
+      </w:rPr>
+    </w:lvl>
+    <w:lvl w:ilvl="8" w:tplc="0C0A0005" w:tentative="1">
+      <w:start w:val="1"/>
+      <w:numFmt w:val="bullet"/>
+      <w:lvlText w:val=""/>
+      <w:lvlJc w:val="left"/>
+      <w:pPr>
+        <w:ind w:left="6480" w:hanging="360"/>
+      </w:pPr>
+      <w:rPr>
+        <w:rFonts w:ascii="Wingdings" w:hAnsi="Wingdings" w:hint="default"/>
+      </w:rPr>
+    </w:lvl>
+  </w:abstractNum>
+  <w:abstractNum w:abstractNumId="3" w15:restartNumberingAfterBreak="0">
+    <w:nsid w:val="30E205FC"/>
+    <w:multiLevelType w:val="hybridMultilevel"/>
+    <w:tmpl w:val="9044FFD8"/>
+    <w:lvl w:ilvl="0" w:tplc="0C0A0001">
+      <w:start w:val="1"/>
+      <w:numFmt w:val="bullet"/>
+      <w:lvlText w:val=""/>
+      <w:lvlJc w:val="left"/>
+      <w:pPr>
+        <w:ind w:left="720" w:hanging="360"/>
+      </w:pPr>
+      <w:rPr>
+        <w:rFonts w:ascii="Symbol" w:hAnsi="Symbol" w:hint="default"/>
+      </w:rPr>
+    </w:lvl>
+    <w:lvl w:ilvl="1" w:tplc="0C0A0003" w:tentative="1">
+      <w:start w:val="1"/>
+      <w:numFmt w:val="bullet"/>
+      <w:lvlText w:val="o"/>
+      <w:lvlJc w:val="left"/>
+      <w:pPr>
+        <w:ind w:left="1440" w:hanging="360"/>
+      </w:pPr>
+      <w:rPr>
+        <w:rFonts w:ascii="Courier New" w:hAnsi="Courier New" w:cs="Courier New" w:hint="default"/>
+      </w:rPr>
+    </w:lvl>
+    <w:lvl w:ilvl="2" w:tplc="0C0A0005" w:tentative="1">
+      <w:start w:val="1"/>
+      <w:numFmt w:val="bullet"/>
+      <w:lvlText w:val=""/>
+      <w:lvlJc w:val="left"/>
+      <w:pPr>
+        <w:ind w:left="2160" w:hanging="360"/>
+      </w:pPr>
+      <w:rPr>
+        <w:rFonts w:ascii="Wingdings" w:hAnsi="Wingdings" w:hint="default"/>
+      </w:rPr>
+    </w:lvl>
+    <w:lvl w:ilvl="3" w:tplc="0C0A0001" w:tentative="1">
+      <w:start w:val="1"/>
+      <w:numFmt w:val="bullet"/>
+      <w:lvlText w:val=""/>
+      <w:lvlJc w:val="left"/>
+      <w:pPr>
+        <w:ind w:left="2880" w:hanging="360"/>
+      </w:pPr>
+      <w:rPr>
+        <w:rFonts w:ascii="Symbol" w:hAnsi="Symbol" w:hint="default"/>
+      </w:rPr>
+    </w:lvl>
+    <w:lvl w:ilvl="4" w:tplc="0C0A0003" w:tentative="1">
+      <w:start w:val="1"/>
+      <w:numFmt w:val="bullet"/>
+      <w:lvlText w:val="o"/>
+      <w:lvlJc w:val="left"/>
+      <w:pPr>
+        <w:ind w:left="3600" w:hanging="360"/>
+      </w:pPr>
+      <w:rPr>
+        <w:rFonts w:ascii="Courier New" w:hAnsi="Courier New" w:cs="Courier New" w:hint="default"/>
+      </w:rPr>
+    </w:lvl>
+    <w:lvl w:ilvl="5" w:tplc="0C0A0005" w:tentative="1">
+      <w:start w:val="1"/>
+      <w:numFmt w:val="bullet"/>
+      <w:lvlText w:val=""/>
+      <w:lvlJc w:val="left"/>
+      <w:pPr>
+        <w:ind w:left="4320" w:hanging="360"/>
+      </w:pPr>
+      <w:rPr>
+        <w:rFonts w:ascii="Wingdings" w:hAnsi="Wingdings" w:hint="default"/>
+      </w:rPr>
+    </w:lvl>
+    <w:lvl w:ilvl="6" w:tplc="0C0A0001" w:tentative="1">
+      <w:start w:val="1"/>
+      <w:numFmt w:val="bullet"/>
+      <w:lvlText w:val=""/>
+      <w:lvlJc w:val="left"/>
+      <w:pPr>
+        <w:ind w:left="5040" w:hanging="360"/>
+      </w:pPr>
+      <w:rPr>
+        <w:rFonts w:ascii="Symbol" w:hAnsi="Symbol" w:hint="default"/>
+      </w:rPr>
+    </w:lvl>
+    <w:lvl w:ilvl="7" w:tplc="0C0A0003" w:tentative="1">
+      <w:start w:val="1"/>
+      <w:numFmt w:val="bullet"/>
+      <w:lvlText w:val="o"/>
+      <w:lvlJc w:val="left"/>
+      <w:pPr>
+        <w:ind w:left="5760" w:hanging="360"/>
+      </w:pPr>
+      <w:rPr>
+        <w:rFonts w:ascii="Courier New" w:hAnsi="Courier New" w:cs="Courier New" w:hint="default"/>
+      </w:rPr>
+    </w:lvl>
+    <w:lvl w:ilvl="8" w:tplc="0C0A0005" w:tentative="1">
+      <w:start w:val="1"/>
+      <w:numFmt w:val="bullet"/>
+      <w:lvlText w:val=""/>
+      <w:lvlJc w:val="left"/>
+      <w:pPr>
+        <w:ind w:left="6480" w:hanging="360"/>
+      </w:pPr>
+      <w:rPr>
+        <w:rFonts w:ascii="Wingdings" w:hAnsi="Wingdings" w:hint="default"/>
+      </w:rPr>
+    </w:lvl>
+  </w:abstractNum>
+  <w:abstractNum w:abstractNumId="4" w15:restartNumberingAfterBreak="0">
     <w:nsid w:val="3B4F0340"/>
     <w:multiLevelType w:val="multilevel"/>
     <w:tmpl w:val="A322BF02"/>
@@ -1248,7 +2353,120 @@
       </w:rPr>
     </w:lvl>
   </w:abstractNum>
-  <w:abstractNum w:abstractNumId="2" w15:restartNumberingAfterBreak="0">
+  <w:abstractNum w:abstractNumId="5" w15:restartNumberingAfterBreak="0">
+    <w:nsid w:val="3FC65926"/>
+    <w:multiLevelType w:val="hybridMultilevel"/>
+    <w:tmpl w:val="665A1C90"/>
+    <w:lvl w:ilvl="0" w:tplc="0C0A0001">
+      <w:start w:val="1"/>
+      <w:numFmt w:val="bullet"/>
+      <w:lvlText w:val=""/>
+      <w:lvlJc w:val="left"/>
+      <w:pPr>
+        <w:ind w:left="720" w:hanging="360"/>
+      </w:pPr>
+      <w:rPr>
+        <w:rFonts w:ascii="Symbol" w:hAnsi="Symbol" w:hint="default"/>
+      </w:rPr>
+    </w:lvl>
+    <w:lvl w:ilvl="1" w:tplc="0C0A0003" w:tentative="1">
+      <w:start w:val="1"/>
+      <w:numFmt w:val="bullet"/>
+      <w:lvlText w:val="o"/>
+      <w:lvlJc w:val="left"/>
+      <w:pPr>
+        <w:ind w:left="1440" w:hanging="360"/>
+      </w:pPr>
+      <w:rPr>
+        <w:rFonts w:ascii="Courier New" w:hAnsi="Courier New" w:cs="Courier New" w:hint="default"/>
+      </w:rPr>
+    </w:lvl>
+    <w:lvl w:ilvl="2" w:tplc="0C0A0005" w:tentative="1">
+      <w:start w:val="1"/>
+      <w:numFmt w:val="bullet"/>
+      <w:lvlText w:val=""/>
+      <w:lvlJc w:val="left"/>
+      <w:pPr>
+        <w:ind w:left="2160" w:hanging="360"/>
+      </w:pPr>
+      <w:rPr>
+        <w:rFonts w:ascii="Wingdings" w:hAnsi="Wingdings" w:hint="default"/>
+      </w:rPr>
+    </w:lvl>
+    <w:lvl w:ilvl="3" w:tplc="0C0A0001" w:tentative="1">
+      <w:start w:val="1"/>
+      <w:numFmt w:val="bullet"/>
+      <w:lvlText w:val=""/>
+      <w:lvlJc w:val="left"/>
+      <w:pPr>
+        <w:ind w:left="2880" w:hanging="360"/>
+      </w:pPr>
+      <w:rPr>
+        <w:rFonts w:ascii="Symbol" w:hAnsi="Symbol" w:hint="default"/>
+      </w:rPr>
+    </w:lvl>
+    <w:lvl w:ilvl="4" w:tplc="0C0A0003" w:tentative="1">
+      <w:start w:val="1"/>
+      <w:numFmt w:val="bullet"/>
+      <w:lvlText w:val="o"/>
+      <w:lvlJc w:val="left"/>
+      <w:pPr>
+        <w:ind w:left="3600" w:hanging="360"/>
+      </w:pPr>
+      <w:rPr>
+        <w:rFonts w:ascii="Courier New" w:hAnsi="Courier New" w:cs="Courier New" w:hint="default"/>
+      </w:rPr>
+    </w:lvl>
+    <w:lvl w:ilvl="5" w:tplc="0C0A0005" w:tentative="1">
+      <w:start w:val="1"/>
+      <w:numFmt w:val="bullet"/>
+      <w:lvlText w:val=""/>
+      <w:lvlJc w:val="left"/>
+      <w:pPr>
+        <w:ind w:left="4320" w:hanging="360"/>
+      </w:pPr>
+      <w:rPr>
+        <w:rFonts w:ascii="Wingdings" w:hAnsi="Wingdings" w:hint="default"/>
+      </w:rPr>
+    </w:lvl>
+    <w:lvl w:ilvl="6" w:tplc="0C0A0001" w:tentative="1">
+      <w:start w:val="1"/>
+      <w:numFmt w:val="bullet"/>
+      <w:lvlText w:val=""/>
+      <w:lvlJc w:val="left"/>
+      <w:pPr>
+        <w:ind w:left="5040" w:hanging="360"/>
+      </w:pPr>
+      <w:rPr>
+        <w:rFonts w:ascii="Symbol" w:hAnsi="Symbol" w:hint="default"/>
+      </w:rPr>
+    </w:lvl>
+    <w:lvl w:ilvl="7" w:tplc="0C0A0003" w:tentative="1">
+      <w:start w:val="1"/>
+      <w:numFmt w:val="bullet"/>
+      <w:lvlText w:val="o"/>
+      <w:lvlJc w:val="left"/>
+      <w:pPr>
+        <w:ind w:left="5760" w:hanging="360"/>
+      </w:pPr>
+      <w:rPr>
+        <w:rFonts w:ascii="Courier New" w:hAnsi="Courier New" w:cs="Courier New" w:hint="default"/>
+      </w:rPr>
+    </w:lvl>
+    <w:lvl w:ilvl="8" w:tplc="0C0A0005" w:tentative="1">
+      <w:start w:val="1"/>
+      <w:numFmt w:val="bullet"/>
+      <w:lvlText w:val=""/>
+      <w:lvlJc w:val="left"/>
+      <w:pPr>
+        <w:ind w:left="6480" w:hanging="360"/>
+      </w:pPr>
+      <w:rPr>
+        <w:rFonts w:ascii="Wingdings" w:hAnsi="Wingdings" w:hint="default"/>
+      </w:rPr>
+    </w:lvl>
+  </w:abstractNum>
+  <w:abstractNum w:abstractNumId="6" w15:restartNumberingAfterBreak="0">
     <w:nsid w:val="44F371AA"/>
     <w:multiLevelType w:val="multilevel"/>
     <w:tmpl w:val="8ED4DD2C"/>
@@ -1365,14 +2583,374 @@
       </w:pPr>
     </w:lvl>
   </w:abstractNum>
+  <w:abstractNum w:abstractNumId="7" w15:restartNumberingAfterBreak="0">
+    <w:nsid w:val="5E0C2BEF"/>
+    <w:multiLevelType w:val="hybridMultilevel"/>
+    <w:tmpl w:val="67D6F330"/>
+    <w:lvl w:ilvl="0" w:tplc="0C0A0001">
+      <w:start w:val="1"/>
+      <w:numFmt w:val="bullet"/>
+      <w:lvlText w:val=""/>
+      <w:lvlJc w:val="left"/>
+      <w:pPr>
+        <w:ind w:left="720" w:hanging="360"/>
+      </w:pPr>
+      <w:rPr>
+        <w:rFonts w:ascii="Symbol" w:hAnsi="Symbol" w:hint="default"/>
+      </w:rPr>
+    </w:lvl>
+    <w:lvl w:ilvl="1" w:tplc="0C0A0003" w:tentative="1">
+      <w:start w:val="1"/>
+      <w:numFmt w:val="bullet"/>
+      <w:lvlText w:val="o"/>
+      <w:lvlJc w:val="left"/>
+      <w:pPr>
+        <w:ind w:left="1440" w:hanging="360"/>
+      </w:pPr>
+      <w:rPr>
+        <w:rFonts w:ascii="Courier New" w:hAnsi="Courier New" w:cs="Courier New" w:hint="default"/>
+      </w:rPr>
+    </w:lvl>
+    <w:lvl w:ilvl="2" w:tplc="0C0A0005" w:tentative="1">
+      <w:start w:val="1"/>
+      <w:numFmt w:val="bullet"/>
+      <w:lvlText w:val=""/>
+      <w:lvlJc w:val="left"/>
+      <w:pPr>
+        <w:ind w:left="2160" w:hanging="360"/>
+      </w:pPr>
+      <w:rPr>
+        <w:rFonts w:ascii="Wingdings" w:hAnsi="Wingdings" w:hint="default"/>
+      </w:rPr>
+    </w:lvl>
+    <w:lvl w:ilvl="3" w:tplc="0C0A0001" w:tentative="1">
+      <w:start w:val="1"/>
+      <w:numFmt w:val="bullet"/>
+      <w:lvlText w:val=""/>
+      <w:lvlJc w:val="left"/>
+      <w:pPr>
+        <w:ind w:left="2880" w:hanging="360"/>
+      </w:pPr>
+      <w:rPr>
+        <w:rFonts w:ascii="Symbol" w:hAnsi="Symbol" w:hint="default"/>
+      </w:rPr>
+    </w:lvl>
+    <w:lvl w:ilvl="4" w:tplc="0C0A0003" w:tentative="1">
+      <w:start w:val="1"/>
+      <w:numFmt w:val="bullet"/>
+      <w:lvlText w:val="o"/>
+      <w:lvlJc w:val="left"/>
+      <w:pPr>
+        <w:ind w:left="3600" w:hanging="360"/>
+      </w:pPr>
+      <w:rPr>
+        <w:rFonts w:ascii="Courier New" w:hAnsi="Courier New" w:cs="Courier New" w:hint="default"/>
+      </w:rPr>
+    </w:lvl>
+    <w:lvl w:ilvl="5" w:tplc="0C0A0005" w:tentative="1">
+      <w:start w:val="1"/>
+      <w:numFmt w:val="bullet"/>
+      <w:lvlText w:val=""/>
+      <w:lvlJc w:val="left"/>
+      <w:pPr>
+        <w:ind w:left="4320" w:hanging="360"/>
+      </w:pPr>
+      <w:rPr>
+        <w:rFonts w:ascii="Wingdings" w:hAnsi="Wingdings" w:hint="default"/>
+      </w:rPr>
+    </w:lvl>
+    <w:lvl w:ilvl="6" w:tplc="0C0A0001" w:tentative="1">
+      <w:start w:val="1"/>
+      <w:numFmt w:val="bullet"/>
+      <w:lvlText w:val=""/>
+      <w:lvlJc w:val="left"/>
+      <w:pPr>
+        <w:ind w:left="5040" w:hanging="360"/>
+      </w:pPr>
+      <w:rPr>
+        <w:rFonts w:ascii="Symbol" w:hAnsi="Symbol" w:hint="default"/>
+      </w:rPr>
+    </w:lvl>
+    <w:lvl w:ilvl="7" w:tplc="0C0A0003" w:tentative="1">
+      <w:start w:val="1"/>
+      <w:numFmt w:val="bullet"/>
+      <w:lvlText w:val="o"/>
+      <w:lvlJc w:val="left"/>
+      <w:pPr>
+        <w:ind w:left="5760" w:hanging="360"/>
+      </w:pPr>
+      <w:rPr>
+        <w:rFonts w:ascii="Courier New" w:hAnsi="Courier New" w:cs="Courier New" w:hint="default"/>
+      </w:rPr>
+    </w:lvl>
+    <w:lvl w:ilvl="8" w:tplc="0C0A0005" w:tentative="1">
+      <w:start w:val="1"/>
+      <w:numFmt w:val="bullet"/>
+      <w:lvlText w:val=""/>
+      <w:lvlJc w:val="left"/>
+      <w:pPr>
+        <w:ind w:left="6480" w:hanging="360"/>
+      </w:pPr>
+      <w:rPr>
+        <w:rFonts w:ascii="Wingdings" w:hAnsi="Wingdings" w:hint="default"/>
+      </w:rPr>
+    </w:lvl>
+  </w:abstractNum>
+  <w:abstractNum w:abstractNumId="8" w15:restartNumberingAfterBreak="0">
+    <w:nsid w:val="667E2D8C"/>
+    <w:multiLevelType w:val="hybridMultilevel"/>
+    <w:tmpl w:val="2F121B4E"/>
+    <w:lvl w:ilvl="0" w:tplc="0C0A0001">
+      <w:start w:val="1"/>
+      <w:numFmt w:val="bullet"/>
+      <w:lvlText w:val=""/>
+      <w:lvlJc w:val="left"/>
+      <w:pPr>
+        <w:ind w:left="720" w:hanging="360"/>
+      </w:pPr>
+      <w:rPr>
+        <w:rFonts w:ascii="Symbol" w:hAnsi="Symbol" w:hint="default"/>
+      </w:rPr>
+    </w:lvl>
+    <w:lvl w:ilvl="1" w:tplc="0C0A0003" w:tentative="1">
+      <w:start w:val="1"/>
+      <w:numFmt w:val="bullet"/>
+      <w:lvlText w:val="o"/>
+      <w:lvlJc w:val="left"/>
+      <w:pPr>
+        <w:ind w:left="1440" w:hanging="360"/>
+      </w:pPr>
+      <w:rPr>
+        <w:rFonts w:ascii="Courier New" w:hAnsi="Courier New" w:cs="Courier New" w:hint="default"/>
+      </w:rPr>
+    </w:lvl>
+    <w:lvl w:ilvl="2" w:tplc="0C0A0005" w:tentative="1">
+      <w:start w:val="1"/>
+      <w:numFmt w:val="bullet"/>
+      <w:lvlText w:val=""/>
+      <w:lvlJc w:val="left"/>
+      <w:pPr>
+        <w:ind w:left="2160" w:hanging="360"/>
+      </w:pPr>
+      <w:rPr>
+        <w:rFonts w:ascii="Wingdings" w:hAnsi="Wingdings" w:hint="default"/>
+      </w:rPr>
+    </w:lvl>
+    <w:lvl w:ilvl="3" w:tplc="0C0A0001" w:tentative="1">
+      <w:start w:val="1"/>
+      <w:numFmt w:val="bullet"/>
+      <w:lvlText w:val=""/>
+      <w:lvlJc w:val="left"/>
+      <w:pPr>
+        <w:ind w:left="2880" w:hanging="360"/>
+      </w:pPr>
+      <w:rPr>
+        <w:rFonts w:ascii="Symbol" w:hAnsi="Symbol" w:hint="default"/>
+      </w:rPr>
+    </w:lvl>
+    <w:lvl w:ilvl="4" w:tplc="0C0A0003" w:tentative="1">
+      <w:start w:val="1"/>
+      <w:numFmt w:val="bullet"/>
+      <w:lvlText w:val="o"/>
+      <w:lvlJc w:val="left"/>
+      <w:pPr>
+        <w:ind w:left="3600" w:hanging="360"/>
+      </w:pPr>
+      <w:rPr>
+        <w:rFonts w:ascii="Courier New" w:hAnsi="Courier New" w:cs="Courier New" w:hint="default"/>
+      </w:rPr>
+    </w:lvl>
+    <w:lvl w:ilvl="5" w:tplc="0C0A0005" w:tentative="1">
+      <w:start w:val="1"/>
+      <w:numFmt w:val="bullet"/>
+      <w:lvlText w:val=""/>
+      <w:lvlJc w:val="left"/>
+      <w:pPr>
+        <w:ind w:left="4320" w:hanging="360"/>
+      </w:pPr>
+      <w:rPr>
+        <w:rFonts w:ascii="Wingdings" w:hAnsi="Wingdings" w:hint="default"/>
+      </w:rPr>
+    </w:lvl>
+    <w:lvl w:ilvl="6" w:tplc="0C0A0001" w:tentative="1">
+      <w:start w:val="1"/>
+      <w:numFmt w:val="bullet"/>
+      <w:lvlText w:val=""/>
+      <w:lvlJc w:val="left"/>
+      <w:pPr>
+        <w:ind w:left="5040" w:hanging="360"/>
+      </w:pPr>
+      <w:rPr>
+        <w:rFonts w:ascii="Symbol" w:hAnsi="Symbol" w:hint="default"/>
+      </w:rPr>
+    </w:lvl>
+    <w:lvl w:ilvl="7" w:tplc="0C0A0003" w:tentative="1">
+      <w:start w:val="1"/>
+      <w:numFmt w:val="bullet"/>
+      <w:lvlText w:val="o"/>
+      <w:lvlJc w:val="left"/>
+      <w:pPr>
+        <w:ind w:left="5760" w:hanging="360"/>
+      </w:pPr>
+      <w:rPr>
+        <w:rFonts w:ascii="Courier New" w:hAnsi="Courier New" w:cs="Courier New" w:hint="default"/>
+      </w:rPr>
+    </w:lvl>
+    <w:lvl w:ilvl="8" w:tplc="0C0A0005" w:tentative="1">
+      <w:start w:val="1"/>
+      <w:numFmt w:val="bullet"/>
+      <w:lvlText w:val=""/>
+      <w:lvlJc w:val="left"/>
+      <w:pPr>
+        <w:ind w:left="6480" w:hanging="360"/>
+      </w:pPr>
+      <w:rPr>
+        <w:rFonts w:ascii="Wingdings" w:hAnsi="Wingdings" w:hint="default"/>
+      </w:rPr>
+    </w:lvl>
+  </w:abstractNum>
+  <w:abstractNum w:abstractNumId="9" w15:restartNumberingAfterBreak="0">
+    <w:nsid w:val="6EFC194A"/>
+    <w:multiLevelType w:val="hybridMultilevel"/>
+    <w:tmpl w:val="5D005CFE"/>
+    <w:lvl w:ilvl="0" w:tplc="0C0A0001">
+      <w:start w:val="1"/>
+      <w:numFmt w:val="bullet"/>
+      <w:lvlText w:val=""/>
+      <w:lvlJc w:val="left"/>
+      <w:pPr>
+        <w:ind w:left="720" w:hanging="360"/>
+      </w:pPr>
+      <w:rPr>
+        <w:rFonts w:ascii="Symbol" w:hAnsi="Symbol" w:hint="default"/>
+      </w:rPr>
+    </w:lvl>
+    <w:lvl w:ilvl="1" w:tplc="0C0A0003">
+      <w:start w:val="1"/>
+      <w:numFmt w:val="bullet"/>
+      <w:lvlText w:val="o"/>
+      <w:lvlJc w:val="left"/>
+      <w:pPr>
+        <w:ind w:left="1440" w:hanging="360"/>
+      </w:pPr>
+      <w:rPr>
+        <w:rFonts w:ascii="Courier New" w:hAnsi="Courier New" w:cs="Courier New" w:hint="default"/>
+      </w:rPr>
+    </w:lvl>
+    <w:lvl w:ilvl="2" w:tplc="0C0A0005" w:tentative="1">
+      <w:start w:val="1"/>
+      <w:numFmt w:val="bullet"/>
+      <w:lvlText w:val=""/>
+      <w:lvlJc w:val="left"/>
+      <w:pPr>
+        <w:ind w:left="2160" w:hanging="360"/>
+      </w:pPr>
+      <w:rPr>
+        <w:rFonts w:ascii="Wingdings" w:hAnsi="Wingdings" w:hint="default"/>
+      </w:rPr>
+    </w:lvl>
+    <w:lvl w:ilvl="3" w:tplc="0C0A0001" w:tentative="1">
+      <w:start w:val="1"/>
+      <w:numFmt w:val="bullet"/>
+      <w:lvlText w:val=""/>
+      <w:lvlJc w:val="left"/>
+      <w:pPr>
+        <w:ind w:left="2880" w:hanging="360"/>
+      </w:pPr>
+      <w:rPr>
+        <w:rFonts w:ascii="Symbol" w:hAnsi="Symbol" w:hint="default"/>
+      </w:rPr>
+    </w:lvl>
+    <w:lvl w:ilvl="4" w:tplc="0C0A0003" w:tentative="1">
+      <w:start w:val="1"/>
+      <w:numFmt w:val="bullet"/>
+      <w:lvlText w:val="o"/>
+      <w:lvlJc w:val="left"/>
+      <w:pPr>
+        <w:ind w:left="3600" w:hanging="360"/>
+      </w:pPr>
+      <w:rPr>
+        <w:rFonts w:ascii="Courier New" w:hAnsi="Courier New" w:cs="Courier New" w:hint="default"/>
+      </w:rPr>
+    </w:lvl>
+    <w:lvl w:ilvl="5" w:tplc="0C0A0005" w:tentative="1">
+      <w:start w:val="1"/>
+      <w:numFmt w:val="bullet"/>
+      <w:lvlText w:val=""/>
+      <w:lvlJc w:val="left"/>
+      <w:pPr>
+        <w:ind w:left="4320" w:hanging="360"/>
+      </w:pPr>
+      <w:rPr>
+        <w:rFonts w:ascii="Wingdings" w:hAnsi="Wingdings" w:hint="default"/>
+      </w:rPr>
+    </w:lvl>
+    <w:lvl w:ilvl="6" w:tplc="0C0A0001" w:tentative="1">
+      <w:start w:val="1"/>
+      <w:numFmt w:val="bullet"/>
+      <w:lvlText w:val=""/>
+      <w:lvlJc w:val="left"/>
+      <w:pPr>
+        <w:ind w:left="5040" w:hanging="360"/>
+      </w:pPr>
+      <w:rPr>
+        <w:rFonts w:ascii="Symbol" w:hAnsi="Symbol" w:hint="default"/>
+      </w:rPr>
+    </w:lvl>
+    <w:lvl w:ilvl="7" w:tplc="0C0A0003" w:tentative="1">
+      <w:start w:val="1"/>
+      <w:numFmt w:val="bullet"/>
+      <w:lvlText w:val="o"/>
+      <w:lvlJc w:val="left"/>
+      <w:pPr>
+        <w:ind w:left="5760" w:hanging="360"/>
+      </w:pPr>
+      <w:rPr>
+        <w:rFonts w:ascii="Courier New" w:hAnsi="Courier New" w:cs="Courier New" w:hint="default"/>
+      </w:rPr>
+    </w:lvl>
+    <w:lvl w:ilvl="8" w:tplc="0C0A0005" w:tentative="1">
+      <w:start w:val="1"/>
+      <w:numFmt w:val="bullet"/>
+      <w:lvlText w:val=""/>
+      <w:lvlJc w:val="left"/>
+      <w:pPr>
+        <w:ind w:left="6480" w:hanging="360"/>
+      </w:pPr>
+      <w:rPr>
+        <w:rFonts w:ascii="Wingdings" w:hAnsi="Wingdings" w:hint="default"/>
+      </w:rPr>
+    </w:lvl>
+  </w:abstractNum>
   <w:num w:numId="1">
+    <w:abstractNumId w:val="1"/>
+  </w:num>
+  <w:num w:numId="2">
+    <w:abstractNumId w:val="6"/>
+  </w:num>
+  <w:num w:numId="3">
+    <w:abstractNumId w:val="4"/>
+  </w:num>
+  <w:num w:numId="4">
     <w:abstractNumId w:val="0"/>
   </w:num>
-  <w:num w:numId="2">
+  <w:num w:numId="5">
+    <w:abstractNumId w:val="7"/>
+  </w:num>
+  <w:num w:numId="6">
+    <w:abstractNumId w:val="8"/>
+  </w:num>
+  <w:num w:numId="7">
+    <w:abstractNumId w:val="3"/>
+  </w:num>
+  <w:num w:numId="8">
+    <w:abstractNumId w:val="9"/>
+  </w:num>
+  <w:num w:numId="9">
+    <w:abstractNumId w:val="5"/>
+  </w:num>
+  <w:num w:numId="10">
     <w:abstractNumId w:val="2"/>
-  </w:num>
-  <w:num w:numId="3">
-    <w:abstractNumId w:val="1"/>
   </w:num>
 </w:numbering>
 </file>
@@ -1382,15 +2960,15 @@
   <w:docDefaults>
     <w:rPrDefault>
       <w:rPr>
-        <w:rFonts w:asciiTheme="minorHAnsi" w:eastAsiaTheme="minorHAnsi" w:hAnsiTheme="minorHAnsi" w:cstheme="minorBidi"/>
-        <w:sz w:val="22"/>
-        <w:szCs w:val="22"/>
+        <w:rFonts w:asciiTheme="minorHAnsi" w:eastAsiaTheme="minorEastAsia" w:hAnsiTheme="minorHAnsi" w:cstheme="minorBidi"/>
+        <w:sz w:val="21"/>
+        <w:szCs w:val="21"/>
         <w:lang w:val="es-ES" w:eastAsia="en-US" w:bidi="ar-SA"/>
       </w:rPr>
     </w:rPrDefault>
     <w:pPrDefault>
       <w:pPr>
-        <w:spacing w:after="160" w:line="259" w:lineRule="auto"/>
+        <w:spacing w:after="200" w:line="288" w:lineRule="auto"/>
       </w:pPr>
     </w:pPrDefault>
   </w:docDefaults>
@@ -1770,6 +3348,217 @@
   <w:style w:type="paragraph" w:default="1" w:styleId="Normal">
     <w:name w:val="Normal"/>
     <w:qFormat/>
+    <w:rsid w:val="007B533F"/>
+  </w:style>
+  <w:style w:type="paragraph" w:styleId="Ttulo1">
+    <w:name w:val="heading 1"/>
+    <w:basedOn w:val="Normal"/>
+    <w:next w:val="Normal"/>
+    <w:link w:val="Ttulo1Car"/>
+    <w:uiPriority w:val="9"/>
+    <w:qFormat/>
+    <w:rsid w:val="007B533F"/>
+    <w:pPr>
+      <w:keepNext/>
+      <w:keepLines/>
+      <w:spacing w:before="360" w:after="40" w:line="240" w:lineRule="auto"/>
+      <w:outlineLvl w:val="0"/>
+    </w:pPr>
+    <w:rPr>
+      <w:rFonts w:asciiTheme="majorHAnsi" w:eastAsiaTheme="majorEastAsia" w:hAnsiTheme="majorHAnsi" w:cstheme="majorBidi"/>
+      <w:color w:val="538135" w:themeColor="accent6" w:themeShade="BF"/>
+      <w:sz w:val="40"/>
+      <w:szCs w:val="40"/>
+    </w:rPr>
+  </w:style>
+  <w:style w:type="paragraph" w:styleId="Ttulo2">
+    <w:name w:val="heading 2"/>
+    <w:basedOn w:val="Normal"/>
+    <w:next w:val="Normal"/>
+    <w:link w:val="Ttulo2Car"/>
+    <w:uiPriority w:val="9"/>
+    <w:unhideWhenUsed/>
+    <w:qFormat/>
+    <w:rsid w:val="007B533F"/>
+    <w:pPr>
+      <w:keepNext/>
+      <w:keepLines/>
+      <w:spacing w:before="80" w:after="0" w:line="240" w:lineRule="auto"/>
+      <w:outlineLvl w:val="1"/>
+    </w:pPr>
+    <w:rPr>
+      <w:rFonts w:asciiTheme="majorHAnsi" w:eastAsiaTheme="majorEastAsia" w:hAnsiTheme="majorHAnsi" w:cstheme="majorBidi"/>
+      <w:color w:val="538135" w:themeColor="accent6" w:themeShade="BF"/>
+      <w:sz w:val="28"/>
+      <w:szCs w:val="28"/>
+    </w:rPr>
+  </w:style>
+  <w:style w:type="paragraph" w:styleId="Ttulo3">
+    <w:name w:val="heading 3"/>
+    <w:basedOn w:val="Normal"/>
+    <w:next w:val="Normal"/>
+    <w:link w:val="Ttulo3Car"/>
+    <w:uiPriority w:val="9"/>
+    <w:semiHidden/>
+    <w:unhideWhenUsed/>
+    <w:qFormat/>
+    <w:rsid w:val="007B533F"/>
+    <w:pPr>
+      <w:keepNext/>
+      <w:keepLines/>
+      <w:spacing w:before="80" w:after="0" w:line="240" w:lineRule="auto"/>
+      <w:outlineLvl w:val="2"/>
+    </w:pPr>
+    <w:rPr>
+      <w:rFonts w:asciiTheme="majorHAnsi" w:eastAsiaTheme="majorEastAsia" w:hAnsiTheme="majorHAnsi" w:cstheme="majorBidi"/>
+      <w:color w:val="538135" w:themeColor="accent6" w:themeShade="BF"/>
+      <w:sz w:val="24"/>
+      <w:szCs w:val="24"/>
+    </w:rPr>
+  </w:style>
+  <w:style w:type="paragraph" w:styleId="Ttulo4">
+    <w:name w:val="heading 4"/>
+    <w:basedOn w:val="Normal"/>
+    <w:next w:val="Normal"/>
+    <w:link w:val="Ttulo4Car"/>
+    <w:uiPriority w:val="9"/>
+    <w:semiHidden/>
+    <w:unhideWhenUsed/>
+    <w:qFormat/>
+    <w:rsid w:val="007B533F"/>
+    <w:pPr>
+      <w:keepNext/>
+      <w:keepLines/>
+      <w:spacing w:before="80" w:after="0"/>
+      <w:outlineLvl w:val="3"/>
+    </w:pPr>
+    <w:rPr>
+      <w:rFonts w:asciiTheme="majorHAnsi" w:eastAsiaTheme="majorEastAsia" w:hAnsiTheme="majorHAnsi" w:cstheme="majorBidi"/>
+      <w:color w:val="70AD47" w:themeColor="accent6"/>
+      <w:sz w:val="22"/>
+      <w:szCs w:val="22"/>
+    </w:rPr>
+  </w:style>
+  <w:style w:type="paragraph" w:styleId="Ttulo5">
+    <w:name w:val="heading 5"/>
+    <w:basedOn w:val="Normal"/>
+    <w:next w:val="Normal"/>
+    <w:link w:val="Ttulo5Car"/>
+    <w:uiPriority w:val="9"/>
+    <w:semiHidden/>
+    <w:unhideWhenUsed/>
+    <w:qFormat/>
+    <w:rsid w:val="007B533F"/>
+    <w:pPr>
+      <w:keepNext/>
+      <w:keepLines/>
+      <w:spacing w:before="40" w:after="0"/>
+      <w:outlineLvl w:val="4"/>
+    </w:pPr>
+    <w:rPr>
+      <w:rFonts w:asciiTheme="majorHAnsi" w:eastAsiaTheme="majorEastAsia" w:hAnsiTheme="majorHAnsi" w:cstheme="majorBidi"/>
+      <w:i/>
+      <w:iCs/>
+      <w:color w:val="70AD47" w:themeColor="accent6"/>
+      <w:sz w:val="22"/>
+      <w:szCs w:val="22"/>
+    </w:rPr>
+  </w:style>
+  <w:style w:type="paragraph" w:styleId="Ttulo6">
+    <w:name w:val="heading 6"/>
+    <w:basedOn w:val="Normal"/>
+    <w:next w:val="Normal"/>
+    <w:link w:val="Ttulo6Car"/>
+    <w:uiPriority w:val="9"/>
+    <w:semiHidden/>
+    <w:unhideWhenUsed/>
+    <w:qFormat/>
+    <w:rsid w:val="007B533F"/>
+    <w:pPr>
+      <w:keepNext/>
+      <w:keepLines/>
+      <w:spacing w:before="40" w:after="0"/>
+      <w:outlineLvl w:val="5"/>
+    </w:pPr>
+    <w:rPr>
+      <w:rFonts w:asciiTheme="majorHAnsi" w:eastAsiaTheme="majorEastAsia" w:hAnsiTheme="majorHAnsi" w:cstheme="majorBidi"/>
+      <w:color w:val="70AD47" w:themeColor="accent6"/>
+    </w:rPr>
+  </w:style>
+  <w:style w:type="paragraph" w:styleId="Ttulo7">
+    <w:name w:val="heading 7"/>
+    <w:basedOn w:val="Normal"/>
+    <w:next w:val="Normal"/>
+    <w:link w:val="Ttulo7Car"/>
+    <w:uiPriority w:val="9"/>
+    <w:semiHidden/>
+    <w:unhideWhenUsed/>
+    <w:qFormat/>
+    <w:rsid w:val="007B533F"/>
+    <w:pPr>
+      <w:keepNext/>
+      <w:keepLines/>
+      <w:spacing w:before="40" w:after="0"/>
+      <w:outlineLvl w:val="6"/>
+    </w:pPr>
+    <w:rPr>
+      <w:rFonts w:asciiTheme="majorHAnsi" w:eastAsiaTheme="majorEastAsia" w:hAnsiTheme="majorHAnsi" w:cstheme="majorBidi"/>
+      <w:b/>
+      <w:bCs/>
+      <w:color w:val="70AD47" w:themeColor="accent6"/>
+    </w:rPr>
+  </w:style>
+  <w:style w:type="paragraph" w:styleId="Ttulo8">
+    <w:name w:val="heading 8"/>
+    <w:basedOn w:val="Normal"/>
+    <w:next w:val="Normal"/>
+    <w:link w:val="Ttulo8Car"/>
+    <w:uiPriority w:val="9"/>
+    <w:semiHidden/>
+    <w:unhideWhenUsed/>
+    <w:qFormat/>
+    <w:rsid w:val="007B533F"/>
+    <w:pPr>
+      <w:keepNext/>
+      <w:keepLines/>
+      <w:spacing w:before="40" w:after="0"/>
+      <w:outlineLvl w:val="7"/>
+    </w:pPr>
+    <w:rPr>
+      <w:rFonts w:asciiTheme="majorHAnsi" w:eastAsiaTheme="majorEastAsia" w:hAnsiTheme="majorHAnsi" w:cstheme="majorBidi"/>
+      <w:b/>
+      <w:bCs/>
+      <w:i/>
+      <w:iCs/>
+      <w:color w:val="70AD47" w:themeColor="accent6"/>
+      <w:sz w:val="20"/>
+      <w:szCs w:val="20"/>
+    </w:rPr>
+  </w:style>
+  <w:style w:type="paragraph" w:styleId="Ttulo9">
+    <w:name w:val="heading 9"/>
+    <w:basedOn w:val="Normal"/>
+    <w:next w:val="Normal"/>
+    <w:link w:val="Ttulo9Car"/>
+    <w:uiPriority w:val="9"/>
+    <w:semiHidden/>
+    <w:unhideWhenUsed/>
+    <w:qFormat/>
+    <w:rsid w:val="007B533F"/>
+    <w:pPr>
+      <w:keepNext/>
+      <w:keepLines/>
+      <w:spacing w:before="40" w:after="0"/>
+      <w:outlineLvl w:val="8"/>
+    </w:pPr>
+    <w:rPr>
+      <w:rFonts w:asciiTheme="majorHAnsi" w:eastAsiaTheme="majorEastAsia" w:hAnsiTheme="majorHAnsi" w:cstheme="majorBidi"/>
+      <w:i/>
+      <w:iCs/>
+      <w:color w:val="70AD47" w:themeColor="accent6"/>
+      <w:sz w:val="20"/>
+      <w:szCs w:val="20"/>
+    </w:rPr>
   </w:style>
   <w:style w:type="character" w:default="1" w:styleId="Fuentedeprrafopredeter">
     <w:name w:val="Default Paragraph Font"/>
@@ -1814,7 +3603,7 @@
     <w:basedOn w:val="Fuentedeprrafopredeter"/>
     <w:uiPriority w:val="22"/>
     <w:qFormat/>
-    <w:rsid w:val="008C0CF5"/>
+    <w:rsid w:val="007B533F"/>
     <w:rPr>
       <w:b/>
       <w:bCs/>
@@ -1849,6 +3638,387 @@
       <w:szCs w:val="24"/>
       <w:lang w:eastAsia="es-ES"/>
     </w:rPr>
+  </w:style>
+  <w:style w:type="character" w:customStyle="1" w:styleId="Ttulo1Car">
+    <w:name w:val="Título 1 Car"/>
+    <w:basedOn w:val="Fuentedeprrafopredeter"/>
+    <w:link w:val="Ttulo1"/>
+    <w:uiPriority w:val="9"/>
+    <w:rsid w:val="007B533F"/>
+    <w:rPr>
+      <w:rFonts w:asciiTheme="majorHAnsi" w:eastAsiaTheme="majorEastAsia" w:hAnsiTheme="majorHAnsi" w:cstheme="majorBidi"/>
+      <w:color w:val="538135" w:themeColor="accent6" w:themeShade="BF"/>
+      <w:sz w:val="40"/>
+      <w:szCs w:val="40"/>
+    </w:rPr>
+  </w:style>
+  <w:style w:type="character" w:customStyle="1" w:styleId="Ttulo2Car">
+    <w:name w:val="Título 2 Car"/>
+    <w:basedOn w:val="Fuentedeprrafopredeter"/>
+    <w:link w:val="Ttulo2"/>
+    <w:uiPriority w:val="9"/>
+    <w:rsid w:val="007B533F"/>
+    <w:rPr>
+      <w:rFonts w:asciiTheme="majorHAnsi" w:eastAsiaTheme="majorEastAsia" w:hAnsiTheme="majorHAnsi" w:cstheme="majorBidi"/>
+      <w:color w:val="538135" w:themeColor="accent6" w:themeShade="BF"/>
+      <w:sz w:val="28"/>
+      <w:szCs w:val="28"/>
+    </w:rPr>
+  </w:style>
+  <w:style w:type="character" w:customStyle="1" w:styleId="Ttulo3Car">
+    <w:name w:val="Título 3 Car"/>
+    <w:basedOn w:val="Fuentedeprrafopredeter"/>
+    <w:link w:val="Ttulo3"/>
+    <w:uiPriority w:val="9"/>
+    <w:semiHidden/>
+    <w:rsid w:val="007B533F"/>
+    <w:rPr>
+      <w:rFonts w:asciiTheme="majorHAnsi" w:eastAsiaTheme="majorEastAsia" w:hAnsiTheme="majorHAnsi" w:cstheme="majorBidi"/>
+      <w:color w:val="538135" w:themeColor="accent6" w:themeShade="BF"/>
+      <w:sz w:val="24"/>
+      <w:szCs w:val="24"/>
+    </w:rPr>
+  </w:style>
+  <w:style w:type="character" w:customStyle="1" w:styleId="Ttulo4Car">
+    <w:name w:val="Título 4 Car"/>
+    <w:basedOn w:val="Fuentedeprrafopredeter"/>
+    <w:link w:val="Ttulo4"/>
+    <w:uiPriority w:val="9"/>
+    <w:semiHidden/>
+    <w:rsid w:val="007B533F"/>
+    <w:rPr>
+      <w:rFonts w:asciiTheme="majorHAnsi" w:eastAsiaTheme="majorEastAsia" w:hAnsiTheme="majorHAnsi" w:cstheme="majorBidi"/>
+      <w:color w:val="70AD47" w:themeColor="accent6"/>
+      <w:sz w:val="22"/>
+      <w:szCs w:val="22"/>
+    </w:rPr>
+  </w:style>
+  <w:style w:type="character" w:customStyle="1" w:styleId="Ttulo5Car">
+    <w:name w:val="Título 5 Car"/>
+    <w:basedOn w:val="Fuentedeprrafopredeter"/>
+    <w:link w:val="Ttulo5"/>
+    <w:uiPriority w:val="9"/>
+    <w:semiHidden/>
+    <w:rsid w:val="007B533F"/>
+    <w:rPr>
+      <w:rFonts w:asciiTheme="majorHAnsi" w:eastAsiaTheme="majorEastAsia" w:hAnsiTheme="majorHAnsi" w:cstheme="majorBidi"/>
+      <w:i/>
+      <w:iCs/>
+      <w:color w:val="70AD47" w:themeColor="accent6"/>
+      <w:sz w:val="22"/>
+      <w:szCs w:val="22"/>
+    </w:rPr>
+  </w:style>
+  <w:style w:type="character" w:customStyle="1" w:styleId="Ttulo6Car">
+    <w:name w:val="Título 6 Car"/>
+    <w:basedOn w:val="Fuentedeprrafopredeter"/>
+    <w:link w:val="Ttulo6"/>
+    <w:uiPriority w:val="9"/>
+    <w:semiHidden/>
+    <w:rsid w:val="007B533F"/>
+    <w:rPr>
+      <w:rFonts w:asciiTheme="majorHAnsi" w:eastAsiaTheme="majorEastAsia" w:hAnsiTheme="majorHAnsi" w:cstheme="majorBidi"/>
+      <w:color w:val="70AD47" w:themeColor="accent6"/>
+    </w:rPr>
+  </w:style>
+  <w:style w:type="character" w:customStyle="1" w:styleId="Ttulo7Car">
+    <w:name w:val="Título 7 Car"/>
+    <w:basedOn w:val="Fuentedeprrafopredeter"/>
+    <w:link w:val="Ttulo7"/>
+    <w:uiPriority w:val="9"/>
+    <w:semiHidden/>
+    <w:rsid w:val="007B533F"/>
+    <w:rPr>
+      <w:rFonts w:asciiTheme="majorHAnsi" w:eastAsiaTheme="majorEastAsia" w:hAnsiTheme="majorHAnsi" w:cstheme="majorBidi"/>
+      <w:b/>
+      <w:bCs/>
+      <w:color w:val="70AD47" w:themeColor="accent6"/>
+    </w:rPr>
+  </w:style>
+  <w:style w:type="character" w:customStyle="1" w:styleId="Ttulo8Car">
+    <w:name w:val="Título 8 Car"/>
+    <w:basedOn w:val="Fuentedeprrafopredeter"/>
+    <w:link w:val="Ttulo8"/>
+    <w:uiPriority w:val="9"/>
+    <w:semiHidden/>
+    <w:rsid w:val="007B533F"/>
+    <w:rPr>
+      <w:rFonts w:asciiTheme="majorHAnsi" w:eastAsiaTheme="majorEastAsia" w:hAnsiTheme="majorHAnsi" w:cstheme="majorBidi"/>
+      <w:b/>
+      <w:bCs/>
+      <w:i/>
+      <w:iCs/>
+      <w:color w:val="70AD47" w:themeColor="accent6"/>
+      <w:sz w:val="20"/>
+      <w:szCs w:val="20"/>
+    </w:rPr>
+  </w:style>
+  <w:style w:type="character" w:customStyle="1" w:styleId="Ttulo9Car">
+    <w:name w:val="Título 9 Car"/>
+    <w:basedOn w:val="Fuentedeprrafopredeter"/>
+    <w:link w:val="Ttulo9"/>
+    <w:uiPriority w:val="9"/>
+    <w:semiHidden/>
+    <w:rsid w:val="007B533F"/>
+    <w:rPr>
+      <w:rFonts w:asciiTheme="majorHAnsi" w:eastAsiaTheme="majorEastAsia" w:hAnsiTheme="majorHAnsi" w:cstheme="majorBidi"/>
+      <w:i/>
+      <w:iCs/>
+      <w:color w:val="70AD47" w:themeColor="accent6"/>
+      <w:sz w:val="20"/>
+      <w:szCs w:val="20"/>
+    </w:rPr>
+  </w:style>
+  <w:style w:type="paragraph" w:styleId="Descripcin">
+    <w:name w:val="caption"/>
+    <w:basedOn w:val="Normal"/>
+    <w:next w:val="Normal"/>
+    <w:uiPriority w:val="35"/>
+    <w:semiHidden/>
+    <w:unhideWhenUsed/>
+    <w:qFormat/>
+    <w:rsid w:val="007B533F"/>
+    <w:pPr>
+      <w:spacing w:line="240" w:lineRule="auto"/>
+    </w:pPr>
+    <w:rPr>
+      <w:b/>
+      <w:bCs/>
+      <w:smallCaps/>
+      <w:color w:val="595959" w:themeColor="text1" w:themeTint="A6"/>
+    </w:rPr>
+  </w:style>
+  <w:style w:type="paragraph" w:styleId="Ttulo">
+    <w:name w:val="Title"/>
+    <w:basedOn w:val="Normal"/>
+    <w:next w:val="Normal"/>
+    <w:link w:val="TtuloCar"/>
+    <w:uiPriority w:val="10"/>
+    <w:qFormat/>
+    <w:rsid w:val="007B533F"/>
+    <w:pPr>
+      <w:spacing w:after="0" w:line="240" w:lineRule="auto"/>
+      <w:contextualSpacing/>
+    </w:pPr>
+    <w:rPr>
+      <w:rFonts w:asciiTheme="majorHAnsi" w:eastAsiaTheme="majorEastAsia" w:hAnsiTheme="majorHAnsi" w:cstheme="majorBidi"/>
+      <w:color w:val="262626" w:themeColor="text1" w:themeTint="D9"/>
+      <w:spacing w:val="-15"/>
+      <w:sz w:val="96"/>
+      <w:szCs w:val="96"/>
+    </w:rPr>
+  </w:style>
+  <w:style w:type="character" w:customStyle="1" w:styleId="TtuloCar">
+    <w:name w:val="Título Car"/>
+    <w:basedOn w:val="Fuentedeprrafopredeter"/>
+    <w:link w:val="Ttulo"/>
+    <w:uiPriority w:val="10"/>
+    <w:rsid w:val="007B533F"/>
+    <w:rPr>
+      <w:rFonts w:asciiTheme="majorHAnsi" w:eastAsiaTheme="majorEastAsia" w:hAnsiTheme="majorHAnsi" w:cstheme="majorBidi"/>
+      <w:color w:val="262626" w:themeColor="text1" w:themeTint="D9"/>
+      <w:spacing w:val="-15"/>
+      <w:sz w:val="96"/>
+      <w:szCs w:val="96"/>
+    </w:rPr>
+  </w:style>
+  <w:style w:type="paragraph" w:styleId="Subttulo">
+    <w:name w:val="Subtitle"/>
+    <w:basedOn w:val="Normal"/>
+    <w:next w:val="Normal"/>
+    <w:link w:val="SubttuloCar"/>
+    <w:uiPriority w:val="11"/>
+    <w:qFormat/>
+    <w:rsid w:val="007B533F"/>
+    <w:pPr>
+      <w:numPr>
+        <w:ilvl w:val="1"/>
+      </w:numPr>
+      <w:spacing w:line="240" w:lineRule="auto"/>
+    </w:pPr>
+    <w:rPr>
+      <w:rFonts w:asciiTheme="majorHAnsi" w:eastAsiaTheme="majorEastAsia" w:hAnsiTheme="majorHAnsi" w:cstheme="majorBidi"/>
+      <w:sz w:val="30"/>
+      <w:szCs w:val="30"/>
+    </w:rPr>
+  </w:style>
+  <w:style w:type="character" w:customStyle="1" w:styleId="SubttuloCar">
+    <w:name w:val="Subtítulo Car"/>
+    <w:basedOn w:val="Fuentedeprrafopredeter"/>
+    <w:link w:val="Subttulo"/>
+    <w:uiPriority w:val="11"/>
+    <w:rsid w:val="007B533F"/>
+    <w:rPr>
+      <w:rFonts w:asciiTheme="majorHAnsi" w:eastAsiaTheme="majorEastAsia" w:hAnsiTheme="majorHAnsi" w:cstheme="majorBidi"/>
+      <w:sz w:val="30"/>
+      <w:szCs w:val="30"/>
+    </w:rPr>
+  </w:style>
+  <w:style w:type="character" w:styleId="nfasis">
+    <w:name w:val="Emphasis"/>
+    <w:basedOn w:val="Fuentedeprrafopredeter"/>
+    <w:uiPriority w:val="20"/>
+    <w:qFormat/>
+    <w:rsid w:val="007B533F"/>
+    <w:rPr>
+      <w:i/>
+      <w:iCs/>
+      <w:color w:val="70AD47" w:themeColor="accent6"/>
+    </w:rPr>
+  </w:style>
+  <w:style w:type="paragraph" w:styleId="Sinespaciado">
+    <w:name w:val="No Spacing"/>
+    <w:uiPriority w:val="1"/>
+    <w:qFormat/>
+    <w:rsid w:val="007B533F"/>
+    <w:pPr>
+      <w:spacing w:after="0" w:line="240" w:lineRule="auto"/>
+    </w:pPr>
+  </w:style>
+  <w:style w:type="paragraph" w:styleId="Cita">
+    <w:name w:val="Quote"/>
+    <w:basedOn w:val="Normal"/>
+    <w:next w:val="Normal"/>
+    <w:link w:val="CitaCar"/>
+    <w:uiPriority w:val="29"/>
+    <w:qFormat/>
+    <w:rsid w:val="007B533F"/>
+    <w:pPr>
+      <w:spacing w:before="160"/>
+      <w:ind w:left="720" w:right="720"/>
+      <w:jc w:val="center"/>
+    </w:pPr>
+    <w:rPr>
+      <w:i/>
+      <w:iCs/>
+      <w:color w:val="262626" w:themeColor="text1" w:themeTint="D9"/>
+    </w:rPr>
+  </w:style>
+  <w:style w:type="character" w:customStyle="1" w:styleId="CitaCar">
+    <w:name w:val="Cita Car"/>
+    <w:basedOn w:val="Fuentedeprrafopredeter"/>
+    <w:link w:val="Cita"/>
+    <w:uiPriority w:val="29"/>
+    <w:rsid w:val="007B533F"/>
+    <w:rPr>
+      <w:i/>
+      <w:iCs/>
+      <w:color w:val="262626" w:themeColor="text1" w:themeTint="D9"/>
+    </w:rPr>
+  </w:style>
+  <w:style w:type="paragraph" w:styleId="Citadestacada">
+    <w:name w:val="Intense Quote"/>
+    <w:basedOn w:val="Normal"/>
+    <w:next w:val="Normal"/>
+    <w:link w:val="CitadestacadaCar"/>
+    <w:uiPriority w:val="30"/>
+    <w:qFormat/>
+    <w:rsid w:val="007B533F"/>
+    <w:pPr>
+      <w:spacing w:before="160" w:after="160" w:line="264" w:lineRule="auto"/>
+      <w:ind w:left="720" w:right="720"/>
+      <w:jc w:val="center"/>
+    </w:pPr>
+    <w:rPr>
+      <w:rFonts w:asciiTheme="majorHAnsi" w:eastAsiaTheme="majorEastAsia" w:hAnsiTheme="majorHAnsi" w:cstheme="majorBidi"/>
+      <w:i/>
+      <w:iCs/>
+      <w:color w:val="70AD47" w:themeColor="accent6"/>
+      <w:sz w:val="32"/>
+      <w:szCs w:val="32"/>
+    </w:rPr>
+  </w:style>
+  <w:style w:type="character" w:customStyle="1" w:styleId="CitadestacadaCar">
+    <w:name w:val="Cita destacada Car"/>
+    <w:basedOn w:val="Fuentedeprrafopredeter"/>
+    <w:link w:val="Citadestacada"/>
+    <w:uiPriority w:val="30"/>
+    <w:rsid w:val="007B533F"/>
+    <w:rPr>
+      <w:rFonts w:asciiTheme="majorHAnsi" w:eastAsiaTheme="majorEastAsia" w:hAnsiTheme="majorHAnsi" w:cstheme="majorBidi"/>
+      <w:i/>
+      <w:iCs/>
+      <w:color w:val="70AD47" w:themeColor="accent6"/>
+      <w:sz w:val="32"/>
+      <w:szCs w:val="32"/>
+    </w:rPr>
+  </w:style>
+  <w:style w:type="character" w:styleId="nfasissutil">
+    <w:name w:val="Subtle Emphasis"/>
+    <w:basedOn w:val="Fuentedeprrafopredeter"/>
+    <w:uiPriority w:val="19"/>
+    <w:qFormat/>
+    <w:rsid w:val="007B533F"/>
+    <w:rPr>
+      <w:i/>
+      <w:iCs/>
+    </w:rPr>
+  </w:style>
+  <w:style w:type="character" w:styleId="nfasisintenso">
+    <w:name w:val="Intense Emphasis"/>
+    <w:basedOn w:val="Fuentedeprrafopredeter"/>
+    <w:uiPriority w:val="21"/>
+    <w:qFormat/>
+    <w:rsid w:val="007B533F"/>
+    <w:rPr>
+      <w:b/>
+      <w:bCs/>
+      <w:i/>
+      <w:iCs/>
+    </w:rPr>
+  </w:style>
+  <w:style w:type="character" w:styleId="Referenciasutil">
+    <w:name w:val="Subtle Reference"/>
+    <w:basedOn w:val="Fuentedeprrafopredeter"/>
+    <w:uiPriority w:val="31"/>
+    <w:qFormat/>
+    <w:rsid w:val="007B533F"/>
+    <w:rPr>
+      <w:smallCaps/>
+      <w:color w:val="595959" w:themeColor="text1" w:themeTint="A6"/>
+    </w:rPr>
+  </w:style>
+  <w:style w:type="character" w:styleId="Referenciaintensa">
+    <w:name w:val="Intense Reference"/>
+    <w:basedOn w:val="Fuentedeprrafopredeter"/>
+    <w:uiPriority w:val="32"/>
+    <w:qFormat/>
+    <w:rsid w:val="007B533F"/>
+    <w:rPr>
+      <w:b/>
+      <w:bCs/>
+      <w:smallCaps/>
+      <w:color w:val="70AD47" w:themeColor="accent6"/>
+    </w:rPr>
+  </w:style>
+  <w:style w:type="character" w:styleId="Ttulodellibro">
+    <w:name w:val="Book Title"/>
+    <w:basedOn w:val="Fuentedeprrafopredeter"/>
+    <w:uiPriority w:val="33"/>
+    <w:qFormat/>
+    <w:rsid w:val="007B533F"/>
+    <w:rPr>
+      <w:b/>
+      <w:bCs/>
+      <w:caps w:val="0"/>
+      <w:smallCaps/>
+      <w:spacing w:val="7"/>
+      <w:sz w:val="21"/>
+      <w:szCs w:val="21"/>
+    </w:rPr>
+  </w:style>
+  <w:style w:type="paragraph" w:styleId="TtuloTDC">
+    <w:name w:val="TOC Heading"/>
+    <w:basedOn w:val="Ttulo1"/>
+    <w:next w:val="Normal"/>
+    <w:uiPriority w:val="39"/>
+    <w:semiHidden/>
+    <w:unhideWhenUsed/>
+    <w:qFormat/>
+    <w:rsid w:val="007B533F"/>
+    <w:pPr>
+      <w:outlineLvl w:val="9"/>
+    </w:pPr>
   </w:style>
 </w:styles>
 </file>
@@ -2112,4 +4282,16 @@
     </a:ext>
   </a:extLst>
 </a:theme>
+</file>
+
+<file path=customXml/item1.xml><?xml version="1.0" encoding="utf-8"?>
+<b:Sources xmlns:b="http://schemas.openxmlformats.org/officeDocument/2006/bibliography" xmlns="http://schemas.openxmlformats.org/officeDocument/2006/bibliography" SelectedStyle="\APASixthEditionOfficeOnline.xsl" StyleName="APA" Version="6"/>
+</file>
+
+<file path=customXml/itemProps1.xml><?xml version="1.0" encoding="utf-8"?>
+<ds:datastoreItem xmlns:ds="http://schemas.openxmlformats.org/officeDocument/2006/customXml" ds:itemID="{12D281A3-D6B8-4A8B-9F19-F5A42CBECD78}">
+  <ds:schemaRefs>
+    <ds:schemaRef ds:uri="http://schemas.openxmlformats.org/officeDocument/2006/bibliography"/>
+  </ds:schemaRefs>
+</ds:datastoreItem>
 </file>
</xml_diff>

<commit_message>
Se incluyen controladores nuevos y se quitan citas y clinicas
</commit_message>
<xml_diff>
--- a/Epsilon/wwwroot/documentos/RoadMap.docx
+++ b/Epsilon/wwwroot/documentos/RoadMap.docx
@@ -38,6 +38,38 @@
     </w:p>
     <w:p>
       <w:pPr>
+        <w:pStyle w:val="Prrafodelista"/>
+        <w:numPr>
+          <w:ilvl w:val="0"/>
+          <w:numId w:val="10"/>
+        </w:numPr>
+      </w:pPr>
+      <w:r>
+        <w:t xml:space="preserve">Para el modal lateral se ha utilizado la librería </w:t>
+      </w:r>
+      <w:proofErr w:type="spellStart"/>
+      <w:r>
+        <w:rPr>
+          <w:u w:val="single"/>
+        </w:rPr>
+        <w:t>theamswitcher</w:t>
+      </w:r>
+      <w:proofErr w:type="spellEnd"/>
+      <w:r>
+        <w:t xml:space="preserve"> y los estilos </w:t>
+      </w:r>
+      <w:proofErr w:type="spellStart"/>
+      <w:r>
+        <w:t>themeswitch</w:t>
+      </w:r>
+      <w:proofErr w:type="spellEnd"/>
+      <w:r>
+        <w:t xml:space="preserve"> </w:t>
+      </w:r>
+    </w:p>
+    <w:p/>
+    <w:p>
+      <w:pPr>
         <w:pStyle w:val="Ttulo2"/>
       </w:pPr>
       <w:proofErr w:type="spellStart"/>
@@ -55,21 +87,7 @@
         </w:numPr>
       </w:pPr>
       <w:r>
-        <w:t xml:space="preserve">Se ha incluido la librería </w:t>
-      </w:r>
-      <w:proofErr w:type="spellStart"/>
-      <w:r>
-        <w:t>particleground</w:t>
-      </w:r>
-      <w:proofErr w:type="spellEnd"/>
-      <w:r>
-        <w:t xml:space="preserve"> y demo.</w:t>
-      </w:r>
-      <w:r>
-        <w:t>j</w:t>
-      </w:r>
-      <w:r>
-        <w:t>s para las partículas</w:t>
+        <w:t>Falta la autenticación de Google</w:t>
       </w:r>
     </w:p>
     <w:p>
@@ -81,8 +99,13 @@
         </w:numPr>
       </w:pPr>
       <w:r>
-        <w:t>Falta la autenticación de Google</w:t>
-      </w:r>
+        <w:t>Falta revisar esa redirección rara que hace a veces a /</w:t>
+      </w:r>
+      <w:proofErr w:type="spellStart"/>
+      <w:r>
+        <w:t>LoginUser</w:t>
+      </w:r>
+      <w:proofErr w:type="spellEnd"/>
     </w:p>
     <w:p>
       <w:pPr>
@@ -93,11 +116,11 @@
         </w:numPr>
       </w:pPr>
       <w:r>
-        <w:t>Falta revisar esa redirección rara que hace a veces a /</w:t>
-      </w:r>
-      <w:proofErr w:type="spellStart"/>
-      <w:r>
-        <w:t>LoginUser</w:t>
+        <w:t xml:space="preserve"> Se ha introducido una sesión que guarda el usuario que se </w:t>
+      </w:r>
+      <w:proofErr w:type="spellStart"/>
+      <w:r>
+        <w:t>loguea</w:t>
       </w:r>
       <w:proofErr w:type="spellEnd"/>
     </w:p>
@@ -110,13 +133,27 @@
         </w:numPr>
       </w:pPr>
       <w:r>
-        <w:t xml:space="preserve"> Se ha introducido una sesión que guarda el usuario que se </w:t>
-      </w:r>
-      <w:proofErr w:type="spellStart"/>
-      <w:r>
-        <w:t>loguea</w:t>
-      </w:r>
-      <w:proofErr w:type="spellEnd"/>
+        <w:t xml:space="preserve">Se ha incluido la librería </w:t>
+      </w:r>
+      <w:proofErr w:type="spellStart"/>
+      <w:r>
+        <w:t>particleground</w:t>
+      </w:r>
+      <w:proofErr w:type="spellEnd"/>
+      <w:r>
+        <w:t xml:space="preserve"> y demo.js para las partículas</w:t>
+      </w:r>
+    </w:p>
+    <w:p>
+      <w:pPr>
+        <w:pStyle w:val="Prrafodelista"/>
+        <w:numPr>
+          <w:ilvl w:val="0"/>
+          <w:numId w:val="4"/>
+        </w:numPr>
+      </w:pPr>
+      <w:bookmarkStart w:id="0" w:name="_GoBack"/>
+      <w:bookmarkEnd w:id="0"/>
     </w:p>
     <w:p>
       <w:pPr>
@@ -380,6 +417,7 @@
       </w:pPr>
       <w:proofErr w:type="spellStart"/>
       <w:r>
+        <w:lastRenderedPageBreak/>
         <w:t>Configuracion</w:t>
       </w:r>
       <w:proofErr w:type="spellEnd"/>
@@ -398,7 +436,6 @@
       </w:pPr>
       <w:proofErr w:type="spellStart"/>
       <w:r>
-        <w:lastRenderedPageBreak/>
         <w:t>Medicos</w:t>
       </w:r>
       <w:proofErr w:type="spellEnd"/>
@@ -738,6 +775,7 @@
     <w:p/>
     <w:p>
       <w:r>
+        <w:lastRenderedPageBreak/>
         <w:t xml:space="preserve">OTROS: </w:t>
       </w:r>
     </w:p>
@@ -751,7 +789,6 @@
       </w:pPr>
       <w:proofErr w:type="spellStart"/>
       <w:r>
-        <w:lastRenderedPageBreak/>
         <w:t>Signal</w:t>
       </w:r>
       <w:proofErr w:type="spellEnd"/>
@@ -824,8 +861,6 @@
           <w:numId w:val="9"/>
         </w:numPr>
       </w:pPr>
-      <w:bookmarkStart w:id="0" w:name="_GoBack"/>
-      <w:bookmarkEnd w:id="0"/>
     </w:p>
     <w:p/>
     <w:p/>
@@ -1436,6 +1471,7 @@
           <w:szCs w:val="24"/>
           <w:lang w:eastAsia="es-ES"/>
         </w:rPr>
+        <w:lastRenderedPageBreak/>
         <w:t xml:space="preserve">Creas bloques en la agenda según la disponibilidad del médico. </w:t>
       </w:r>
     </w:p>
@@ -1460,7 +1496,6 @@
           <w:szCs w:val="24"/>
           <w:lang w:eastAsia="es-ES"/>
         </w:rPr>
-        <w:lastRenderedPageBreak/>
         <w:t xml:space="preserve">Cuando asignas un paciente a un bloque, se crea la cita y se vincula </w:t>
       </w:r>
       <w:proofErr w:type="spellStart"/>
@@ -4289,7 +4324,7 @@
 </file>
 
 <file path=customXml/itemProps1.xml><?xml version="1.0" encoding="utf-8"?>
-<ds:datastoreItem xmlns:ds="http://schemas.openxmlformats.org/officeDocument/2006/customXml" ds:itemID="{12D281A3-D6B8-4A8B-9F19-F5A42CBECD78}">
+<ds:datastoreItem xmlns:ds="http://schemas.openxmlformats.org/officeDocument/2006/customXml" ds:itemID="{EA4CDDB2-74F5-4F5C-892C-347B6C9F7BAA}">
   <ds:schemaRefs>
     <ds:schemaRef ds:uri="http://schemas.openxmlformats.org/officeDocument/2006/bibliography"/>
   </ds:schemaRefs>

</xml_diff>

<commit_message>
Se implementa Historial Paciente y se modifica _Layout para refireccion al index.cshtml
</commit_message>
<xml_diff>
--- a/Epsilon/wwwroot/documentos/RoadMap.docx
+++ b/Epsilon/wwwroot/documentos/RoadMap.docx
@@ -166,6 +166,9 @@
       <w:r>
         <w:t>LoginUser</w:t>
       </w:r>
+      <w:r>
+        <w:t>.ok</w:t>
+      </w:r>
       <w:proofErr w:type="spellEnd"/>
     </w:p>
     <w:p>
@@ -177,7 +180,7 @@
         </w:numPr>
       </w:pPr>
       <w:r>
-        <w:t xml:space="preserve"> Se ha introducido una sesión que guarda el usuario que se </w:t>
+        <w:t xml:space="preserve">Se ha introducido una sesión que guarda el usuario que se </w:t>
       </w:r>
       <w:proofErr w:type="spellStart"/>
       <w:r>
@@ -213,6 +216,17 @@
           <w:numId w:val="4"/>
         </w:numPr>
       </w:pPr>
+      <w:r>
+        <w:t xml:space="preserve">Parece que lo de </w:t>
+      </w:r>
+      <w:proofErr w:type="spellStart"/>
+      <w:r>
+        <w:t>Goggle</w:t>
+      </w:r>
+      <w:proofErr w:type="spellEnd"/>
+      <w:r>
+        <w:t xml:space="preserve"> viene de la URI. Ya son casi 10 horas en esta historia. </w:t>
+      </w:r>
     </w:p>
     <w:p>
       <w:pPr>
@@ -448,6 +462,9 @@
         <w:t xml:space="preserve"> de correo aquí.</w:t>
       </w:r>
     </w:p>
+    <w:p/>
+    <w:p/>
+    <w:p/>
     <w:p>
       <w:pPr>
         <w:pStyle w:val="Ttulo2"/>
@@ -464,16 +481,16 @@
           <w:numId w:val="7"/>
         </w:numPr>
       </w:pPr>
-      <w:proofErr w:type="spellStart"/>
-      <w:r>
-        <w:t>Pa</w:t>
-      </w:r>
-      <w:r>
-        <w:t>gina</w:t>
-      </w:r>
-      <w:proofErr w:type="spellEnd"/>
-      <w:r>
-        <w:t xml:space="preserve"> en desarrollo</w:t>
+      <w:r>
+        <w:t xml:space="preserve">Se crea </w:t>
+      </w:r>
+      <w:proofErr w:type="spellStart"/>
+      <w:r>
+        <w:t>DetallePaciente</w:t>
+      </w:r>
+      <w:proofErr w:type="spellEnd"/>
+      <w:r>
+        <w:t xml:space="preserve"> y se introduce información del mismo y botones de navegación a su historial y a sus radiografías…</w:t>
       </w:r>
     </w:p>
     <w:p/>
@@ -482,7 +499,6 @@
         <w:pStyle w:val="Ttulo2"/>
       </w:pPr>
       <w:r>
-        <w:lastRenderedPageBreak/>
         <w:t>Citas</w:t>
       </w:r>
     </w:p>
@@ -883,6 +899,7 @@
     </w:p>
     <w:p>
       <w:r>
+        <w:lastRenderedPageBreak/>
         <w:t>Y esto supongo que guardarlo en la tabla citas.</w:t>
       </w:r>
     </w:p>
@@ -1110,7 +1127,6 @@
           <w:szCs w:val="18"/>
           <w:lang w:eastAsia="es-ES"/>
         </w:rPr>
-        <w:lastRenderedPageBreak/>
         <w:t xml:space="preserve">Uno de ellos es </w:t>
       </w:r>
       <w:proofErr w:type="spellStart"/>
@@ -1395,8 +1411,39 @@
       <w:r>
         <w:t xml:space="preserve">OTROS: </w:t>
       </w:r>
+    </w:p>
+    <w:p>
+      <w:pPr>
+        <w:pStyle w:val="Prrafodelista"/>
+        <w:numPr>
+          <w:ilvl w:val="0"/>
+          <w:numId w:val="9"/>
+        </w:numPr>
+      </w:pPr>
+      <w:proofErr w:type="spellStart"/>
+      <w:r>
+        <w:t>Signal</w:t>
+      </w:r>
+      <w:proofErr w:type="spellEnd"/>
+      <w:r>
+        <w:t xml:space="preserve"> R</w:t>
+      </w:r>
+    </w:p>
+    <w:p>
+      <w:pPr>
+        <w:pStyle w:val="Prrafodelista"/>
+        <w:numPr>
+          <w:ilvl w:val="0"/>
+          <w:numId w:val="9"/>
+        </w:numPr>
+      </w:pPr>
       <w:bookmarkStart w:id="0" w:name="_GoBack"/>
       <w:bookmarkEnd w:id="0"/>
+      <w:proofErr w:type="spellStart"/>
+      <w:r>
+        <w:t>Typewriting</w:t>
+      </w:r>
+      <w:proofErr w:type="spellEnd"/>
     </w:p>
     <w:p>
       <w:pPr>
@@ -1408,12 +1455,9 @@
       </w:pPr>
       <w:proofErr w:type="spellStart"/>
       <w:r>
-        <w:t>Signal</w:t>
-      </w:r>
-      <w:proofErr w:type="spellEnd"/>
-      <w:r>
-        <w:t xml:space="preserve"> R</w:t>
-      </w:r>
+        <w:t>Identity</w:t>
+      </w:r>
+      <w:proofErr w:type="spellEnd"/>
     </w:p>
     <w:p>
       <w:pPr>
@@ -1424,13 +1468,8 @@
         </w:numPr>
       </w:pPr>
       <w:r>
-        <w:t xml:space="preserve">Arco iris </w:t>
-      </w:r>
-      <w:proofErr w:type="spellStart"/>
-      <w:r>
-        <w:t>css</w:t>
-      </w:r>
-      <w:proofErr w:type="spellEnd"/>
+        <w:t>Juegos</w:t>
+      </w:r>
     </w:p>
     <w:p>
       <w:pPr>
@@ -1440,46 +1479,6 @@
           <w:numId w:val="9"/>
         </w:numPr>
       </w:pPr>
-      <w:proofErr w:type="spellStart"/>
-      <w:r>
-        <w:t>Typewriting</w:t>
-      </w:r>
-      <w:proofErr w:type="spellEnd"/>
-    </w:p>
-    <w:p>
-      <w:pPr>
-        <w:pStyle w:val="Prrafodelista"/>
-        <w:numPr>
-          <w:ilvl w:val="0"/>
-          <w:numId w:val="9"/>
-        </w:numPr>
-      </w:pPr>
-      <w:proofErr w:type="spellStart"/>
-      <w:r>
-        <w:t>Identity</w:t>
-      </w:r>
-      <w:proofErr w:type="spellEnd"/>
-    </w:p>
-    <w:p>
-      <w:pPr>
-        <w:pStyle w:val="Prrafodelista"/>
-        <w:numPr>
-          <w:ilvl w:val="0"/>
-          <w:numId w:val="9"/>
-        </w:numPr>
-      </w:pPr>
-      <w:r>
-        <w:t>Juegos</w:t>
-      </w:r>
-    </w:p>
-    <w:p>
-      <w:pPr>
-        <w:pStyle w:val="Prrafodelista"/>
-        <w:numPr>
-          <w:ilvl w:val="0"/>
-          <w:numId w:val="9"/>
-        </w:numPr>
-      </w:pPr>
       <w:r>
         <w:t>Intro.js (es como un tutorial chulo)</w:t>
       </w:r>
@@ -1583,6 +1582,7 @@
         </w:numPr>
       </w:pPr>
       <w:r>
+        <w:lastRenderedPageBreak/>
         <w:t>Posibles tratamientos a futuro en función del historial</w:t>
       </w:r>
     </w:p>
@@ -2411,6 +2411,7 @@
           <w:szCs w:val="24"/>
           <w:lang w:eastAsia="es-ES"/>
         </w:rPr>
+        <w:lastRenderedPageBreak/>
         <w:t>Hay que pulir las funcionalidades. Y ver que tras ello siguen pasando los test</w:t>
       </w:r>
     </w:p>
@@ -5301,7 +5302,7 @@
 </file>
 
 <file path=customXml/itemProps1.xml><?xml version="1.0" encoding="utf-8"?>
-<ds:datastoreItem xmlns:ds="http://schemas.openxmlformats.org/officeDocument/2006/customXml" ds:itemID="{3C4B0943-6EC0-4B63-BD30-5F784BF4EE05}">
+<ds:datastoreItem xmlns:ds="http://schemas.openxmlformats.org/officeDocument/2006/customXml" ds:itemID="{37050717-053E-40D6-8949-9A25EB06F619}">
   <ds:schemaRefs>
     <ds:schemaRef ds:uri="http://schemas.openxmlformats.org/officeDocument/2006/bibliography"/>
   </ds:schemaRefs>

</xml_diff>

<commit_message>
Se finalizan las exportaciones
</commit_message>
<xml_diff>
--- a/Epsilon/wwwroot/documentos/RoadMap.docx
+++ b/Epsilon/wwwroot/documentos/RoadMap.docx
@@ -618,6 +618,32 @@
     <w:p>
       <w:pPr>
         <w:pStyle w:val="Prrafodelista"/>
+      </w:pPr>
+      <w:r>
+        <w:t xml:space="preserve">Ver Historial se da por hecho hasta tener </w:t>
+      </w:r>
+      <w:proofErr w:type="spellStart"/>
+      <w:r>
+        <w:t>FullCalendar</w:t>
+      </w:r>
+      <w:proofErr w:type="spellEnd"/>
+    </w:p>
+    <w:p>
+      <w:pPr>
+        <w:pStyle w:val="Prrafodelista"/>
+      </w:pPr>
+      <w:r>
+        <w:t>Queda el informe de citas en Historial</w:t>
+      </w:r>
+    </w:p>
+    <w:p>
+      <w:pPr>
+        <w:pStyle w:val="Prrafodelista"/>
+      </w:pPr>
+    </w:p>
+    <w:p>
+      <w:pPr>
+        <w:pStyle w:val="Prrafodelista"/>
         <w:numPr>
           <w:ilvl w:val="1"/>
           <w:numId w:val="7"/>
@@ -631,15 +657,47 @@
         <w:t>Radiografias</w:t>
       </w:r>
       <w:proofErr w:type="spellEnd"/>
-    </w:p>
-    <w:p>
-      <w:pPr>
-        <w:pStyle w:val="Prrafodelista"/>
-        <w:numPr>
-          <w:ilvl w:val="2"/>
-          <w:numId w:val="7"/>
-        </w:numPr>
-      </w:pPr>
+      <w:r>
+        <w:t xml:space="preserve"> (En progreso)</w:t>
+      </w:r>
+    </w:p>
+    <w:p>
+      <w:proofErr w:type="gramStart"/>
+      <w:r>
+        <w:rPr>
+          <w:highlight w:val="yellow"/>
+        </w:rPr>
+        <w:t>NOTA :</w:t>
+      </w:r>
+      <w:proofErr w:type="gramEnd"/>
+      <w:r>
+        <w:rPr>
+          <w:highlight w:val="yellow"/>
+        </w:rPr>
+        <w:t xml:space="preserve"> El </w:t>
+      </w:r>
+      <w:proofErr w:type="spellStart"/>
+      <w:r>
+        <w:rPr>
+          <w:highlight w:val="yellow"/>
+        </w:rPr>
+        <w:t>numero</w:t>
+      </w:r>
+      <w:proofErr w:type="spellEnd"/>
+      <w:r>
+        <w:rPr>
+          <w:highlight w:val="yellow"/>
+        </w:rPr>
+        <w:t xml:space="preserve"> de citas de los pacientes ha de ser calculado.</w:t>
+      </w:r>
+    </w:p>
+    <w:p>
+      <w:r>
+        <w:rPr>
+          <w:highlight w:val="yellow"/>
+        </w:rPr>
+        <w:t>Falta el CRUD principal Crear, modificar y eliminar.</w:t>
+      </w:r>
     </w:p>
     <w:p/>
     <w:p>
@@ -664,145 +722,171 @@
       <w:r>
         <w:t xml:space="preserve"> (la pantalla no la tabla)</w:t>
       </w:r>
+    </w:p>
+    <w:p/>
+    <w:p>
+      <w:pPr>
+        <w:pStyle w:val="Ttulo2"/>
+      </w:pPr>
+      <w:r>
+        <w:t>Informes</w:t>
+      </w:r>
+    </w:p>
+    <w:p>
+      <w:pPr>
+        <w:pStyle w:val="Prrafodelista"/>
+        <w:numPr>
+          <w:ilvl w:val="0"/>
+          <w:numId w:val="7"/>
+        </w:numPr>
+      </w:pPr>
+      <w:proofErr w:type="spellStart"/>
+      <w:r>
+        <w:t>Implementacion</w:t>
+      </w:r>
+      <w:proofErr w:type="spellEnd"/>
+      <w:r>
+        <w:t xml:space="preserve"> de servicio</w:t>
+      </w:r>
+      <w:r>
+        <w:t xml:space="preserve"> Informes</w:t>
+      </w:r>
+    </w:p>
+    <w:p>
+      <w:pPr>
+        <w:pStyle w:val="Prrafodelista"/>
+        <w:numPr>
+          <w:ilvl w:val="0"/>
+          <w:numId w:val="7"/>
+        </w:numPr>
+      </w:pPr>
+      <w:proofErr w:type="spellStart"/>
+      <w:r>
+        <w:t>Configuracion</w:t>
+      </w:r>
+      <w:proofErr w:type="spellEnd"/>
+      <w:r>
+        <w:t xml:space="preserve"> de </w:t>
+      </w:r>
+      <w:proofErr w:type="spellStart"/>
+      <w:r>
+        <w:t>Report</w:t>
+      </w:r>
+      <w:proofErr w:type="spellEnd"/>
+      <w:r>
+        <w:t xml:space="preserve"> Server </w:t>
+      </w:r>
+    </w:p>
+    <w:p>
+      <w:pPr>
+        <w:pStyle w:val="Prrafodelista"/>
+        <w:numPr>
+          <w:ilvl w:val="0"/>
+          <w:numId w:val="7"/>
+        </w:numPr>
+      </w:pPr>
+      <w:r>
+        <w:t>Se ha configurado el servidor de informes local.</w:t>
+      </w:r>
+    </w:p>
+    <w:p>
+      <w:pPr>
+        <w:pStyle w:val="Prrafodelista"/>
+        <w:numPr>
+          <w:ilvl w:val="0"/>
+          <w:numId w:val="7"/>
+        </w:numPr>
+      </w:pPr>
+      <w:r>
+        <w:t xml:space="preserve">Abrir Chrome como </w:t>
+      </w:r>
+      <w:proofErr w:type="spellStart"/>
+      <w:r>
+        <w:t>admin</w:t>
+      </w:r>
+      <w:proofErr w:type="spellEnd"/>
+      <w:r>
+        <w:t>.</w:t>
+      </w:r>
+    </w:p>
+    <w:p>
+      <w:pPr>
+        <w:pStyle w:val="Prrafodelista"/>
+        <w:numPr>
+          <w:ilvl w:val="0"/>
+          <w:numId w:val="7"/>
+        </w:numPr>
+      </w:pPr>
+      <w:r>
+        <w:t>Se ha creado un informe de usuarios de prueba y se ira probando con el</w:t>
+      </w:r>
+    </w:p>
+    <w:p>
+      <w:pPr>
+        <w:pStyle w:val="Prrafodelista"/>
+        <w:numPr>
+          <w:ilvl w:val="0"/>
+          <w:numId w:val="7"/>
+        </w:numPr>
+      </w:pPr>
+      <w:r>
+        <w:t>Se incluye servicio informes</w:t>
+      </w:r>
+    </w:p>
+    <w:p>
+      <w:pPr>
+        <w:pStyle w:val="Prrafodelista"/>
+        <w:numPr>
+          <w:ilvl w:val="0"/>
+          <w:numId w:val="7"/>
+        </w:numPr>
+      </w:pPr>
+      <w:r>
+        <w:t xml:space="preserve">Falta llamada que genere informe desde </w:t>
+      </w:r>
+      <w:proofErr w:type="spellStart"/>
+      <w:r>
+        <w:t>aplicacion</w:t>
+      </w:r>
+      <w:proofErr w:type="spellEnd"/>
+    </w:p>
+    <w:p>
+      <w:pPr>
+        <w:pStyle w:val="Ttulo2"/>
+      </w:pPr>
+      <w:proofErr w:type="spellStart"/>
+      <w:r>
+        <w:t>Medicos</w:t>
+      </w:r>
+      <w:proofErr w:type="spellEnd"/>
+    </w:p>
+    <w:p>
+      <w:pPr>
+        <w:pStyle w:val="Prrafodelista"/>
+      </w:pPr>
+      <w:r>
+        <w:t>Se va a crear una tabla con los médicos</w:t>
+      </w:r>
+    </w:p>
+    <w:p>
+      <w:pPr>
+        <w:pStyle w:val="Prrafodelista"/>
+      </w:pPr>
       <w:bookmarkStart w:id="0" w:name="_GoBack"/>
       <w:bookmarkEnd w:id="0"/>
     </w:p>
-    <w:p/>
+    <w:p>
+      <w:pPr>
+        <w:pStyle w:val="Prrafodelista"/>
+      </w:pPr>
+    </w:p>
     <w:p>
       <w:pPr>
         <w:pStyle w:val="Ttulo2"/>
       </w:pPr>
       <w:r>
-        <w:t>Informes</w:t>
-      </w:r>
-    </w:p>
-    <w:p>
-      <w:pPr>
-        <w:pStyle w:val="Prrafodelista"/>
-        <w:numPr>
-          <w:ilvl w:val="0"/>
-          <w:numId w:val="7"/>
-        </w:numPr>
-      </w:pPr>
-      <w:proofErr w:type="spellStart"/>
-      <w:r>
-        <w:t>Implementacion</w:t>
-      </w:r>
-      <w:proofErr w:type="spellEnd"/>
-      <w:r>
-        <w:t xml:space="preserve"> de servicio</w:t>
-      </w:r>
-      <w:r>
-        <w:t xml:space="preserve"> Informes</w:t>
-      </w:r>
-    </w:p>
-    <w:p>
-      <w:pPr>
-        <w:pStyle w:val="Prrafodelista"/>
-        <w:numPr>
-          <w:ilvl w:val="0"/>
-          <w:numId w:val="7"/>
-        </w:numPr>
-      </w:pPr>
-      <w:proofErr w:type="spellStart"/>
-      <w:r>
-        <w:t>Configuracion</w:t>
-      </w:r>
-      <w:proofErr w:type="spellEnd"/>
-      <w:r>
-        <w:t xml:space="preserve"> de </w:t>
-      </w:r>
-      <w:proofErr w:type="spellStart"/>
-      <w:r>
-        <w:t>Report</w:t>
-      </w:r>
-      <w:proofErr w:type="spellEnd"/>
-      <w:r>
-        <w:t xml:space="preserve"> Server </w:t>
-      </w:r>
-    </w:p>
-    <w:p>
-      <w:pPr>
-        <w:pStyle w:val="Prrafodelista"/>
-        <w:numPr>
-          <w:ilvl w:val="0"/>
-          <w:numId w:val="7"/>
-        </w:numPr>
-      </w:pPr>
-      <w:r>
-        <w:t>Se ha configurado el servidor de informes local.</w:t>
-      </w:r>
-    </w:p>
-    <w:p>
-      <w:pPr>
-        <w:pStyle w:val="Prrafodelista"/>
-        <w:numPr>
-          <w:ilvl w:val="0"/>
-          <w:numId w:val="7"/>
-        </w:numPr>
-      </w:pPr>
-      <w:r>
-        <w:t xml:space="preserve">Abrir Chrome como </w:t>
-      </w:r>
-      <w:proofErr w:type="spellStart"/>
-      <w:r>
-        <w:t>admin</w:t>
-      </w:r>
-      <w:proofErr w:type="spellEnd"/>
-      <w:r>
-        <w:t>.</w:t>
-      </w:r>
-    </w:p>
-    <w:p>
-      <w:pPr>
-        <w:pStyle w:val="Prrafodelista"/>
-        <w:numPr>
-          <w:ilvl w:val="0"/>
-          <w:numId w:val="7"/>
-        </w:numPr>
-      </w:pPr>
-      <w:r>
-        <w:t>Se ha creado un informe de usuarios de prueba y se ira probando con el</w:t>
-      </w:r>
-    </w:p>
-    <w:p>
-      <w:pPr>
-        <w:pStyle w:val="Prrafodelista"/>
-        <w:numPr>
-          <w:ilvl w:val="0"/>
-          <w:numId w:val="7"/>
-        </w:numPr>
-      </w:pPr>
-      <w:r>
-        <w:t>Se incluye servicio informes</w:t>
-      </w:r>
-    </w:p>
-    <w:p>
-      <w:pPr>
-        <w:pStyle w:val="Prrafodelista"/>
-        <w:numPr>
-          <w:ilvl w:val="0"/>
-          <w:numId w:val="7"/>
-        </w:numPr>
-      </w:pPr>
-      <w:r>
-        <w:t xml:space="preserve">Falta llamada que genere informe desde </w:t>
-      </w:r>
-      <w:proofErr w:type="spellStart"/>
-      <w:r>
-        <w:t>aplicacion</w:t>
-      </w:r>
-      <w:proofErr w:type="spellEnd"/>
-    </w:p>
-    <w:p>
-      <w:pPr>
-        <w:pStyle w:val="Ttulo2"/>
-      </w:pPr>
-      <w:proofErr w:type="spellStart"/>
-      <w:r>
-        <w:t>Medicos</w:t>
-      </w:r>
-      <w:proofErr w:type="spellEnd"/>
+        <w:t>Agenda</w:t>
+      </w:r>
     </w:p>
     <w:p>
       <w:pPr>
@@ -813,25 +897,164 @@
         </w:numPr>
       </w:pPr>
       <w:r>
-        <w:t>Pruebas, nada…</w:t>
-      </w:r>
-    </w:p>
-    <w:p>
-      <w:pPr>
-        <w:pStyle w:val="Prrafodelista"/>
-      </w:pPr>
-    </w:p>
-    <w:p>
-      <w:pPr>
-        <w:pStyle w:val="Prrafodelista"/>
-      </w:pPr>
-    </w:p>
-    <w:p>
-      <w:pPr>
-        <w:pStyle w:val="Ttulo2"/>
-      </w:pPr>
-      <w:r>
-        <w:t>Agenda</w:t>
+        <w:t xml:space="preserve">Se incluye </w:t>
+      </w:r>
+      <w:proofErr w:type="spellStart"/>
+      <w:r>
+        <w:t>fullCalendar</w:t>
+      </w:r>
+      <w:proofErr w:type="spellEnd"/>
+      <w:r>
+        <w:t xml:space="preserve"> en </w:t>
+      </w:r>
+      <w:proofErr w:type="spellStart"/>
+      <w:r>
+        <w:t>js</w:t>
+      </w:r>
+      <w:proofErr w:type="spellEnd"/>
+      <w:r>
+        <w:t>/calendar</w:t>
+      </w:r>
+      <w:proofErr w:type="gramStart"/>
+      <w:r>
+        <w:t>/  …</w:t>
+      </w:r>
+      <w:proofErr w:type="gramEnd"/>
+      <w:r>
+        <w:t>con los paquetes:</w:t>
+      </w:r>
+    </w:p>
+    <w:p>
+      <w:pPr>
+        <w:pStyle w:val="Prrafodelista"/>
+        <w:numPr>
+          <w:ilvl w:val="1"/>
+          <w:numId w:val="8"/>
+        </w:numPr>
+      </w:pPr>
+      <w:proofErr w:type="spellStart"/>
+      <w:r>
+        <w:t>core</w:t>
+      </w:r>
+      <w:proofErr w:type="spellEnd"/>
+    </w:p>
+    <w:p>
+      <w:pPr>
+        <w:pStyle w:val="Prrafodelista"/>
+        <w:numPr>
+          <w:ilvl w:val="1"/>
+          <w:numId w:val="8"/>
+        </w:numPr>
+      </w:pPr>
+      <w:proofErr w:type="spellStart"/>
+      <w:r>
+        <w:t>daygrid</w:t>
+      </w:r>
+      <w:proofErr w:type="spellEnd"/>
+    </w:p>
+    <w:p>
+      <w:pPr>
+        <w:pStyle w:val="Prrafodelista"/>
+        <w:numPr>
+          <w:ilvl w:val="1"/>
+          <w:numId w:val="8"/>
+        </w:numPr>
+      </w:pPr>
+      <w:proofErr w:type="spellStart"/>
+      <w:r>
+        <w:t>interaction</w:t>
+      </w:r>
+      <w:proofErr w:type="spellEnd"/>
+    </w:p>
+    <w:p>
+      <w:pPr>
+        <w:pStyle w:val="Prrafodelista"/>
+        <w:numPr>
+          <w:ilvl w:val="1"/>
+          <w:numId w:val="8"/>
+        </w:numPr>
+      </w:pPr>
+      <w:proofErr w:type="spellStart"/>
+      <w:r>
+        <w:t>locale</w:t>
+      </w:r>
+      <w:proofErr w:type="spellEnd"/>
+    </w:p>
+    <w:p>
+      <w:pPr>
+        <w:pStyle w:val="Prrafodelista"/>
+        <w:numPr>
+          <w:ilvl w:val="1"/>
+          <w:numId w:val="8"/>
+        </w:numPr>
+      </w:pPr>
+      <w:proofErr w:type="spellStart"/>
+      <w:r>
+        <w:t>multimonth</w:t>
+      </w:r>
+      <w:proofErr w:type="spellEnd"/>
+    </w:p>
+    <w:p>
+      <w:pPr>
+        <w:pStyle w:val="Prrafodelista"/>
+        <w:numPr>
+          <w:ilvl w:val="1"/>
+          <w:numId w:val="8"/>
+        </w:numPr>
+      </w:pPr>
+      <w:proofErr w:type="spellStart"/>
+      <w:r>
+        <w:t>timegrid</w:t>
+      </w:r>
+      <w:proofErr w:type="spellEnd"/>
+    </w:p>
+    <w:p>
+      <w:r>
+        <w:lastRenderedPageBreak/>
+        <w:t xml:space="preserve">A la espera de análisis del componente. </w:t>
+      </w:r>
+    </w:p>
+    <w:p>
+      <w:r>
+        <w:t xml:space="preserve">Se </w:t>
+      </w:r>
+      <w:proofErr w:type="spellStart"/>
+      <w:r>
+        <w:t>esta</w:t>
+      </w:r>
+      <w:proofErr w:type="spellEnd"/>
+      <w:r>
+        <w:t xml:space="preserve"> pensando en </w:t>
+      </w:r>
+      <w:r>
+        <w:t>plantear un mecanismo de diferenciación entre modificación y eliminación</w:t>
+      </w:r>
+      <w:r>
+        <w:t xml:space="preserve"> en el </w:t>
+      </w:r>
+      <w:proofErr w:type="spellStart"/>
+      <w:r>
+        <w:t>fullCalendar</w:t>
+      </w:r>
+      <w:proofErr w:type="spellEnd"/>
+      <w:r>
+        <w:t>.</w:t>
+      </w:r>
+    </w:p>
+    <w:p>
+      <w:r>
+        <w:t xml:space="preserve">Al crear una cita lo lógico </w:t>
+      </w:r>
+      <w:proofErr w:type="spellStart"/>
+      <w:r>
+        <w:t>seri</w:t>
+      </w:r>
+      <w:r>
+        <w:t>a</w:t>
+      </w:r>
+      <w:proofErr w:type="spellEnd"/>
+      <w:r>
+        <w:t xml:space="preserve"> traer:</w:t>
       </w:r>
     </w:p>
     <w:p>
@@ -843,175 +1066,6 @@
         </w:numPr>
       </w:pPr>
       <w:r>
-        <w:t xml:space="preserve">Se incluye </w:t>
-      </w:r>
-      <w:proofErr w:type="spellStart"/>
-      <w:r>
-        <w:t>fullCalendar</w:t>
-      </w:r>
-      <w:proofErr w:type="spellEnd"/>
-      <w:r>
-        <w:t xml:space="preserve"> en </w:t>
-      </w:r>
-      <w:proofErr w:type="spellStart"/>
-      <w:r>
-        <w:t>js</w:t>
-      </w:r>
-      <w:proofErr w:type="spellEnd"/>
-      <w:r>
-        <w:t>/calendar</w:t>
-      </w:r>
-      <w:proofErr w:type="gramStart"/>
-      <w:r>
-        <w:t>/  …</w:t>
-      </w:r>
-      <w:proofErr w:type="gramEnd"/>
-      <w:r>
-        <w:t>con los paquetes:</w:t>
-      </w:r>
-    </w:p>
-    <w:p>
-      <w:pPr>
-        <w:pStyle w:val="Prrafodelista"/>
-        <w:numPr>
-          <w:ilvl w:val="1"/>
-          <w:numId w:val="8"/>
-        </w:numPr>
-      </w:pPr>
-      <w:proofErr w:type="spellStart"/>
-      <w:r>
-        <w:t>core</w:t>
-      </w:r>
-      <w:proofErr w:type="spellEnd"/>
-    </w:p>
-    <w:p>
-      <w:pPr>
-        <w:pStyle w:val="Prrafodelista"/>
-        <w:numPr>
-          <w:ilvl w:val="1"/>
-          <w:numId w:val="8"/>
-        </w:numPr>
-      </w:pPr>
-      <w:proofErr w:type="spellStart"/>
-      <w:r>
-        <w:t>daygrid</w:t>
-      </w:r>
-      <w:proofErr w:type="spellEnd"/>
-    </w:p>
-    <w:p>
-      <w:pPr>
-        <w:pStyle w:val="Prrafodelista"/>
-        <w:numPr>
-          <w:ilvl w:val="1"/>
-          <w:numId w:val="8"/>
-        </w:numPr>
-      </w:pPr>
-      <w:proofErr w:type="spellStart"/>
-      <w:r>
-        <w:t>interaction</w:t>
-      </w:r>
-      <w:proofErr w:type="spellEnd"/>
-    </w:p>
-    <w:p>
-      <w:pPr>
-        <w:pStyle w:val="Prrafodelista"/>
-        <w:numPr>
-          <w:ilvl w:val="1"/>
-          <w:numId w:val="8"/>
-        </w:numPr>
-      </w:pPr>
-      <w:proofErr w:type="spellStart"/>
-      <w:r>
-        <w:t>locale</w:t>
-      </w:r>
-      <w:proofErr w:type="spellEnd"/>
-    </w:p>
-    <w:p>
-      <w:pPr>
-        <w:pStyle w:val="Prrafodelista"/>
-        <w:numPr>
-          <w:ilvl w:val="1"/>
-          <w:numId w:val="8"/>
-        </w:numPr>
-      </w:pPr>
-      <w:proofErr w:type="spellStart"/>
-      <w:r>
-        <w:t>multimonth</w:t>
-      </w:r>
-      <w:proofErr w:type="spellEnd"/>
-    </w:p>
-    <w:p>
-      <w:pPr>
-        <w:pStyle w:val="Prrafodelista"/>
-        <w:numPr>
-          <w:ilvl w:val="1"/>
-          <w:numId w:val="8"/>
-        </w:numPr>
-      </w:pPr>
-      <w:proofErr w:type="spellStart"/>
-      <w:r>
-        <w:t>timegrid</w:t>
-      </w:r>
-      <w:proofErr w:type="spellEnd"/>
-    </w:p>
-    <w:p>
-      <w:r>
-        <w:t xml:space="preserve">A la espera de análisis del componente. </w:t>
-      </w:r>
-    </w:p>
-    <w:p>
-      <w:r>
-        <w:t xml:space="preserve">Se </w:t>
-      </w:r>
-      <w:proofErr w:type="spellStart"/>
-      <w:r>
-        <w:t>esta</w:t>
-      </w:r>
-      <w:proofErr w:type="spellEnd"/>
-      <w:r>
-        <w:t xml:space="preserve"> pensando en </w:t>
-      </w:r>
-      <w:r>
-        <w:t>plantear un mecanismo de diferenciación entre modificación y eliminación</w:t>
-      </w:r>
-      <w:r>
-        <w:t xml:space="preserve"> en el </w:t>
-      </w:r>
-      <w:proofErr w:type="spellStart"/>
-      <w:r>
-        <w:t>fullCalendar</w:t>
-      </w:r>
-      <w:proofErr w:type="spellEnd"/>
-      <w:r>
-        <w:t>.</w:t>
-      </w:r>
-    </w:p>
-    <w:p>
-      <w:r>
-        <w:t xml:space="preserve">Al crear una cita lo lógico </w:t>
-      </w:r>
-      <w:proofErr w:type="spellStart"/>
-      <w:r>
-        <w:t>seri</w:t>
-      </w:r>
-      <w:r>
-        <w:t>a</w:t>
-      </w:r>
-      <w:proofErr w:type="spellEnd"/>
-      <w:r>
-        <w:t xml:space="preserve"> traer:</w:t>
-      </w:r>
-    </w:p>
-    <w:p>
-      <w:pPr>
-        <w:pStyle w:val="Prrafodelista"/>
-        <w:numPr>
-          <w:ilvl w:val="0"/>
-          <w:numId w:val="8"/>
-        </w:numPr>
-      </w:pPr>
-      <w:r>
-        <w:lastRenderedPageBreak/>
         <w:t>Pacientes</w:t>
       </w:r>
     </w:p>
@@ -1668,7 +1722,6 @@
         </w:numPr>
       </w:pPr>
       <w:r>
-        <w:lastRenderedPageBreak/>
         <w:t>Ml.Net</w:t>
       </w:r>
     </w:p>
@@ -2321,6 +2374,7 @@
           <w:szCs w:val="24"/>
           <w:lang w:eastAsia="es-ES"/>
         </w:rPr>
+        <w:lastRenderedPageBreak/>
         <w:t>Cómo funciona:</w:t>
       </w:r>
     </w:p>
@@ -2491,7 +2545,6 @@
           <w:szCs w:val="24"/>
           <w:lang w:eastAsia="es-ES"/>
         </w:rPr>
-        <w:lastRenderedPageBreak/>
         <w:t xml:space="preserve">Esto mantiene </w:t>
       </w:r>
       <w:r>
@@ -5453,7 +5506,7 @@
 </file>
 
 <file path=customXml/itemProps1.xml><?xml version="1.0" encoding="utf-8"?>
-<ds:datastoreItem xmlns:ds="http://schemas.openxmlformats.org/officeDocument/2006/customXml" ds:itemID="{E2875AAC-0136-49D9-AF19-FE634AF3B39F}">
+<ds:datastoreItem xmlns:ds="http://schemas.openxmlformats.org/officeDocument/2006/customXml" ds:itemID="{39C6886B-E450-4C24-8FB5-B6F0DCFAB917}">
   <ds:schemaRefs>
     <ds:schemaRef ds:uri="http://schemas.openxmlformats.org/officeDocument/2006/bibliography"/>
   </ds:schemaRefs>

</xml_diff>